<commit_message>
Corrige DT (resultados reales scikit-learn), añade k-NN completo, memoria actualizada
</commit_message>
<xml_diff>
--- a/FAA_P2_Memoria_Completa.docx
+++ b/FAA_P2_Memoria_Completa.docx
@@ -20268,67 +20268,7 @@
           <w:sz w:val="26"/>
           <w:szCs w:val="26"/>
         </w:rPr>
-        <w:t xml:space="preserve">4.9.2. Resultados e incidencia detectada</w:t>
-      </w:r>
-    </w:p>
-    <w:p>
-      <w:pPr>
-        <w:spacing w:after="60" w:before="60"/>
-      </w:pPr>
-      <w:r>
-        <w:rPr>
-          <w:rFonts w:ascii="Arial" w:cs="Arial" w:eastAsia="Arial" w:hAnsi="Arial"/>
-          <w:b w:val="false"/>
-          <w:bCs w:val="false"/>
-          <w:i w:val="false"/>
-          <w:iCs w:val="false"/>
-          <w:color w:val="000000"/>
-          <w:sz w:val="22"/>
-          <w:szCs w:val="22"/>
-        </w:rPr>
-        <w:t xml:space="preserve"/>
-      </w:r>
-    </w:p>
-    <w:p>
-      <w:pPr>
-        <w:pBdr>
-          <w:top w:val="single" w:color="FF8C00" w:sz="4"/>
-          <w:bottom w:val="single" w:color="FF8C00" w:sz="4"/>
-          <w:left w:val="single" w:color="FF8C00" w:sz="4"/>
-          <w:right w:val="single" w:color="FF8C00" w:sz="4"/>
-        </w:pBdr>
-        <w:spacing w:after="120" w:before="120"/>
-      </w:pPr>
-      <w:r>
-        <w:rPr>
-          <w:rFonts w:ascii="Arial" w:cs="Arial" w:eastAsia="Arial" w:hAnsi="Arial"/>
-          <w:b w:val="false"/>
-          <w:bCs w:val="false"/>
-          <w:i/>
-          <w:iCs/>
-          <w:color w:val="7F4F00"/>
-          <w:sz w:val="20"/>
-          <w:szCs w:val="20"/>
-        </w:rPr>
-        <w:t xml:space="preserve">⚠ Incidencia detectada: todos los valores de max_depth producen exactamente el mismo resultado (Accuracy ≈ 12,88 %, F1 ≈ 3,26 %), lo cual es indicativo de un fallo en la implementación del experimento. Un accuracy del 12,88 % es prácticamente equivalente al azar para un problema de 7 clases (baseline aleatorio ≈ 14,3 %). La causa más probable es un error en el preprocesado o en la interfaz del wrapper MLJ/DecisionTree dentro del script experimentos_arboles.jl. Se recomienda revisar y re-ejecutar los experimentos. Según la literatura (Jindal et al., 2024), los árboles de decisión alcanzan &gt;98 % de accuracy en este dataset.</w:t>
-      </w:r>
-    </w:p>
-    <w:p>
-      <w:pPr>
-        <w:spacing w:after="60" w:before="60"/>
-      </w:pPr>
-      <w:r>
-        <w:rPr>
-          <w:rFonts w:ascii="Arial" w:cs="Arial" w:eastAsia="Arial" w:hAnsi="Arial"/>
-          <w:b w:val="false"/>
-          <w:bCs w:val="false"/>
-          <w:i w:val="false"/>
-          <w:iCs w:val="false"/>
-          <w:color w:val="000000"/>
-          <w:sz w:val="22"/>
-          <w:szCs w:val="22"/>
-        </w:rPr>
-        <w:t xml:space="preserve"/>
+        <w:t xml:space="preserve">4.9.2. Resultados</w:t>
       </w:r>
     </w:p>
     <w:p>
@@ -20347,7 +20287,7 @@
           <w:sz w:val="22"/>
           <w:szCs w:val="22"/>
         </w:rPr>
-        <w:t xml:space="preserve">Tabla 4. Resultados de configuraciones DT (validación cruzada de 10 folds). Resultados afectados por incidencia técnica.</w:t>
+        <w:t xml:space="preserve">Tabla 4. Comparativa de configuraciones DT (validación cruzada de 10 folds, F1-score macro).</w:t>
       </w:r>
     </w:p>
     <w:p>
@@ -20381,12 +20321,13 @@
         </w:tblBorders>
       </w:tblPr>
       <w:tblGrid>
-        <w:gridCol w:w="340"/>
-        <w:gridCol w:w="2000"/>
-        <w:gridCol w:w="1100"/>
-        <w:gridCol w:w="1900"/>
-        <w:gridCol w:w="1900"/>
-        <w:gridCol w:w="1786"/>
+        <w:gridCol w:w="320"/>
+        <w:gridCol w:w="1380"/>
+        <w:gridCol w:w="800"/>
+        <w:gridCol w:w="1400"/>
+        <w:gridCol w:w="1400"/>
+        <w:gridCol w:w="1500"/>
+        <w:gridCol w:w="1226"/>
       </w:tblGrid>
       <w:tr>
         <w:trPr>
@@ -20394,7 +20335,7 @@
         </w:trPr>
         <w:tc>
           <w:tcPr>
-            <w:tcW w:type="dxa" w:w="340"/>
+            <w:tcW w:type="dxa" w:w="320"/>
             <w:gridSpan w:val="1"/>
             <w:tcBorders>
               <w:top w:val="single" w:color="1F4E79" w:sz="2"/>
@@ -20432,7 +20373,7 @@
         </w:tc>
         <w:tc>
           <w:tcPr>
-            <w:tcW w:type="dxa" w:w="2000"/>
+            <w:tcW w:type="dxa" w:w="1380"/>
             <w:gridSpan w:val="1"/>
             <w:tcBorders>
               <w:top w:val="single" w:color="1F4E79" w:sz="2"/>
@@ -20470,7 +20411,7 @@
         </w:tc>
         <w:tc>
           <w:tcPr>
-            <w:tcW w:type="dxa" w:w="1100"/>
+            <w:tcW w:type="dxa" w:w="800"/>
             <w:gridSpan w:val="1"/>
             <w:tcBorders>
               <w:top w:val="single" w:color="1F4E79" w:sz="2"/>
@@ -20508,7 +20449,7 @@
         </w:tc>
         <w:tc>
           <w:tcPr>
-            <w:tcW w:type="dxa" w:w="1900"/>
+            <w:tcW w:type="dxa" w:w="1400"/>
             <w:gridSpan w:val="1"/>
             <w:tcBorders>
               <w:top w:val="single" w:color="1F4E79" w:sz="2"/>
@@ -20540,13 +20481,13 @@
                 <w:sz w:val="20"/>
                 <w:szCs w:val="20"/>
               </w:rPr>
-              <w:t xml:space="preserve">Accuracy ± std (%)</w:t>
-            </w:r>
-          </w:p>
-        </w:tc>
-        <w:tc>
-          <w:tcPr>
-            <w:tcW w:type="dxa" w:w="1900"/>
+              <w:t xml:space="preserve">Train Acc ± std (%)</w:t>
+            </w:r>
+          </w:p>
+        </w:tc>
+        <w:tc>
+          <w:tcPr>
+            <w:tcW w:type="dxa" w:w="1400"/>
             <w:gridSpan w:val="1"/>
             <w:tcBorders>
               <w:top w:val="single" w:color="1F4E79" w:sz="2"/>
@@ -20578,13 +20519,13 @@
                 <w:sz w:val="20"/>
                 <w:szCs w:val="20"/>
               </w:rPr>
-              <w:t xml:space="preserve">F1-score ± std (%)</w:t>
-            </w:r>
-          </w:p>
-        </w:tc>
-        <w:tc>
-          <w:tcPr>
-            <w:tcW w:type="dxa" w:w="1786"/>
+              <w:t xml:space="preserve">Accuracy ± std (%)</w:t>
+            </w:r>
+          </w:p>
+        </w:tc>
+        <w:tc>
+          <w:tcPr>
+            <w:tcW w:type="dxa" w:w="1500"/>
             <w:gridSpan w:val="1"/>
             <w:tcBorders>
               <w:top w:val="single" w:color="1F4E79" w:sz="2"/>
@@ -20616,6 +20557,44 @@
                 <w:sz w:val="20"/>
                 <w:szCs w:val="20"/>
               </w:rPr>
+              <w:t xml:space="preserve">F1-score ± std (%)</w:t>
+            </w:r>
+          </w:p>
+        </w:tc>
+        <w:tc>
+          <w:tcPr>
+            <w:tcW w:type="dxa" w:w="1226"/>
+            <w:gridSpan w:val="1"/>
+            <w:tcBorders>
+              <w:top w:val="single" w:color="1F4E79" w:sz="2"/>
+              <w:left w:val="single" w:color="1F4E79" w:sz="2"/>
+              <w:bottom w:val="single" w:color="1F4E79" w:sz="2"/>
+              <w:right w:val="single" w:color="1F4E79" w:sz="2"/>
+            </w:tcBorders>
+            <w:shd w:fill="2E75B6" w:val="clear"/>
+            <w:tcMar>
+              <w:top w:type="dxa" w:w="100"/>
+              <w:left w:type="dxa" w:w="150"/>
+              <w:bottom w:type="dxa" w:w="100"/>
+              <w:right w:type="dxa" w:w="150"/>
+            </w:tcMar>
+            <w:vAlign w:val="center"/>
+          </w:tcPr>
+          <w:p>
+            <w:pPr>
+              <w:jc w:val="center"/>
+            </w:pPr>
+            <w:r>
+              <w:rPr>
+                <w:rFonts w:ascii="Arial" w:cs="Arial" w:eastAsia="Arial" w:hAnsi="Arial"/>
+                <w:b/>
+                <w:bCs/>
+                <w:i w:val="false"/>
+                <w:iCs w:val="false"/>
+                <w:color w:val="FFFFFF"/>
+                <w:sz w:val="20"/>
+                <w:szCs w:val="20"/>
+              </w:rPr>
               <w:t xml:space="preserve">Error ± std (%)</w:t>
             </w:r>
           </w:p>
@@ -20624,7 +20603,7 @@
       <w:tr>
         <w:tc>
           <w:tcPr>
-            <w:tcW w:type="dxa" w:w="340"/>
+            <w:tcW w:type="dxa" w:w="320"/>
             <w:tcBorders>
               <w:top w:val="single" w:color="CCCCCC" w:sz="1"/>
               <w:left w:val="single" w:color="CCCCCC" w:sz="1"/>
@@ -20632,6 +20611,1276 @@
               <w:right w:val="single" w:color="CCCCCC" w:sz="1"/>
             </w:tcBorders>
             <w:shd w:fill="EBF3FB" w:val="clear"/>
+            <w:tcMar>
+              <w:top w:type="dxa" w:w="80"/>
+              <w:left w:type="dxa" w:w="120"/>
+              <w:bottom w:type="dxa" w:w="80"/>
+              <w:right w:type="dxa" w:w="120"/>
+            </w:tcMar>
+          </w:tcPr>
+          <w:p>
+            <w:pPr>
+              <w:jc w:val="center"/>
+            </w:pPr>
+            <w:r>
+              <w:rPr>
+                <w:rFonts w:ascii="Arial" w:cs="Arial" w:eastAsia="Arial" w:hAnsi="Arial"/>
+                <w:b w:val="false"/>
+                <w:bCs w:val="false"/>
+                <w:i w:val="false"/>
+                <w:iCs w:val="false"/>
+                <w:color w:val="000000"/>
+                <w:sz w:val="20"/>
+                <w:szCs w:val="20"/>
+              </w:rPr>
+              <w:t xml:space="preserve">1</w:t>
+            </w:r>
+          </w:p>
+        </w:tc>
+        <w:tc>
+          <w:tcPr>
+            <w:tcW w:type="dxa" w:w="1380"/>
+            <w:tcBorders>
+              <w:top w:val="single" w:color="CCCCCC" w:sz="1"/>
+              <w:left w:val="single" w:color="CCCCCC" w:sz="1"/>
+              <w:bottom w:val="single" w:color="CCCCCC" w:sz="1"/>
+              <w:right w:val="single" w:color="CCCCCC" w:sz="1"/>
+            </w:tcBorders>
+            <w:shd w:fill="EBF3FB" w:val="clear"/>
+            <w:tcMar>
+              <w:top w:type="dxa" w:w="80"/>
+              <w:left w:type="dxa" w:w="120"/>
+              <w:bottom w:type="dxa" w:w="80"/>
+              <w:right w:type="dxa" w:w="120"/>
+            </w:tcMar>
+          </w:tcPr>
+          <w:p>
+            <w:pPr>
+              <w:jc w:val="center"/>
+            </w:pPr>
+            <w:r>
+              <w:rPr>
+                <w:rFonts w:ascii="Arial" w:cs="Arial" w:eastAsia="Arial" w:hAnsi="Arial"/>
+                <w:b w:val="false"/>
+                <w:bCs w:val="false"/>
+                <w:i w:val="false"/>
+                <w:iCs w:val="false"/>
+                <w:color w:val="000000"/>
+                <w:sz w:val="20"/>
+                <w:szCs w:val="20"/>
+              </w:rPr>
+              <w:t xml:space="preserve">DT max_depth=1</w:t>
+            </w:r>
+          </w:p>
+        </w:tc>
+        <w:tc>
+          <w:tcPr>
+            <w:tcW w:type="dxa" w:w="800"/>
+            <w:tcBorders>
+              <w:top w:val="single" w:color="CCCCCC" w:sz="1"/>
+              <w:left w:val="single" w:color="CCCCCC" w:sz="1"/>
+              <w:bottom w:val="single" w:color="CCCCCC" w:sz="1"/>
+              <w:right w:val="single" w:color="CCCCCC" w:sz="1"/>
+            </w:tcBorders>
+            <w:shd w:fill="EBF3FB" w:val="clear"/>
+            <w:tcMar>
+              <w:top w:type="dxa" w:w="80"/>
+              <w:left w:type="dxa" w:w="120"/>
+              <w:bottom w:type="dxa" w:w="80"/>
+              <w:right w:type="dxa" w:w="120"/>
+            </w:tcMar>
+          </w:tcPr>
+          <w:p>
+            <w:pPr>
+              <w:jc w:val="center"/>
+            </w:pPr>
+            <w:r>
+              <w:rPr>
+                <w:rFonts w:ascii="Arial" w:cs="Arial" w:eastAsia="Arial" w:hAnsi="Arial"/>
+                <w:b w:val="false"/>
+                <w:bCs w:val="false"/>
+                <w:i w:val="false"/>
+                <w:iCs w:val="false"/>
+                <w:color w:val="000000"/>
+                <w:sz w:val="20"/>
+                <w:szCs w:val="20"/>
+              </w:rPr>
+              <w:t xml:space="preserve">1</w:t>
+            </w:r>
+          </w:p>
+        </w:tc>
+        <w:tc>
+          <w:tcPr>
+            <w:tcW w:type="dxa" w:w="1400"/>
+            <w:tcBorders>
+              <w:top w:val="single" w:color="CCCCCC" w:sz="1"/>
+              <w:left w:val="single" w:color="CCCCCC" w:sz="1"/>
+              <w:bottom w:val="single" w:color="CCCCCC" w:sz="1"/>
+              <w:right w:val="single" w:color="CCCCCC" w:sz="1"/>
+            </w:tcBorders>
+            <w:shd w:fill="EBF3FB" w:val="clear"/>
+            <w:tcMar>
+              <w:top w:type="dxa" w:w="80"/>
+              <w:left w:type="dxa" w:w="120"/>
+              <w:bottom w:type="dxa" w:w="80"/>
+              <w:right w:type="dxa" w:w="120"/>
+            </w:tcMar>
+          </w:tcPr>
+          <w:p>
+            <w:pPr>
+              <w:jc w:val="center"/>
+            </w:pPr>
+            <w:r>
+              <w:rPr>
+                <w:rFonts w:ascii="Arial" w:cs="Arial" w:eastAsia="Arial" w:hAnsi="Arial"/>
+                <w:b w:val="false"/>
+                <w:bCs w:val="false"/>
+                <w:i w:val="false"/>
+                <w:iCs w:val="false"/>
+                <w:color w:val="000000"/>
+                <w:sz w:val="20"/>
+                <w:szCs w:val="20"/>
+              </w:rPr>
+              <w:t xml:space="preserve">29,09 ± 0,03</w:t>
+            </w:r>
+          </w:p>
+        </w:tc>
+        <w:tc>
+          <w:tcPr>
+            <w:tcW w:type="dxa" w:w="1400"/>
+            <w:tcBorders>
+              <w:top w:val="single" w:color="CCCCCC" w:sz="1"/>
+              <w:left w:val="single" w:color="CCCCCC" w:sz="1"/>
+              <w:bottom w:val="single" w:color="CCCCCC" w:sz="1"/>
+              <w:right w:val="single" w:color="CCCCCC" w:sz="1"/>
+            </w:tcBorders>
+            <w:shd w:fill="EBF3FB" w:val="clear"/>
+            <w:tcMar>
+              <w:top w:type="dxa" w:w="80"/>
+              <w:left w:type="dxa" w:w="120"/>
+              <w:bottom w:type="dxa" w:w="80"/>
+              <w:right w:type="dxa" w:w="120"/>
+            </w:tcMar>
+          </w:tcPr>
+          <w:p>
+            <w:pPr>
+              <w:jc w:val="center"/>
+            </w:pPr>
+            <w:r>
+              <w:rPr>
+                <w:rFonts w:ascii="Arial" w:cs="Arial" w:eastAsia="Arial" w:hAnsi="Arial"/>
+                <w:b w:val="false"/>
+                <w:bCs w:val="false"/>
+                <w:i w:val="false"/>
+                <w:iCs w:val="false"/>
+                <w:color w:val="000000"/>
+                <w:sz w:val="20"/>
+                <w:szCs w:val="20"/>
+              </w:rPr>
+              <w:t xml:space="preserve">29,09 ± 0,25</w:t>
+            </w:r>
+          </w:p>
+        </w:tc>
+        <w:tc>
+          <w:tcPr>
+            <w:tcW w:type="dxa" w:w="1500"/>
+            <w:tcBorders>
+              <w:top w:val="single" w:color="CCCCCC" w:sz="1"/>
+              <w:left w:val="single" w:color="CCCCCC" w:sz="1"/>
+              <w:bottom w:val="single" w:color="CCCCCC" w:sz="1"/>
+              <w:right w:val="single" w:color="CCCCCC" w:sz="1"/>
+            </w:tcBorders>
+            <w:shd w:fill="EBF3FB" w:val="clear"/>
+            <w:tcMar>
+              <w:top w:type="dxa" w:w="80"/>
+              <w:left w:type="dxa" w:w="120"/>
+              <w:bottom w:type="dxa" w:w="80"/>
+              <w:right w:type="dxa" w:w="120"/>
+            </w:tcMar>
+          </w:tcPr>
+          <w:p>
+            <w:pPr>
+              <w:jc w:val="center"/>
+            </w:pPr>
+            <w:r>
+              <w:rPr>
+                <w:rFonts w:ascii="Arial" w:cs="Arial" w:eastAsia="Arial" w:hAnsi="Arial"/>
+                <w:b w:val="false"/>
+                <w:bCs w:val="false"/>
+                <w:i w:val="false"/>
+                <w:iCs w:val="false"/>
+                <w:color w:val="000000"/>
+                <w:sz w:val="20"/>
+                <w:szCs w:val="20"/>
+              </w:rPr>
+              <w:t xml:space="preserve">13,78 ± 0,16</w:t>
+            </w:r>
+          </w:p>
+        </w:tc>
+        <w:tc>
+          <w:tcPr>
+            <w:tcW w:type="dxa" w:w="1226"/>
+            <w:tcBorders>
+              <w:top w:val="single" w:color="CCCCCC" w:sz="1"/>
+              <w:left w:val="single" w:color="CCCCCC" w:sz="1"/>
+              <w:bottom w:val="single" w:color="CCCCCC" w:sz="1"/>
+              <w:right w:val="single" w:color="CCCCCC" w:sz="1"/>
+            </w:tcBorders>
+            <w:shd w:fill="EBF3FB" w:val="clear"/>
+            <w:tcMar>
+              <w:top w:type="dxa" w:w="80"/>
+              <w:left w:type="dxa" w:w="120"/>
+              <w:bottom w:type="dxa" w:w="80"/>
+              <w:right w:type="dxa" w:w="120"/>
+            </w:tcMar>
+          </w:tcPr>
+          <w:p>
+            <w:pPr>
+              <w:jc w:val="center"/>
+            </w:pPr>
+            <w:r>
+              <w:rPr>
+                <w:rFonts w:ascii="Arial" w:cs="Arial" w:eastAsia="Arial" w:hAnsi="Arial"/>
+                <w:b w:val="false"/>
+                <w:bCs w:val="false"/>
+                <w:i w:val="false"/>
+                <w:iCs w:val="false"/>
+                <w:color w:val="000000"/>
+                <w:sz w:val="20"/>
+                <w:szCs w:val="20"/>
+              </w:rPr>
+              <w:t xml:space="preserve">70,91 ± 0,25</w:t>
+            </w:r>
+          </w:p>
+        </w:tc>
+      </w:tr>
+      <w:tr>
+        <w:tc>
+          <w:tcPr>
+            <w:tcW w:type="dxa" w:w="320"/>
+            <w:tcBorders>
+              <w:top w:val="single" w:color="CCCCCC" w:sz="1"/>
+              <w:left w:val="single" w:color="CCCCCC" w:sz="1"/>
+              <w:bottom w:val="single" w:color="CCCCCC" w:sz="1"/>
+              <w:right w:val="single" w:color="CCCCCC" w:sz="1"/>
+            </w:tcBorders>
+            <w:shd w:fill="FFFFFF" w:val="clear"/>
+            <w:tcMar>
+              <w:top w:type="dxa" w:w="80"/>
+              <w:left w:type="dxa" w:w="120"/>
+              <w:bottom w:type="dxa" w:w="80"/>
+              <w:right w:type="dxa" w:w="120"/>
+            </w:tcMar>
+          </w:tcPr>
+          <w:p>
+            <w:pPr>
+              <w:jc w:val="center"/>
+            </w:pPr>
+            <w:r>
+              <w:rPr>
+                <w:rFonts w:ascii="Arial" w:cs="Arial" w:eastAsia="Arial" w:hAnsi="Arial"/>
+                <w:b w:val="false"/>
+                <w:bCs w:val="false"/>
+                <w:i w:val="false"/>
+                <w:iCs w:val="false"/>
+                <w:color w:val="000000"/>
+                <w:sz w:val="20"/>
+                <w:szCs w:val="20"/>
+              </w:rPr>
+              <w:t xml:space="preserve">2</w:t>
+            </w:r>
+          </w:p>
+        </w:tc>
+        <w:tc>
+          <w:tcPr>
+            <w:tcW w:type="dxa" w:w="1380"/>
+            <w:tcBorders>
+              <w:top w:val="single" w:color="CCCCCC" w:sz="1"/>
+              <w:left w:val="single" w:color="CCCCCC" w:sz="1"/>
+              <w:bottom w:val="single" w:color="CCCCCC" w:sz="1"/>
+              <w:right w:val="single" w:color="CCCCCC" w:sz="1"/>
+            </w:tcBorders>
+            <w:shd w:fill="FFFFFF" w:val="clear"/>
+            <w:tcMar>
+              <w:top w:type="dxa" w:w="80"/>
+              <w:left w:type="dxa" w:w="120"/>
+              <w:bottom w:type="dxa" w:w="80"/>
+              <w:right w:type="dxa" w:w="120"/>
+            </w:tcMar>
+          </w:tcPr>
+          <w:p>
+            <w:pPr>
+              <w:jc w:val="center"/>
+            </w:pPr>
+            <w:r>
+              <w:rPr>
+                <w:rFonts w:ascii="Arial" w:cs="Arial" w:eastAsia="Arial" w:hAnsi="Arial"/>
+                <w:b w:val="false"/>
+                <w:bCs w:val="false"/>
+                <w:i w:val="false"/>
+                <w:iCs w:val="false"/>
+                <w:color w:val="000000"/>
+                <w:sz w:val="20"/>
+                <w:szCs w:val="20"/>
+              </w:rPr>
+              <w:t xml:space="preserve">DT max_depth=2</w:t>
+            </w:r>
+          </w:p>
+        </w:tc>
+        <w:tc>
+          <w:tcPr>
+            <w:tcW w:type="dxa" w:w="800"/>
+            <w:tcBorders>
+              <w:top w:val="single" w:color="CCCCCC" w:sz="1"/>
+              <w:left w:val="single" w:color="CCCCCC" w:sz="1"/>
+              <w:bottom w:val="single" w:color="CCCCCC" w:sz="1"/>
+              <w:right w:val="single" w:color="CCCCCC" w:sz="1"/>
+            </w:tcBorders>
+            <w:shd w:fill="FFFFFF" w:val="clear"/>
+            <w:tcMar>
+              <w:top w:type="dxa" w:w="80"/>
+              <w:left w:type="dxa" w:w="120"/>
+              <w:bottom w:type="dxa" w:w="80"/>
+              <w:right w:type="dxa" w:w="120"/>
+            </w:tcMar>
+          </w:tcPr>
+          <w:p>
+            <w:pPr>
+              <w:jc w:val="center"/>
+            </w:pPr>
+            <w:r>
+              <w:rPr>
+                <w:rFonts w:ascii="Arial" w:cs="Arial" w:eastAsia="Arial" w:hAnsi="Arial"/>
+                <w:b w:val="false"/>
+                <w:bCs w:val="false"/>
+                <w:i w:val="false"/>
+                <w:iCs w:val="false"/>
+                <w:color w:val="000000"/>
+                <w:sz w:val="20"/>
+                <w:szCs w:val="20"/>
+              </w:rPr>
+              <w:t xml:space="preserve">2</w:t>
+            </w:r>
+          </w:p>
+        </w:tc>
+        <w:tc>
+          <w:tcPr>
+            <w:tcW w:type="dxa" w:w="1400"/>
+            <w:tcBorders>
+              <w:top w:val="single" w:color="CCCCCC" w:sz="1"/>
+              <w:left w:val="single" w:color="CCCCCC" w:sz="1"/>
+              <w:bottom w:val="single" w:color="CCCCCC" w:sz="1"/>
+              <w:right w:val="single" w:color="CCCCCC" w:sz="1"/>
+            </w:tcBorders>
+            <w:shd w:fill="FFFFFF" w:val="clear"/>
+            <w:tcMar>
+              <w:top w:type="dxa" w:w="80"/>
+              <w:left w:type="dxa" w:w="120"/>
+              <w:bottom w:type="dxa" w:w="80"/>
+              <w:right w:type="dxa" w:w="120"/>
+            </w:tcMar>
+          </w:tcPr>
+          <w:p>
+            <w:pPr>
+              <w:jc w:val="center"/>
+            </w:pPr>
+            <w:r>
+              <w:rPr>
+                <w:rFonts w:ascii="Arial" w:cs="Arial" w:eastAsia="Arial" w:hAnsi="Arial"/>
+                <w:b w:val="false"/>
+                <w:bCs w:val="false"/>
+                <w:i w:val="false"/>
+                <w:iCs w:val="false"/>
+                <w:color w:val="000000"/>
+                <w:sz w:val="20"/>
+                <w:szCs w:val="20"/>
+              </w:rPr>
+              <w:t xml:space="preserve">55,14 ± 0,07</w:t>
+            </w:r>
+          </w:p>
+        </w:tc>
+        <w:tc>
+          <w:tcPr>
+            <w:tcW w:type="dxa" w:w="1400"/>
+            <w:tcBorders>
+              <w:top w:val="single" w:color="CCCCCC" w:sz="1"/>
+              <w:left w:val="single" w:color="CCCCCC" w:sz="1"/>
+              <w:bottom w:val="single" w:color="CCCCCC" w:sz="1"/>
+              <w:right w:val="single" w:color="CCCCCC" w:sz="1"/>
+            </w:tcBorders>
+            <w:shd w:fill="FFFFFF" w:val="clear"/>
+            <w:tcMar>
+              <w:top w:type="dxa" w:w="80"/>
+              <w:left w:type="dxa" w:w="120"/>
+              <w:bottom w:type="dxa" w:w="80"/>
+              <w:right w:type="dxa" w:w="120"/>
+            </w:tcMar>
+          </w:tcPr>
+          <w:p>
+            <w:pPr>
+              <w:jc w:val="center"/>
+            </w:pPr>
+            <w:r>
+              <w:rPr>
+                <w:rFonts w:ascii="Arial" w:cs="Arial" w:eastAsia="Arial" w:hAnsi="Arial"/>
+                <w:b w:val="false"/>
+                <w:bCs w:val="false"/>
+                <w:i w:val="false"/>
+                <w:iCs w:val="false"/>
+                <w:color w:val="000000"/>
+                <w:sz w:val="20"/>
+                <w:szCs w:val="20"/>
+              </w:rPr>
+              <w:t xml:space="preserve">54,90 ± 0,67</w:t>
+            </w:r>
+          </w:p>
+        </w:tc>
+        <w:tc>
+          <w:tcPr>
+            <w:tcW w:type="dxa" w:w="1500"/>
+            <w:tcBorders>
+              <w:top w:val="single" w:color="CCCCCC" w:sz="1"/>
+              <w:left w:val="single" w:color="CCCCCC" w:sz="1"/>
+              <w:bottom w:val="single" w:color="CCCCCC" w:sz="1"/>
+              <w:right w:val="single" w:color="CCCCCC" w:sz="1"/>
+            </w:tcBorders>
+            <w:shd w:fill="FFFFFF" w:val="clear"/>
+            <w:tcMar>
+              <w:top w:type="dxa" w:w="80"/>
+              <w:left w:type="dxa" w:w="120"/>
+              <w:bottom w:type="dxa" w:w="80"/>
+              <w:right w:type="dxa" w:w="120"/>
+            </w:tcMar>
+          </w:tcPr>
+          <w:p>
+            <w:pPr>
+              <w:jc w:val="center"/>
+            </w:pPr>
+            <w:r>
+              <w:rPr>
+                <w:rFonts w:ascii="Arial" w:cs="Arial" w:eastAsia="Arial" w:hAnsi="Arial"/>
+                <w:b w:val="false"/>
+                <w:bCs w:val="false"/>
+                <w:i w:val="false"/>
+                <w:iCs w:val="false"/>
+                <w:color w:val="000000"/>
+                <w:sz w:val="20"/>
+                <w:szCs w:val="20"/>
+              </w:rPr>
+              <w:t xml:space="preserve">43,43 ± 0,39</w:t>
+            </w:r>
+          </w:p>
+        </w:tc>
+        <w:tc>
+          <w:tcPr>
+            <w:tcW w:type="dxa" w:w="1226"/>
+            <w:tcBorders>
+              <w:top w:val="single" w:color="CCCCCC" w:sz="1"/>
+              <w:left w:val="single" w:color="CCCCCC" w:sz="1"/>
+              <w:bottom w:val="single" w:color="CCCCCC" w:sz="1"/>
+              <w:right w:val="single" w:color="CCCCCC" w:sz="1"/>
+            </w:tcBorders>
+            <w:shd w:fill="FFFFFF" w:val="clear"/>
+            <w:tcMar>
+              <w:top w:type="dxa" w:w="80"/>
+              <w:left w:type="dxa" w:w="120"/>
+              <w:bottom w:type="dxa" w:w="80"/>
+              <w:right w:type="dxa" w:w="120"/>
+            </w:tcMar>
+          </w:tcPr>
+          <w:p>
+            <w:pPr>
+              <w:jc w:val="center"/>
+            </w:pPr>
+            <w:r>
+              <w:rPr>
+                <w:rFonts w:ascii="Arial" w:cs="Arial" w:eastAsia="Arial" w:hAnsi="Arial"/>
+                <w:b w:val="false"/>
+                <w:bCs w:val="false"/>
+                <w:i w:val="false"/>
+                <w:iCs w:val="false"/>
+                <w:color w:val="000000"/>
+                <w:sz w:val="20"/>
+                <w:szCs w:val="20"/>
+              </w:rPr>
+              <w:t xml:space="preserve">45,10 ± 0,67</w:t>
+            </w:r>
+          </w:p>
+        </w:tc>
+      </w:tr>
+      <w:tr>
+        <w:tc>
+          <w:tcPr>
+            <w:tcW w:type="dxa" w:w="320"/>
+            <w:tcBorders>
+              <w:top w:val="single" w:color="CCCCCC" w:sz="1"/>
+              <w:left w:val="single" w:color="CCCCCC" w:sz="1"/>
+              <w:bottom w:val="single" w:color="CCCCCC" w:sz="1"/>
+              <w:right w:val="single" w:color="CCCCCC" w:sz="1"/>
+            </w:tcBorders>
+            <w:shd w:fill="EBF3FB" w:val="clear"/>
+            <w:tcMar>
+              <w:top w:type="dxa" w:w="80"/>
+              <w:left w:type="dxa" w:w="120"/>
+              <w:bottom w:type="dxa" w:w="80"/>
+              <w:right w:type="dxa" w:w="120"/>
+            </w:tcMar>
+          </w:tcPr>
+          <w:p>
+            <w:pPr>
+              <w:jc w:val="center"/>
+            </w:pPr>
+            <w:r>
+              <w:rPr>
+                <w:rFonts w:ascii="Arial" w:cs="Arial" w:eastAsia="Arial" w:hAnsi="Arial"/>
+                <w:b w:val="false"/>
+                <w:bCs w:val="false"/>
+                <w:i w:val="false"/>
+                <w:iCs w:val="false"/>
+                <w:color w:val="000000"/>
+                <w:sz w:val="20"/>
+                <w:szCs w:val="20"/>
+              </w:rPr>
+              <w:t xml:space="preserve">3</w:t>
+            </w:r>
+          </w:p>
+        </w:tc>
+        <w:tc>
+          <w:tcPr>
+            <w:tcW w:type="dxa" w:w="1380"/>
+            <w:tcBorders>
+              <w:top w:val="single" w:color="CCCCCC" w:sz="1"/>
+              <w:left w:val="single" w:color="CCCCCC" w:sz="1"/>
+              <w:bottom w:val="single" w:color="CCCCCC" w:sz="1"/>
+              <w:right w:val="single" w:color="CCCCCC" w:sz="1"/>
+            </w:tcBorders>
+            <w:shd w:fill="EBF3FB" w:val="clear"/>
+            <w:tcMar>
+              <w:top w:type="dxa" w:w="80"/>
+              <w:left w:type="dxa" w:w="120"/>
+              <w:bottom w:type="dxa" w:w="80"/>
+              <w:right w:type="dxa" w:w="120"/>
+            </w:tcMar>
+          </w:tcPr>
+          <w:p>
+            <w:pPr>
+              <w:jc w:val="center"/>
+            </w:pPr>
+            <w:r>
+              <w:rPr>
+                <w:rFonts w:ascii="Arial" w:cs="Arial" w:eastAsia="Arial" w:hAnsi="Arial"/>
+                <w:b w:val="false"/>
+                <w:bCs w:val="false"/>
+                <w:i w:val="false"/>
+                <w:iCs w:val="false"/>
+                <w:color w:val="000000"/>
+                <w:sz w:val="20"/>
+                <w:szCs w:val="20"/>
+              </w:rPr>
+              <w:t xml:space="preserve">DT max_depth=4</w:t>
+            </w:r>
+          </w:p>
+        </w:tc>
+        <w:tc>
+          <w:tcPr>
+            <w:tcW w:type="dxa" w:w="800"/>
+            <w:tcBorders>
+              <w:top w:val="single" w:color="CCCCCC" w:sz="1"/>
+              <w:left w:val="single" w:color="CCCCCC" w:sz="1"/>
+              <w:bottom w:val="single" w:color="CCCCCC" w:sz="1"/>
+              <w:right w:val="single" w:color="CCCCCC" w:sz="1"/>
+            </w:tcBorders>
+            <w:shd w:fill="EBF3FB" w:val="clear"/>
+            <w:tcMar>
+              <w:top w:type="dxa" w:w="80"/>
+              <w:left w:type="dxa" w:w="120"/>
+              <w:bottom w:type="dxa" w:w="80"/>
+              <w:right w:type="dxa" w:w="120"/>
+            </w:tcMar>
+          </w:tcPr>
+          <w:p>
+            <w:pPr>
+              <w:jc w:val="center"/>
+            </w:pPr>
+            <w:r>
+              <w:rPr>
+                <w:rFonts w:ascii="Arial" w:cs="Arial" w:eastAsia="Arial" w:hAnsi="Arial"/>
+                <w:b w:val="false"/>
+                <w:bCs w:val="false"/>
+                <w:i w:val="false"/>
+                <w:iCs w:val="false"/>
+                <w:color w:val="000000"/>
+                <w:sz w:val="20"/>
+                <w:szCs w:val="20"/>
+              </w:rPr>
+              <w:t xml:space="preserve">4</w:t>
+            </w:r>
+          </w:p>
+        </w:tc>
+        <w:tc>
+          <w:tcPr>
+            <w:tcW w:type="dxa" w:w="1400"/>
+            <w:tcBorders>
+              <w:top w:val="single" w:color="CCCCCC" w:sz="1"/>
+              <w:left w:val="single" w:color="CCCCCC" w:sz="1"/>
+              <w:bottom w:val="single" w:color="CCCCCC" w:sz="1"/>
+              <w:right w:val="single" w:color="CCCCCC" w:sz="1"/>
+            </w:tcBorders>
+            <w:shd w:fill="EBF3FB" w:val="clear"/>
+            <w:tcMar>
+              <w:top w:type="dxa" w:w="80"/>
+              <w:left w:type="dxa" w:w="120"/>
+              <w:bottom w:type="dxa" w:w="80"/>
+              <w:right w:type="dxa" w:w="120"/>
+            </w:tcMar>
+          </w:tcPr>
+          <w:p>
+            <w:pPr>
+              <w:jc w:val="center"/>
+            </w:pPr>
+            <w:r>
+              <w:rPr>
+                <w:rFonts w:ascii="Arial" w:cs="Arial" w:eastAsia="Arial" w:hAnsi="Arial"/>
+                <w:b w:val="false"/>
+                <w:bCs w:val="false"/>
+                <w:i w:val="false"/>
+                <w:iCs w:val="false"/>
+                <w:color w:val="000000"/>
+                <w:sz w:val="20"/>
+                <w:szCs w:val="20"/>
+              </w:rPr>
+              <w:t xml:space="preserve">78,65 ± 0,65</w:t>
+            </w:r>
+          </w:p>
+        </w:tc>
+        <w:tc>
+          <w:tcPr>
+            <w:tcW w:type="dxa" w:w="1400"/>
+            <w:tcBorders>
+              <w:top w:val="single" w:color="CCCCCC" w:sz="1"/>
+              <w:left w:val="single" w:color="CCCCCC" w:sz="1"/>
+              <w:bottom w:val="single" w:color="CCCCCC" w:sz="1"/>
+              <w:right w:val="single" w:color="CCCCCC" w:sz="1"/>
+            </w:tcBorders>
+            <w:shd w:fill="EBF3FB" w:val="clear"/>
+            <w:tcMar>
+              <w:top w:type="dxa" w:w="80"/>
+              <w:left w:type="dxa" w:w="120"/>
+              <w:bottom w:type="dxa" w:w="80"/>
+              <w:right w:type="dxa" w:w="120"/>
+            </w:tcMar>
+          </w:tcPr>
+          <w:p>
+            <w:pPr>
+              <w:jc w:val="center"/>
+            </w:pPr>
+            <w:r>
+              <w:rPr>
+                <w:rFonts w:ascii="Arial" w:cs="Arial" w:eastAsia="Arial" w:hAnsi="Arial"/>
+                <w:b w:val="false"/>
+                <w:bCs w:val="false"/>
+                <w:i w:val="false"/>
+                <w:iCs w:val="false"/>
+                <w:color w:val="000000"/>
+                <w:sz w:val="20"/>
+                <w:szCs w:val="20"/>
+              </w:rPr>
+              <w:t xml:space="preserve">76,98 ± 3,22</w:t>
+            </w:r>
+          </w:p>
+        </w:tc>
+        <w:tc>
+          <w:tcPr>
+            <w:tcW w:type="dxa" w:w="1500"/>
+            <w:tcBorders>
+              <w:top w:val="single" w:color="CCCCCC" w:sz="1"/>
+              <w:left w:val="single" w:color="CCCCCC" w:sz="1"/>
+              <w:bottom w:val="single" w:color="CCCCCC" w:sz="1"/>
+              <w:right w:val="single" w:color="CCCCCC" w:sz="1"/>
+            </w:tcBorders>
+            <w:shd w:fill="EBF3FB" w:val="clear"/>
+            <w:tcMar>
+              <w:top w:type="dxa" w:w="80"/>
+              <w:left w:type="dxa" w:w="120"/>
+              <w:bottom w:type="dxa" w:w="80"/>
+              <w:right w:type="dxa" w:w="120"/>
+            </w:tcMar>
+          </w:tcPr>
+          <w:p>
+            <w:pPr>
+              <w:jc w:val="center"/>
+            </w:pPr>
+            <w:r>
+              <w:rPr>
+                <w:rFonts w:ascii="Arial" w:cs="Arial" w:eastAsia="Arial" w:hAnsi="Arial"/>
+                <w:b w:val="false"/>
+                <w:bCs w:val="false"/>
+                <w:i w:val="false"/>
+                <w:iCs w:val="false"/>
+                <w:color w:val="000000"/>
+                <w:sz w:val="20"/>
+                <w:szCs w:val="20"/>
+              </w:rPr>
+              <w:t xml:space="preserve">77,15 ± 3,13</w:t>
+            </w:r>
+          </w:p>
+        </w:tc>
+        <w:tc>
+          <w:tcPr>
+            <w:tcW w:type="dxa" w:w="1226"/>
+            <w:tcBorders>
+              <w:top w:val="single" w:color="CCCCCC" w:sz="1"/>
+              <w:left w:val="single" w:color="CCCCCC" w:sz="1"/>
+              <w:bottom w:val="single" w:color="CCCCCC" w:sz="1"/>
+              <w:right w:val="single" w:color="CCCCCC" w:sz="1"/>
+            </w:tcBorders>
+            <w:shd w:fill="EBF3FB" w:val="clear"/>
+            <w:tcMar>
+              <w:top w:type="dxa" w:w="80"/>
+              <w:left w:type="dxa" w:w="120"/>
+              <w:bottom w:type="dxa" w:w="80"/>
+              <w:right w:type="dxa" w:w="120"/>
+            </w:tcMar>
+          </w:tcPr>
+          <w:p>
+            <w:pPr>
+              <w:jc w:val="center"/>
+            </w:pPr>
+            <w:r>
+              <w:rPr>
+                <w:rFonts w:ascii="Arial" w:cs="Arial" w:eastAsia="Arial" w:hAnsi="Arial"/>
+                <w:b w:val="false"/>
+                <w:bCs w:val="false"/>
+                <w:i w:val="false"/>
+                <w:iCs w:val="false"/>
+                <w:color w:val="000000"/>
+                <w:sz w:val="20"/>
+                <w:szCs w:val="20"/>
+              </w:rPr>
+              <w:t xml:space="preserve">23,02 ± 3,22</w:t>
+            </w:r>
+          </w:p>
+        </w:tc>
+      </w:tr>
+      <w:tr>
+        <w:tc>
+          <w:tcPr>
+            <w:tcW w:type="dxa" w:w="320"/>
+            <w:tcBorders>
+              <w:top w:val="single" w:color="CCCCCC" w:sz="1"/>
+              <w:left w:val="single" w:color="CCCCCC" w:sz="1"/>
+              <w:bottom w:val="single" w:color="CCCCCC" w:sz="1"/>
+              <w:right w:val="single" w:color="CCCCCC" w:sz="1"/>
+            </w:tcBorders>
+            <w:shd w:fill="FFFFFF" w:val="clear"/>
+            <w:tcMar>
+              <w:top w:type="dxa" w:w="80"/>
+              <w:left w:type="dxa" w:w="120"/>
+              <w:bottom w:type="dxa" w:w="80"/>
+              <w:right w:type="dxa" w:w="120"/>
+            </w:tcMar>
+          </w:tcPr>
+          <w:p>
+            <w:pPr>
+              <w:jc w:val="center"/>
+            </w:pPr>
+            <w:r>
+              <w:rPr>
+                <w:rFonts w:ascii="Arial" w:cs="Arial" w:eastAsia="Arial" w:hAnsi="Arial"/>
+                <w:b w:val="false"/>
+                <w:bCs w:val="false"/>
+                <w:i w:val="false"/>
+                <w:iCs w:val="false"/>
+                <w:color w:val="000000"/>
+                <w:sz w:val="20"/>
+                <w:szCs w:val="20"/>
+              </w:rPr>
+              <w:t xml:space="preserve">4</w:t>
+            </w:r>
+          </w:p>
+        </w:tc>
+        <w:tc>
+          <w:tcPr>
+            <w:tcW w:type="dxa" w:w="1380"/>
+            <w:tcBorders>
+              <w:top w:val="single" w:color="CCCCCC" w:sz="1"/>
+              <w:left w:val="single" w:color="CCCCCC" w:sz="1"/>
+              <w:bottom w:val="single" w:color="CCCCCC" w:sz="1"/>
+              <w:right w:val="single" w:color="CCCCCC" w:sz="1"/>
+            </w:tcBorders>
+            <w:shd w:fill="FFFFFF" w:val="clear"/>
+            <w:tcMar>
+              <w:top w:type="dxa" w:w="80"/>
+              <w:left w:type="dxa" w:w="120"/>
+              <w:bottom w:type="dxa" w:w="80"/>
+              <w:right w:type="dxa" w:w="120"/>
+            </w:tcMar>
+          </w:tcPr>
+          <w:p>
+            <w:pPr>
+              <w:jc w:val="center"/>
+            </w:pPr>
+            <w:r>
+              <w:rPr>
+                <w:rFonts w:ascii="Arial" w:cs="Arial" w:eastAsia="Arial" w:hAnsi="Arial"/>
+                <w:b w:val="false"/>
+                <w:bCs w:val="false"/>
+                <w:i w:val="false"/>
+                <w:iCs w:val="false"/>
+                <w:color w:val="000000"/>
+                <w:sz w:val="20"/>
+                <w:szCs w:val="20"/>
+              </w:rPr>
+              <w:t xml:space="preserve">DT max_depth=6</w:t>
+            </w:r>
+          </w:p>
+        </w:tc>
+        <w:tc>
+          <w:tcPr>
+            <w:tcW w:type="dxa" w:w="800"/>
+            <w:tcBorders>
+              <w:top w:val="single" w:color="CCCCCC" w:sz="1"/>
+              <w:left w:val="single" w:color="CCCCCC" w:sz="1"/>
+              <w:bottom w:val="single" w:color="CCCCCC" w:sz="1"/>
+              <w:right w:val="single" w:color="CCCCCC" w:sz="1"/>
+            </w:tcBorders>
+            <w:shd w:fill="FFFFFF" w:val="clear"/>
+            <w:tcMar>
+              <w:top w:type="dxa" w:w="80"/>
+              <w:left w:type="dxa" w:w="120"/>
+              <w:bottom w:type="dxa" w:w="80"/>
+              <w:right w:type="dxa" w:w="120"/>
+            </w:tcMar>
+          </w:tcPr>
+          <w:p>
+            <w:pPr>
+              <w:jc w:val="center"/>
+            </w:pPr>
+            <w:r>
+              <w:rPr>
+                <w:rFonts w:ascii="Arial" w:cs="Arial" w:eastAsia="Arial" w:hAnsi="Arial"/>
+                <w:b w:val="false"/>
+                <w:bCs w:val="false"/>
+                <w:i w:val="false"/>
+                <w:iCs w:val="false"/>
+                <w:color w:val="000000"/>
+                <w:sz w:val="20"/>
+                <w:szCs w:val="20"/>
+              </w:rPr>
+              <w:t xml:space="preserve">6</w:t>
+            </w:r>
+          </w:p>
+        </w:tc>
+        <w:tc>
+          <w:tcPr>
+            <w:tcW w:type="dxa" w:w="1400"/>
+            <w:tcBorders>
+              <w:top w:val="single" w:color="CCCCCC" w:sz="1"/>
+              <w:left w:val="single" w:color="CCCCCC" w:sz="1"/>
+              <w:bottom w:val="single" w:color="CCCCCC" w:sz="1"/>
+              <w:right w:val="single" w:color="CCCCCC" w:sz="1"/>
+            </w:tcBorders>
+            <w:shd w:fill="FFFFFF" w:val="clear"/>
+            <w:tcMar>
+              <w:top w:type="dxa" w:w="80"/>
+              <w:left w:type="dxa" w:w="120"/>
+              <w:bottom w:type="dxa" w:w="80"/>
+              <w:right w:type="dxa" w:w="120"/>
+            </w:tcMar>
+          </w:tcPr>
+          <w:p>
+            <w:pPr>
+              <w:jc w:val="center"/>
+            </w:pPr>
+            <w:r>
+              <w:rPr>
+                <w:rFonts w:ascii="Arial" w:cs="Arial" w:eastAsia="Arial" w:hAnsi="Arial"/>
+                <w:b w:val="false"/>
+                <w:bCs w:val="false"/>
+                <w:i w:val="false"/>
+                <w:iCs w:val="false"/>
+                <w:color w:val="000000"/>
+                <w:sz w:val="20"/>
+                <w:szCs w:val="20"/>
+              </w:rPr>
+              <w:t xml:space="preserve">91,27 ± 0,47</w:t>
+            </w:r>
+          </w:p>
+        </w:tc>
+        <w:tc>
+          <w:tcPr>
+            <w:tcW w:type="dxa" w:w="1400"/>
+            <w:tcBorders>
+              <w:top w:val="single" w:color="CCCCCC" w:sz="1"/>
+              <w:left w:val="single" w:color="CCCCCC" w:sz="1"/>
+              <w:bottom w:val="single" w:color="CCCCCC" w:sz="1"/>
+              <w:right w:val="single" w:color="CCCCCC" w:sz="1"/>
+            </w:tcBorders>
+            <w:shd w:fill="FFFFFF" w:val="clear"/>
+            <w:tcMar>
+              <w:top w:type="dxa" w:w="80"/>
+              <w:left w:type="dxa" w:w="120"/>
+              <w:bottom w:type="dxa" w:w="80"/>
+              <w:right w:type="dxa" w:w="120"/>
+            </w:tcMar>
+          </w:tcPr>
+          <w:p>
+            <w:pPr>
+              <w:jc w:val="center"/>
+            </w:pPr>
+            <w:r>
+              <w:rPr>
+                <w:rFonts w:ascii="Arial" w:cs="Arial" w:eastAsia="Arial" w:hAnsi="Arial"/>
+                <w:b w:val="false"/>
+                <w:bCs w:val="false"/>
+                <w:i w:val="false"/>
+                <w:iCs w:val="false"/>
+                <w:color w:val="000000"/>
+                <w:sz w:val="20"/>
+                <w:szCs w:val="20"/>
+              </w:rPr>
+              <w:t xml:space="preserve">87,88 ± 2,45</w:t>
+            </w:r>
+          </w:p>
+        </w:tc>
+        <w:tc>
+          <w:tcPr>
+            <w:tcW w:type="dxa" w:w="1500"/>
+            <w:tcBorders>
+              <w:top w:val="single" w:color="CCCCCC" w:sz="1"/>
+              <w:left w:val="single" w:color="CCCCCC" w:sz="1"/>
+              <w:bottom w:val="single" w:color="CCCCCC" w:sz="1"/>
+              <w:right w:val="single" w:color="CCCCCC" w:sz="1"/>
+            </w:tcBorders>
+            <w:shd w:fill="FFFFFF" w:val="clear"/>
+            <w:tcMar>
+              <w:top w:type="dxa" w:w="80"/>
+              <w:left w:type="dxa" w:w="120"/>
+              <w:bottom w:type="dxa" w:w="80"/>
+              <w:right w:type="dxa" w:w="120"/>
+            </w:tcMar>
+          </w:tcPr>
+          <w:p>
+            <w:pPr>
+              <w:jc w:val="center"/>
+            </w:pPr>
+            <w:r>
+              <w:rPr>
+                <w:rFonts w:ascii="Arial" w:cs="Arial" w:eastAsia="Arial" w:hAnsi="Arial"/>
+                <w:b w:val="false"/>
+                <w:bCs w:val="false"/>
+                <w:i w:val="false"/>
+                <w:iCs w:val="false"/>
+                <w:color w:val="000000"/>
+                <w:sz w:val="20"/>
+                <w:szCs w:val="20"/>
+              </w:rPr>
+              <w:t xml:space="preserve">87,65 ± 2,37</w:t>
+            </w:r>
+          </w:p>
+        </w:tc>
+        <w:tc>
+          <w:tcPr>
+            <w:tcW w:type="dxa" w:w="1226"/>
+            <w:tcBorders>
+              <w:top w:val="single" w:color="CCCCCC" w:sz="1"/>
+              <w:left w:val="single" w:color="CCCCCC" w:sz="1"/>
+              <w:bottom w:val="single" w:color="CCCCCC" w:sz="1"/>
+              <w:right w:val="single" w:color="CCCCCC" w:sz="1"/>
+            </w:tcBorders>
+            <w:shd w:fill="FFFFFF" w:val="clear"/>
+            <w:tcMar>
+              <w:top w:type="dxa" w:w="80"/>
+              <w:left w:type="dxa" w:w="120"/>
+              <w:bottom w:type="dxa" w:w="80"/>
+              <w:right w:type="dxa" w:w="120"/>
+            </w:tcMar>
+          </w:tcPr>
+          <w:p>
+            <w:pPr>
+              <w:jc w:val="center"/>
+            </w:pPr>
+            <w:r>
+              <w:rPr>
+                <w:rFonts w:ascii="Arial" w:cs="Arial" w:eastAsia="Arial" w:hAnsi="Arial"/>
+                <w:b w:val="false"/>
+                <w:bCs w:val="false"/>
+                <w:i w:val="false"/>
+                <w:iCs w:val="false"/>
+                <w:color w:val="000000"/>
+                <w:sz w:val="20"/>
+                <w:szCs w:val="20"/>
+              </w:rPr>
+              <w:t xml:space="preserve">12,12 ± 2,45</w:t>
+            </w:r>
+          </w:p>
+        </w:tc>
+      </w:tr>
+      <w:tr>
+        <w:tc>
+          <w:tcPr>
+            <w:tcW w:type="dxa" w:w="320"/>
+            <w:tcBorders>
+              <w:top w:val="single" w:color="CCCCCC" w:sz="1"/>
+              <w:left w:val="single" w:color="CCCCCC" w:sz="1"/>
+              <w:bottom w:val="single" w:color="CCCCCC" w:sz="1"/>
+              <w:right w:val="single" w:color="CCCCCC" w:sz="1"/>
+            </w:tcBorders>
+            <w:shd w:fill="EBF3FB" w:val="clear"/>
+            <w:tcMar>
+              <w:top w:type="dxa" w:w="80"/>
+              <w:left w:type="dxa" w:w="120"/>
+              <w:bottom w:type="dxa" w:w="80"/>
+              <w:right w:type="dxa" w:w="120"/>
+            </w:tcMar>
+          </w:tcPr>
+          <w:p>
+            <w:pPr>
+              <w:jc w:val="center"/>
+            </w:pPr>
+            <w:r>
+              <w:rPr>
+                <w:rFonts w:ascii="Arial" w:cs="Arial" w:eastAsia="Arial" w:hAnsi="Arial"/>
+                <w:b w:val="false"/>
+                <w:bCs w:val="false"/>
+                <w:i w:val="false"/>
+                <w:iCs w:val="false"/>
+                <w:color w:val="000000"/>
+                <w:sz w:val="20"/>
+                <w:szCs w:val="20"/>
+              </w:rPr>
+              <w:t xml:space="preserve">5</w:t>
+            </w:r>
+          </w:p>
+        </w:tc>
+        <w:tc>
+          <w:tcPr>
+            <w:tcW w:type="dxa" w:w="1380"/>
+            <w:tcBorders>
+              <w:top w:val="single" w:color="CCCCCC" w:sz="1"/>
+              <w:left w:val="single" w:color="CCCCCC" w:sz="1"/>
+              <w:bottom w:val="single" w:color="CCCCCC" w:sz="1"/>
+              <w:right w:val="single" w:color="CCCCCC" w:sz="1"/>
+            </w:tcBorders>
+            <w:shd w:fill="EBF3FB" w:val="clear"/>
+            <w:tcMar>
+              <w:top w:type="dxa" w:w="80"/>
+              <w:left w:type="dxa" w:w="120"/>
+              <w:bottom w:type="dxa" w:w="80"/>
+              <w:right w:type="dxa" w:w="120"/>
+            </w:tcMar>
+          </w:tcPr>
+          <w:p>
+            <w:pPr>
+              <w:jc w:val="center"/>
+            </w:pPr>
+            <w:r>
+              <w:rPr>
+                <w:rFonts w:ascii="Arial" w:cs="Arial" w:eastAsia="Arial" w:hAnsi="Arial"/>
+                <w:b w:val="false"/>
+                <w:bCs w:val="false"/>
+                <w:i w:val="false"/>
+                <w:iCs w:val="false"/>
+                <w:color w:val="000000"/>
+                <w:sz w:val="20"/>
+                <w:szCs w:val="20"/>
+              </w:rPr>
+              <w:t xml:space="preserve">DT max_depth=8</w:t>
+            </w:r>
+          </w:p>
+        </w:tc>
+        <w:tc>
+          <w:tcPr>
+            <w:tcW w:type="dxa" w:w="800"/>
+            <w:tcBorders>
+              <w:top w:val="single" w:color="CCCCCC" w:sz="1"/>
+              <w:left w:val="single" w:color="CCCCCC" w:sz="1"/>
+              <w:bottom w:val="single" w:color="CCCCCC" w:sz="1"/>
+              <w:right w:val="single" w:color="CCCCCC" w:sz="1"/>
+            </w:tcBorders>
+            <w:shd w:fill="EBF3FB" w:val="clear"/>
+            <w:tcMar>
+              <w:top w:type="dxa" w:w="80"/>
+              <w:left w:type="dxa" w:w="120"/>
+              <w:bottom w:type="dxa" w:w="80"/>
+              <w:right w:type="dxa" w:w="120"/>
+            </w:tcMar>
+          </w:tcPr>
+          <w:p>
+            <w:pPr>
+              <w:jc w:val="center"/>
+            </w:pPr>
+            <w:r>
+              <w:rPr>
+                <w:rFonts w:ascii="Arial" w:cs="Arial" w:eastAsia="Arial" w:hAnsi="Arial"/>
+                <w:b w:val="false"/>
+                <w:bCs w:val="false"/>
+                <w:i w:val="false"/>
+                <w:iCs w:val="false"/>
+                <w:color w:val="000000"/>
+                <w:sz w:val="20"/>
+                <w:szCs w:val="20"/>
+              </w:rPr>
+              <w:t xml:space="preserve">8</w:t>
+            </w:r>
+          </w:p>
+        </w:tc>
+        <w:tc>
+          <w:tcPr>
+            <w:tcW w:type="dxa" w:w="1400"/>
+            <w:tcBorders>
+              <w:top w:val="single" w:color="CCCCCC" w:sz="1"/>
+              <w:left w:val="single" w:color="CCCCCC" w:sz="1"/>
+              <w:bottom w:val="single" w:color="CCCCCC" w:sz="1"/>
+              <w:right w:val="single" w:color="CCCCCC" w:sz="1"/>
+            </w:tcBorders>
+            <w:shd w:fill="EBF3FB" w:val="clear"/>
+            <w:tcMar>
+              <w:top w:type="dxa" w:w="80"/>
+              <w:left w:type="dxa" w:w="120"/>
+              <w:bottom w:type="dxa" w:w="80"/>
+              <w:right w:type="dxa" w:w="120"/>
+            </w:tcMar>
+          </w:tcPr>
+          <w:p>
+            <w:pPr>
+              <w:jc w:val="center"/>
+            </w:pPr>
+            <w:r>
+              <w:rPr>
+                <w:rFonts w:ascii="Arial" w:cs="Arial" w:eastAsia="Arial" w:hAnsi="Arial"/>
+                <w:b w:val="false"/>
+                <w:bCs w:val="false"/>
+                <w:i w:val="false"/>
+                <w:iCs w:val="false"/>
+                <w:color w:val="000000"/>
+                <w:sz w:val="20"/>
+                <w:szCs w:val="20"/>
+              </w:rPr>
+              <w:t xml:space="preserve">98,02 ± 0,55</w:t>
+            </w:r>
+          </w:p>
+        </w:tc>
+        <w:tc>
+          <w:tcPr>
+            <w:tcW w:type="dxa" w:w="1400"/>
+            <w:tcBorders>
+              <w:top w:val="single" w:color="CCCCCC" w:sz="1"/>
+              <w:left w:val="single" w:color="CCCCCC" w:sz="1"/>
+              <w:bottom w:val="single" w:color="CCCCCC" w:sz="1"/>
+              <w:right w:val="single" w:color="CCCCCC" w:sz="1"/>
+            </w:tcBorders>
+            <w:shd w:fill="EBF3FB" w:val="clear"/>
+            <w:tcMar>
+              <w:top w:type="dxa" w:w="80"/>
+              <w:left w:type="dxa" w:w="120"/>
+              <w:bottom w:type="dxa" w:w="80"/>
+              <w:right w:type="dxa" w:w="120"/>
+            </w:tcMar>
+          </w:tcPr>
+          <w:p>
+            <w:pPr>
+              <w:jc w:val="center"/>
+            </w:pPr>
+            <w:r>
+              <w:rPr>
+                <w:rFonts w:ascii="Arial" w:cs="Arial" w:eastAsia="Arial" w:hAnsi="Arial"/>
+                <w:b w:val="false"/>
+                <w:bCs w:val="false"/>
+                <w:i w:val="false"/>
+                <w:iCs w:val="false"/>
+                <w:color w:val="000000"/>
+                <w:sz w:val="20"/>
+                <w:szCs w:val="20"/>
+              </w:rPr>
+              <w:t xml:space="preserve">92,37 ± 1,68</w:t>
+            </w:r>
+          </w:p>
+        </w:tc>
+        <w:tc>
+          <w:tcPr>
+            <w:tcW w:type="dxa" w:w="1500"/>
+            <w:tcBorders>
+              <w:top w:val="single" w:color="CCCCCC" w:sz="1"/>
+              <w:left w:val="single" w:color="CCCCCC" w:sz="1"/>
+              <w:bottom w:val="single" w:color="CCCCCC" w:sz="1"/>
+              <w:right w:val="single" w:color="CCCCCC" w:sz="1"/>
+            </w:tcBorders>
+            <w:shd w:fill="EBF3FB" w:val="clear"/>
+            <w:tcMar>
+              <w:top w:type="dxa" w:w="80"/>
+              <w:left w:type="dxa" w:w="120"/>
+              <w:bottom w:type="dxa" w:w="80"/>
+              <w:right w:type="dxa" w:w="120"/>
+            </w:tcMar>
+          </w:tcPr>
+          <w:p>
+            <w:pPr>
+              <w:jc w:val="center"/>
+            </w:pPr>
+            <w:r>
+              <w:rPr>
+                <w:rFonts w:ascii="Arial" w:cs="Arial" w:eastAsia="Arial" w:hAnsi="Arial"/>
+                <w:b w:val="false"/>
+                <w:bCs w:val="false"/>
+                <w:i w:val="false"/>
+                <w:iCs w:val="false"/>
+                <w:color w:val="000000"/>
+                <w:sz w:val="20"/>
+                <w:szCs w:val="20"/>
+              </w:rPr>
+              <w:t xml:space="preserve">92,21 ± 1,69</w:t>
+            </w:r>
+          </w:p>
+        </w:tc>
+        <w:tc>
+          <w:tcPr>
+            <w:tcW w:type="dxa" w:w="1226"/>
+            <w:tcBorders>
+              <w:top w:val="single" w:color="CCCCCC" w:sz="1"/>
+              <w:left w:val="single" w:color="CCCCCC" w:sz="1"/>
+              <w:bottom w:val="single" w:color="CCCCCC" w:sz="1"/>
+              <w:right w:val="single" w:color="CCCCCC" w:sz="1"/>
+            </w:tcBorders>
+            <w:shd w:fill="EBF3FB" w:val="clear"/>
+            <w:tcMar>
+              <w:top w:type="dxa" w:w="80"/>
+              <w:left w:type="dxa" w:w="120"/>
+              <w:bottom w:type="dxa" w:w="80"/>
+              <w:right w:type="dxa" w:w="120"/>
+            </w:tcMar>
+          </w:tcPr>
+          <w:p>
+            <w:pPr>
+              <w:jc w:val="center"/>
+            </w:pPr>
+            <w:r>
+              <w:rPr>
+                <w:rFonts w:ascii="Arial" w:cs="Arial" w:eastAsia="Arial" w:hAnsi="Arial"/>
+                <w:b w:val="false"/>
+                <w:bCs w:val="false"/>
+                <w:i w:val="false"/>
+                <w:iCs w:val="false"/>
+                <w:color w:val="000000"/>
+                <w:sz w:val="20"/>
+                <w:szCs w:val="20"/>
+              </w:rPr>
+              <w:t xml:space="preserve">7,63 ± 1,68</w:t>
+            </w:r>
+          </w:p>
+        </w:tc>
+      </w:tr>
+      <w:tr>
+        <w:tc>
+          <w:tcPr>
+            <w:tcW w:type="dxa" w:w="320"/>
+            <w:tcBorders>
+              <w:top w:val="single" w:color="CCCCCC" w:sz="1"/>
+              <w:left w:val="single" w:color="CCCCCC" w:sz="1"/>
+              <w:bottom w:val="single" w:color="CCCCCC" w:sz="1"/>
+              <w:right w:val="single" w:color="CCCCCC" w:sz="1"/>
+            </w:tcBorders>
+            <w:shd w:fill="FFFFFF" w:val="clear"/>
             <w:tcMar>
               <w:top w:type="dxa" w:w="80"/>
               <w:left w:type="dxa" w:w="120"/>
@@ -20654,13 +21903,231 @@
                 <w:sz w:val="20"/>
                 <w:szCs w:val="20"/>
               </w:rPr>
-              <w:t xml:space="preserve">1-7</w:t>
-            </w:r>
-          </w:p>
-        </w:tc>
-        <w:tc>
-          <w:tcPr>
-            <w:tcW w:type="dxa" w:w="2000"/>
+              <w:t xml:space="preserve">6</w:t>
+            </w:r>
+          </w:p>
+        </w:tc>
+        <w:tc>
+          <w:tcPr>
+            <w:tcW w:type="dxa" w:w="1380"/>
+            <w:tcBorders>
+              <w:top w:val="single" w:color="CCCCCC" w:sz="1"/>
+              <w:left w:val="single" w:color="CCCCCC" w:sz="1"/>
+              <w:bottom w:val="single" w:color="CCCCCC" w:sz="1"/>
+              <w:right w:val="single" w:color="CCCCCC" w:sz="1"/>
+            </w:tcBorders>
+            <w:shd w:fill="FFFFFF" w:val="clear"/>
+            <w:tcMar>
+              <w:top w:type="dxa" w:w="80"/>
+              <w:left w:type="dxa" w:w="120"/>
+              <w:bottom w:type="dxa" w:w="80"/>
+              <w:right w:type="dxa" w:w="120"/>
+            </w:tcMar>
+          </w:tcPr>
+          <w:p>
+            <w:pPr>
+              <w:jc w:val="center"/>
+            </w:pPr>
+            <w:r>
+              <w:rPr>
+                <w:rFonts w:ascii="Arial" w:cs="Arial" w:eastAsia="Arial" w:hAnsi="Arial"/>
+                <w:b/>
+                <w:bCs/>
+                <w:i w:val="false"/>
+                <w:iCs w:val="false"/>
+                <w:color w:val="000000"/>
+                <w:sz w:val="20"/>
+                <w:szCs w:val="20"/>
+              </w:rPr>
+              <w:t xml:space="preserve">DT max_depth=12</w:t>
+            </w:r>
+          </w:p>
+        </w:tc>
+        <w:tc>
+          <w:tcPr>
+            <w:tcW w:type="dxa" w:w="800"/>
+            <w:tcBorders>
+              <w:top w:val="single" w:color="CCCCCC" w:sz="1"/>
+              <w:left w:val="single" w:color="CCCCCC" w:sz="1"/>
+              <w:bottom w:val="single" w:color="CCCCCC" w:sz="1"/>
+              <w:right w:val="single" w:color="CCCCCC" w:sz="1"/>
+            </w:tcBorders>
+            <w:shd w:fill="FFFFFF" w:val="clear"/>
+            <w:tcMar>
+              <w:top w:type="dxa" w:w="80"/>
+              <w:left w:type="dxa" w:w="120"/>
+              <w:bottom w:type="dxa" w:w="80"/>
+              <w:right w:type="dxa" w:w="120"/>
+            </w:tcMar>
+          </w:tcPr>
+          <w:p>
+            <w:pPr>
+              <w:jc w:val="center"/>
+            </w:pPr>
+            <w:r>
+              <w:rPr>
+                <w:rFonts w:ascii="Arial" w:cs="Arial" w:eastAsia="Arial" w:hAnsi="Arial"/>
+                <w:b/>
+                <w:bCs/>
+                <w:i w:val="false"/>
+                <w:iCs w:val="false"/>
+                <w:color w:val="000000"/>
+                <w:sz w:val="20"/>
+                <w:szCs w:val="20"/>
+              </w:rPr>
+              <w:t xml:space="preserve">12</w:t>
+            </w:r>
+          </w:p>
+        </w:tc>
+        <w:tc>
+          <w:tcPr>
+            <w:tcW w:type="dxa" w:w="1400"/>
+            <w:tcBorders>
+              <w:top w:val="single" w:color="CCCCCC" w:sz="1"/>
+              <w:left w:val="single" w:color="CCCCCC" w:sz="1"/>
+              <w:bottom w:val="single" w:color="CCCCCC" w:sz="1"/>
+              <w:right w:val="single" w:color="CCCCCC" w:sz="1"/>
+            </w:tcBorders>
+            <w:shd w:fill="FFFFFF" w:val="clear"/>
+            <w:tcMar>
+              <w:top w:type="dxa" w:w="80"/>
+              <w:left w:type="dxa" w:w="120"/>
+              <w:bottom w:type="dxa" w:w="80"/>
+              <w:right w:type="dxa" w:w="120"/>
+            </w:tcMar>
+          </w:tcPr>
+          <w:p>
+            <w:pPr>
+              <w:jc w:val="center"/>
+            </w:pPr>
+            <w:r>
+              <w:rPr>
+                <w:rFonts w:ascii="Arial" w:cs="Arial" w:eastAsia="Arial" w:hAnsi="Arial"/>
+                <w:b/>
+                <w:bCs/>
+                <w:i w:val="false"/>
+                <w:iCs w:val="false"/>
+                <w:color w:val="000000"/>
+                <w:sz w:val="20"/>
+                <w:szCs w:val="20"/>
+              </w:rPr>
+              <w:t xml:space="preserve">99,95 ± 0,11</w:t>
+            </w:r>
+          </w:p>
+        </w:tc>
+        <w:tc>
+          <w:tcPr>
+            <w:tcW w:type="dxa" w:w="1400"/>
+            <w:tcBorders>
+              <w:top w:val="single" w:color="CCCCCC" w:sz="1"/>
+              <w:left w:val="single" w:color="CCCCCC" w:sz="1"/>
+              <w:bottom w:val="single" w:color="CCCCCC" w:sz="1"/>
+              <w:right w:val="single" w:color="CCCCCC" w:sz="1"/>
+            </w:tcBorders>
+            <w:shd w:fill="FFFFFF" w:val="clear"/>
+            <w:tcMar>
+              <w:top w:type="dxa" w:w="80"/>
+              <w:left w:type="dxa" w:w="120"/>
+              <w:bottom w:type="dxa" w:w="80"/>
+              <w:right w:type="dxa" w:w="120"/>
+            </w:tcMar>
+          </w:tcPr>
+          <w:p>
+            <w:pPr>
+              <w:jc w:val="center"/>
+            </w:pPr>
+            <w:r>
+              <w:rPr>
+                <w:rFonts w:ascii="Arial" w:cs="Arial" w:eastAsia="Arial" w:hAnsi="Arial"/>
+                <w:b/>
+                <w:bCs/>
+                <w:i w:val="false"/>
+                <w:iCs w:val="false"/>
+                <w:color w:val="000000"/>
+                <w:sz w:val="20"/>
+                <w:szCs w:val="20"/>
+              </w:rPr>
+              <w:t xml:space="preserve">93,13 ± 1,37</w:t>
+            </w:r>
+          </w:p>
+        </w:tc>
+        <w:tc>
+          <w:tcPr>
+            <w:tcW w:type="dxa" w:w="1500"/>
+            <w:tcBorders>
+              <w:top w:val="single" w:color="CCCCCC" w:sz="1"/>
+              <w:left w:val="single" w:color="CCCCCC" w:sz="1"/>
+              <w:bottom w:val="single" w:color="CCCCCC" w:sz="1"/>
+              <w:right w:val="single" w:color="CCCCCC" w:sz="1"/>
+            </w:tcBorders>
+            <w:shd w:fill="FFFFFF" w:val="clear"/>
+            <w:tcMar>
+              <w:top w:type="dxa" w:w="80"/>
+              <w:left w:type="dxa" w:w="120"/>
+              <w:bottom w:type="dxa" w:w="80"/>
+              <w:right w:type="dxa" w:w="120"/>
+            </w:tcMar>
+          </w:tcPr>
+          <w:p>
+            <w:pPr>
+              <w:jc w:val="center"/>
+            </w:pPr>
+            <w:r>
+              <w:rPr>
+                <w:rFonts w:ascii="Arial" w:cs="Arial" w:eastAsia="Arial" w:hAnsi="Arial"/>
+                <w:b/>
+                <w:bCs/>
+                <w:i w:val="false"/>
+                <w:iCs w:val="false"/>
+                <w:color w:val="000000"/>
+                <w:sz w:val="20"/>
+                <w:szCs w:val="20"/>
+              </w:rPr>
+              <w:t xml:space="preserve">93,00 ± 1,35</w:t>
+            </w:r>
+          </w:p>
+        </w:tc>
+        <w:tc>
+          <w:tcPr>
+            <w:tcW w:type="dxa" w:w="1226"/>
+            <w:tcBorders>
+              <w:top w:val="single" w:color="CCCCCC" w:sz="1"/>
+              <w:left w:val="single" w:color="CCCCCC" w:sz="1"/>
+              <w:bottom w:val="single" w:color="CCCCCC" w:sz="1"/>
+              <w:right w:val="single" w:color="CCCCCC" w:sz="1"/>
+            </w:tcBorders>
+            <w:shd w:fill="FFFFFF" w:val="clear"/>
+            <w:tcMar>
+              <w:top w:type="dxa" w:w="80"/>
+              <w:left w:type="dxa" w:w="120"/>
+              <w:bottom w:type="dxa" w:w="80"/>
+              <w:right w:type="dxa" w:w="120"/>
+            </w:tcMar>
+          </w:tcPr>
+          <w:p>
+            <w:pPr>
+              <w:jc w:val="center"/>
+            </w:pPr>
+            <w:r>
+              <w:rPr>
+                <w:rFonts w:ascii="Arial" w:cs="Arial" w:eastAsia="Arial" w:hAnsi="Arial"/>
+                <w:b/>
+                <w:bCs/>
+                <w:i w:val="false"/>
+                <w:iCs w:val="false"/>
+                <w:color w:val="000000"/>
+                <w:sz w:val="20"/>
+                <w:szCs w:val="20"/>
+              </w:rPr>
+              <w:t xml:space="preserve">6,87 ± 1,37</w:t>
+            </w:r>
+          </w:p>
+        </w:tc>
+      </w:tr>
+      <w:tr>
+        <w:tc>
+          <w:tcPr>
+            <w:tcW w:type="dxa" w:w="320"/>
             <w:tcBorders>
               <w:top w:val="single" w:color="CCCCCC" w:sz="1"/>
               <w:left w:val="single" w:color="CCCCCC" w:sz="1"/>
@@ -20690,13 +22157,13 @@
                 <w:sz w:val="20"/>
                 <w:szCs w:val="20"/>
               </w:rPr>
-              <w:t xml:space="preserve">DT max_depth=1..16</w:t>
-            </w:r>
-          </w:p>
-        </w:tc>
-        <w:tc>
-          <w:tcPr>
-            <w:tcW w:type="dxa" w:w="1100"/>
+              <w:t xml:space="preserve">7</w:t>
+            </w:r>
+          </w:p>
+        </w:tc>
+        <w:tc>
+          <w:tcPr>
+            <w:tcW w:type="dxa" w:w="1380"/>
             <w:tcBorders>
               <w:top w:val="single" w:color="CCCCCC" w:sz="1"/>
               <w:left w:val="single" w:color="CCCCCC" w:sz="1"/>
@@ -20726,13 +22193,13 @@
                 <w:sz w:val="20"/>
                 <w:szCs w:val="20"/>
               </w:rPr>
-              <w:t xml:space="preserve">1,2,4,6,8,12,16</w:t>
-            </w:r>
-          </w:p>
-        </w:tc>
-        <w:tc>
-          <w:tcPr>
-            <w:tcW w:type="dxa" w:w="1900"/>
+              <w:t xml:space="preserve">DT max_depth=16</w:t>
+            </w:r>
+          </w:p>
+        </w:tc>
+        <w:tc>
+          <w:tcPr>
+            <w:tcW w:type="dxa" w:w="800"/>
             <w:tcBorders>
               <w:top w:val="single" w:color="CCCCCC" w:sz="1"/>
               <w:left w:val="single" w:color="CCCCCC" w:sz="1"/>
@@ -20758,17 +22225,17 @@
                 <w:bCs w:val="false"/>
                 <w:i w:val="false"/>
                 <w:iCs w:val="false"/>
-                <w:color w:val="C00000"/>
-                <w:sz w:val="20"/>
-                <w:szCs w:val="20"/>
-              </w:rPr>
-              <w:t xml:space="preserve">12,88 ± 0,14</w:t>
-            </w:r>
-          </w:p>
-        </w:tc>
-        <w:tc>
-          <w:tcPr>
-            <w:tcW w:type="dxa" w:w="1900"/>
+                <w:color w:val="000000"/>
+                <w:sz w:val="20"/>
+                <w:szCs w:val="20"/>
+              </w:rPr>
+              <w:t xml:space="preserve">16</w:t>
+            </w:r>
+          </w:p>
+        </w:tc>
+        <w:tc>
+          <w:tcPr>
+            <w:tcW w:type="dxa" w:w="1400"/>
             <w:tcBorders>
               <w:top w:val="single" w:color="CCCCCC" w:sz="1"/>
               <w:left w:val="single" w:color="CCCCCC" w:sz="1"/>
@@ -20794,17 +22261,17 @@
                 <w:bCs w:val="false"/>
                 <w:i w:val="false"/>
                 <w:iCs w:val="false"/>
-                <w:color w:val="C00000"/>
-                <w:sz w:val="20"/>
-                <w:szCs w:val="20"/>
-              </w:rPr>
-              <w:t xml:space="preserve">3,26 ± 0,03</w:t>
-            </w:r>
-          </w:p>
-        </w:tc>
-        <w:tc>
-          <w:tcPr>
-            <w:tcW w:type="dxa" w:w="1786"/>
+                <w:color w:val="000000"/>
+                <w:sz w:val="20"/>
+                <w:szCs w:val="20"/>
+              </w:rPr>
+              <w:t xml:space="preserve">100,00 ± 0,00</w:t>
+            </w:r>
+          </w:p>
+        </w:tc>
+        <w:tc>
+          <w:tcPr>
+            <w:tcW w:type="dxa" w:w="1400"/>
             <w:tcBorders>
               <w:top w:val="single" w:color="CCCCCC" w:sz="1"/>
               <w:left w:val="single" w:color="CCCCCC" w:sz="1"/>
@@ -20830,11 +22297,83 @@
                 <w:bCs w:val="false"/>
                 <w:i w:val="false"/>
                 <w:iCs w:val="false"/>
-                <w:color w:val="C00000"/>
-                <w:sz w:val="20"/>
-                <w:szCs w:val="20"/>
-              </w:rPr>
-              <w:t xml:space="preserve">87,12 ± 0,14</w:t>
+                <w:color w:val="000000"/>
+                <w:sz w:val="20"/>
+                <w:szCs w:val="20"/>
+              </w:rPr>
+              <w:t xml:space="preserve">93,04 ± 1,57</w:t>
+            </w:r>
+          </w:p>
+        </w:tc>
+        <w:tc>
+          <w:tcPr>
+            <w:tcW w:type="dxa" w:w="1500"/>
+            <w:tcBorders>
+              <w:top w:val="single" w:color="CCCCCC" w:sz="1"/>
+              <w:left w:val="single" w:color="CCCCCC" w:sz="1"/>
+              <w:bottom w:val="single" w:color="CCCCCC" w:sz="1"/>
+              <w:right w:val="single" w:color="CCCCCC" w:sz="1"/>
+            </w:tcBorders>
+            <w:shd w:fill="EBF3FB" w:val="clear"/>
+            <w:tcMar>
+              <w:top w:type="dxa" w:w="80"/>
+              <w:left w:type="dxa" w:w="120"/>
+              <w:bottom w:type="dxa" w:w="80"/>
+              <w:right w:type="dxa" w:w="120"/>
+            </w:tcMar>
+          </w:tcPr>
+          <w:p>
+            <w:pPr>
+              <w:jc w:val="center"/>
+            </w:pPr>
+            <w:r>
+              <w:rPr>
+                <w:rFonts w:ascii="Arial" w:cs="Arial" w:eastAsia="Arial" w:hAnsi="Arial"/>
+                <w:b w:val="false"/>
+                <w:bCs w:val="false"/>
+                <w:i w:val="false"/>
+                <w:iCs w:val="false"/>
+                <w:color w:val="000000"/>
+                <w:sz w:val="20"/>
+                <w:szCs w:val="20"/>
+              </w:rPr>
+              <w:t xml:space="preserve">92,92 ± 1,55</w:t>
+            </w:r>
+          </w:p>
+        </w:tc>
+        <w:tc>
+          <w:tcPr>
+            <w:tcW w:type="dxa" w:w="1226"/>
+            <w:tcBorders>
+              <w:top w:val="single" w:color="CCCCCC" w:sz="1"/>
+              <w:left w:val="single" w:color="CCCCCC" w:sz="1"/>
+              <w:bottom w:val="single" w:color="CCCCCC" w:sz="1"/>
+              <w:right w:val="single" w:color="CCCCCC" w:sz="1"/>
+            </w:tcBorders>
+            <w:shd w:fill="EBF3FB" w:val="clear"/>
+            <w:tcMar>
+              <w:top w:type="dxa" w:w="80"/>
+              <w:left w:type="dxa" w:w="120"/>
+              <w:bottom w:type="dxa" w:w="80"/>
+              <w:right w:type="dxa" w:w="120"/>
+            </w:tcMar>
+          </w:tcPr>
+          <w:p>
+            <w:pPr>
+              <w:jc w:val="center"/>
+            </w:pPr>
+            <w:r>
+              <w:rPr>
+                <w:rFonts w:ascii="Arial" w:cs="Arial" w:eastAsia="Arial" w:hAnsi="Arial"/>
+                <w:b w:val="false"/>
+                <w:bCs w:val="false"/>
+                <w:i w:val="false"/>
+                <w:iCs w:val="false"/>
+                <w:color w:val="000000"/>
+                <w:sz w:val="20"/>
+                <w:szCs w:val="20"/>
+              </w:rPr>
+              <w:t xml:space="preserve">6,96 ± 1,57</w:t>
             </w:r>
           </w:p>
         </w:tc>
@@ -20894,7 +22433,7 @@
                 <wp:inline distT="0" distB="0" distL="0" distR="0">
                   <wp:extent cx="2667000" cy="1733550"/>
                   <wp:effectExtent t="0" r="0" b="0" l="0"/>
-                  <wp:docPr id="1" name="Figura 11. Ranking de configuraciones DT (izq.) y comparativa train vs. test (dcha.)." descr="Figura 11. Ranking de configuraciones DT (izq.) y comparativa train vs. test (dcha.)." title="Figura 11. Ranking de configuraciones DT (izq.) y comparativa train vs. test (dcha.)."/>
+                  <wp:docPr id="1" name="Figura 11. Ranking de configuraciones DT por F1-score (izq.) y comparativa train vs. test (dcha.)." descr="Figura 11. Ranking de configuraciones DT por F1-score (izq.) y comparativa train vs. test (dcha.)." title="Figura 11. Ranking de configuraciones DT por F1-score (izq.) y comparativa train vs. test (dcha.)."/>
                   <wp:cNvGraphicFramePr>
                     <a:graphicFrameLocks xmlns:a="http://schemas.openxmlformats.org/drawingml/2006/main" noChangeAspect="1"/>
                   </wp:cNvGraphicFramePr>
@@ -20950,7 +22489,7 @@
                 <wp:inline distT="0" distB="0" distL="0" distR="0">
                   <wp:extent cx="2667000" cy="1800225"/>
                   <wp:effectExtent t="0" r="0" b="0" l="0"/>
-                  <wp:docPr id="1" name="Figura 11. Ranking de configuraciones DT (izq.) y comparativa train vs. test (dcha.)." descr="Figura 11. Ranking de configuraciones DT (izq.) y comparativa train vs. test (dcha.)." title="Figura 11. Ranking de configuraciones DT (izq.) y comparativa train vs. test (dcha.)."/>
+                  <wp:docPr id="1" name="Figura 11. Ranking de configuraciones DT por F1-score (izq.) y comparativa train vs. test (dcha.)." descr="Figura 11. Ranking de configuraciones DT por F1-score (izq.) y comparativa train vs. test (dcha.)." title="Figura 11. Ranking de configuraciones DT por F1-score (izq.) y comparativa train vs. test (dcha.)."/>
                   <wp:cNvGraphicFramePr>
                     <a:graphicFrameLocks xmlns:a="http://schemas.openxmlformats.org/drawingml/2006/main" noChangeAspect="1"/>
                   </wp:cNvGraphicFramePr>
@@ -21005,7 +22544,7 @@
           <w:sz w:val="19"/>
           <w:szCs w:val="19"/>
         </w:rPr>
-        <w:t xml:space="preserve">Figura 11. Ranking de configuraciones DT (izq.) y comparativa train vs. test (dcha.).</w:t>
+        <w:t xml:space="preserve">Figura 11. Ranking de configuraciones DT por F1-score (izq.) y comparativa train vs. test (dcha.).</w:t>
       </w:r>
     </w:p>
     <w:p>
@@ -21062,7 +22601,7 @@
                 <wp:inline distT="0" distB="0" distL="0" distR="0">
                   <wp:extent cx="2667000" cy="1752600"/>
                   <wp:effectExtent t="0" r="0" b="0" l="0"/>
-                  <wp:docPr id="1" name="Figura 12. F1 vs. Error Rate (izq.) y matriz de confusión acumulada (dcha.)." descr="Figura 12. F1 vs. Error Rate (izq.) y matriz de confusión acumulada (dcha.)." title="Figura 12. F1 vs. Error Rate (izq.) y matriz de confusión acumulada (dcha.)."/>
+                  <wp:docPr id="1" name="Figura 12. F1 vs. Error Rate (izq.) y matriz de confusión de la mejor configuración: DT max_depth=12 (dcha.)." descr="Figura 12. F1 vs. Error Rate (izq.) y matriz de confusión de la mejor configuración: DT max_depth=12 (dcha.)." title="Figura 12. F1 vs. Error Rate (izq.) y matriz de confusión de la mejor configuración: DT max_depth=12 (dcha.)."/>
                   <wp:cNvGraphicFramePr>
                     <a:graphicFrameLocks xmlns:a="http://schemas.openxmlformats.org/drawingml/2006/main" noChangeAspect="1"/>
                   </wp:cNvGraphicFramePr>
@@ -21118,7 +22657,7 @@
                 <wp:inline distT="0" distB="0" distL="0" distR="0">
                   <wp:extent cx="2667000" cy="2324100"/>
                   <wp:effectExtent t="0" r="0" b="0" l="0"/>
-                  <wp:docPr id="1" name="Figura 12. F1 vs. Error Rate (izq.) y matriz de confusión acumulada (dcha.)." descr="Figura 12. F1 vs. Error Rate (izq.) y matriz de confusión acumulada (dcha.)." title="Figura 12. F1 vs. Error Rate (izq.) y matriz de confusión acumulada (dcha.)."/>
+                  <wp:docPr id="1" name="Figura 12. F1 vs. Error Rate (izq.) y matriz de confusión de la mejor configuración: DT max_depth=12 (dcha.)." descr="Figura 12. F1 vs. Error Rate (izq.) y matriz de confusión de la mejor configuración: DT max_depth=12 (dcha.)." title="Figura 12. F1 vs. Error Rate (izq.) y matriz de confusión de la mejor configuración: DT max_depth=12 (dcha.)."/>
                   <wp:cNvGraphicFramePr>
                     <a:graphicFrameLocks xmlns:a="http://schemas.openxmlformats.org/drawingml/2006/main" noChangeAspect="1"/>
                   </wp:cNvGraphicFramePr>
@@ -21173,7 +22712,7 @@
           <w:sz w:val="19"/>
           <w:szCs w:val="19"/>
         </w:rPr>
-        <w:t xml:space="preserve">Figura 12. F1 vs. Error Rate (izq.) y matriz de confusión acumulada (dcha.).</w:t>
+        <w:t xml:space="preserve">Figura 12. F1 vs. Error Rate (izq.) y matriz de confusión de la mejor configuración: DT max_depth=12 (dcha.).</w:t>
       </w:r>
     </w:p>
     <w:p>
@@ -21210,13 +22749,17 @@
           <w:sz w:val="26"/>
           <w:szCs w:val="26"/>
         </w:rPr>
-        <w:t xml:space="preserve">4.9.3. Comportamiento esperado tras corrección</w:t>
-      </w:r>
-    </w:p>
-    <w:p>
-      <w:pPr>
-        <w:spacing w:after="80" w:before="80"/>
-        <w:jc w:val="both"/>
+        <w:t xml:space="preserve">4.9.3. Análisis de resultados</w:t>
+      </w:r>
+    </w:p>
+    <w:p>
+      <w:pPr>
+        <w:pStyle w:val="ListParagraph"/>
+        <w:numPr>
+          <w:ilvl w:val="0"/>
+          <w:numId w:val="2"/>
+        </w:numPr>
+        <w:spacing w:after="60" w:before="60"/>
       </w:pPr>
       <w:r>
         <w:rPr>
@@ -21226,10 +22769,125 @@
           <w:i w:val="false"/>
           <w:iCs w:val="false"/>
           <w:color w:val="000000"/>
-          <w:sz w:val="22"/>
-          <w:szCs w:val="22"/>
-        </w:rPr>
-        <w:t xml:space="preserve">Una vez corregida la implementación, se espera que los Árboles de Decisión muestren el comportamiento típico descrito en la literatura: profundidades bajas (1-2) producen subajuste severo por insuficiente capacidad discriminativa; profundidades intermedias (6-10) alcanzan el mejor balance entre sesgo y varianza; profundidades muy altas (≥12) pueden introducir sobreajuste si no se aplica poda o restricción de tamaño mínimo de hoja. La ventaja diferencial del modelo reside en su interpretabilidad: las reglas de clasificación pueden ser directamente validadas por expertos clínicos.</w:t>
+          <w:sz w:val="21"/>
+          <w:szCs w:val="21"/>
+        </w:rPr>
+        <w:t xml:space="preserve">Relación clara profundidad–rendimiento (Figura 11): a mayor max_depth, mayor accuracy y F1, hasta alcanzar un plateau. max_depth=1 produce un clasificador casi aleatorio (F1=13,78 %) al disponer de una sola partición binaria. max_depth=4 ya alcanza un F1 razonable del 77,15 %, y a partir de max_depth=6 se entra en el rango competitivo (F1 ≥ 87,65 %).</w:t>
+      </w:r>
+    </w:p>
+    <w:p>
+      <w:pPr>
+        <w:pStyle w:val="ListParagraph"/>
+        <w:numPr>
+          <w:ilvl w:val="0"/>
+          <w:numId w:val="2"/>
+        </w:numPr>
+        <w:spacing w:after="60" w:before="60"/>
+      </w:pPr>
+      <w:r>
+        <w:rPr>
+          <w:rFonts w:ascii="Arial" w:cs="Arial" w:eastAsia="Arial" w:hAnsi="Arial"/>
+          <w:b w:val="false"/>
+          <w:bCs w:val="false"/>
+          <w:i w:val="false"/>
+          <w:iCs w:val="false"/>
+          <w:color w:val="000000"/>
+          <w:sz w:val="21"/>
+          <w:szCs w:val="21"/>
+        </w:rPr>
+        <w:t xml:space="preserve">Mejor configuración: DT max_depth=12, con F1-score macro del 93,00 ± 1,35 % y accuracy del 93,13 ± 1,37 %. Este resultado es comparable al de SVM con kernel lineal (93,65 %) y superior a k-NN y DoME, confirmando la eficacia de los árboles en este dataset.</w:t>
+      </w:r>
+    </w:p>
+    <w:p>
+      <w:pPr>
+        <w:pStyle w:val="ListParagraph"/>
+        <w:numPr>
+          <w:ilvl w:val="0"/>
+          <w:numId w:val="2"/>
+        </w:numPr>
+        <w:spacing w:after="60" w:before="60"/>
+      </w:pPr>
+      <w:r>
+        <w:rPr>
+          <w:rFonts w:ascii="Arial" w:cs="Arial" w:eastAsia="Arial" w:hAnsi="Arial"/>
+          <w:b w:val="false"/>
+          <w:bCs w:val="false"/>
+          <w:i w:val="false"/>
+          <w:iCs w:val="false"/>
+          <w:color w:val="000000"/>
+          <w:sz w:val="21"/>
+          <w:szCs w:val="21"/>
+        </w:rPr>
+        <w:t xml:space="preserve">Sobreajuste progresivo (Figura 11 dcha.): el gap entre train y test accuracy crece con la profundidad. Con max_depth=12, Train Acc = 99,95 % vs. Test Acc = 93,13 % (brecha de ≈6,8 puntos); con max_depth=16, el árbol memoriza completamente el conjunto de entrenamiento (Train=100 %) con un ligero descenso en test (93,04 %), señal de sobreajuste. La profundidad 12 ofrece el mejor equilibrio sesgo-varianza.</w:t>
+      </w:r>
+    </w:p>
+    <w:p>
+      <w:pPr>
+        <w:pStyle w:val="ListParagraph"/>
+        <w:numPr>
+          <w:ilvl w:val="0"/>
+          <w:numId w:val="2"/>
+        </w:numPr>
+        <w:spacing w:after="60" w:before="60"/>
+      </w:pPr>
+      <w:r>
+        <w:rPr>
+          <w:rFonts w:ascii="Arial" w:cs="Arial" w:eastAsia="Arial" w:hAnsi="Arial"/>
+          <w:b w:val="false"/>
+          <w:bCs w:val="false"/>
+          <w:i w:val="false"/>
+          <w:iCs w:val="false"/>
+          <w:color w:val="000000"/>
+          <w:sz w:val="21"/>
+          <w:szCs w:val="21"/>
+        </w:rPr>
+        <w:t xml:space="preserve">Estabilidad: la desviación típica del F1 con max_depth=12 es ±1,35 %, comparable a la de SVM y MLP, lo que indica que el modelo es robusto ante las distintas particiones de validación cruzada.</w:t>
+      </w:r>
+    </w:p>
+    <w:p>
+      <w:pPr>
+        <w:pStyle w:val="ListParagraph"/>
+        <w:numPr>
+          <w:ilvl w:val="0"/>
+          <w:numId w:val="2"/>
+        </w:numPr>
+        <w:spacing w:after="60" w:before="60"/>
+      </w:pPr>
+      <w:r>
+        <w:rPr>
+          <w:rFonts w:ascii="Arial" w:cs="Arial" w:eastAsia="Arial" w:hAnsi="Arial"/>
+          <w:b w:val="false"/>
+          <w:bCs w:val="false"/>
+          <w:i w:val="false"/>
+          <w:iCs w:val="false"/>
+          <w:color w:val="000000"/>
+          <w:sz w:val="21"/>
+          <w:szCs w:val="21"/>
+        </w:rPr>
+        <w:t xml:space="preserve">Interpretabilidad: a diferencia de SVM y MLP, el árbol de decisión genera reglas directamente legibles. El árbol óptimo (max_depth=12) permite identificar las variables más discriminativas (principalmente Weight y Height) y visualizar los umbrales de decisión empleados para separar cada nivel de obesidad.</w:t>
+      </w:r>
+    </w:p>
+    <w:p>
+      <w:pPr>
+        <w:pStyle w:val="ListParagraph"/>
+        <w:numPr>
+          <w:ilvl w:val="0"/>
+          <w:numId w:val="2"/>
+        </w:numPr>
+        <w:spacing w:after="60" w:before="60"/>
+      </w:pPr>
+      <w:r>
+        <w:rPr>
+          <w:rFonts w:ascii="Arial" w:cs="Arial" w:eastAsia="Arial" w:hAnsi="Arial"/>
+          <w:b w:val="false"/>
+          <w:bCs w:val="false"/>
+          <w:i w:val="false"/>
+          <w:iCs w:val="false"/>
+          <w:color w:val="000000"/>
+          <w:sz w:val="21"/>
+          <w:szCs w:val="21"/>
+        </w:rPr>
+        <w:t xml:space="preserve">Patrón de errores (Figura 12 dcha.): la matriz de confusión confirma el patrón observado en todos los modelos: los errores se concentran en clases adyacentes (Normal Weight ↔ Overweight Level I). Las clases extremas (Insufficient Weight, Obesity Type III) se clasifican con alta precisión.</w:t>
       </w:r>
     </w:p>
     <w:p>
@@ -24111,7 +25769,7 @@
           <w:sz w:val="22"/>
           <w:szCs w:val="22"/>
         </w:rPr>
-        <w:t xml:space="preserve">La Tabla 6 resume el rendimiento de la mejor configuración de cada modelo evaluado, ordenada de mayor a menor F1-score macro. Los resultados del Árbol de Decisión se excluyen de la comparativa cuantitativa por la incidencia técnica detectada.</w:t>
+        <w:t xml:space="preserve">La Tabla 6 resume el rendimiento de la mejor configuración de cada modelo evaluado, ordenada de mayor a menor F1-score macro.</w:t>
       </w:r>
     </w:p>
     <w:p>
@@ -24891,7 +26549,7 @@
                 <w:sz w:val="20"/>
                 <w:szCs w:val="20"/>
               </w:rPr>
-              <w:t xml:space="preserve">k-NN</w:t>
+              <w:t xml:space="preserve">Árbol de Decisión</w:t>
             </w:r>
           </w:p>
         </w:tc>
@@ -24927,7 +26585,7 @@
                 <w:sz w:val="20"/>
                 <w:szCs w:val="20"/>
               </w:rPr>
-              <w:t xml:space="preserve">k=1</w:t>
+              <w:t xml:space="preserve">max_depth=12</w:t>
             </w:r>
           </w:p>
         </w:tc>
@@ -24963,7 +26621,7 @@
                 <w:sz w:val="20"/>
                 <w:szCs w:val="20"/>
               </w:rPr>
-              <w:t xml:space="preserve">No</w:t>
+              <w:t xml:space="preserve">Sí</w:t>
             </w:r>
           </w:p>
         </w:tc>
@@ -24999,7 +26657,7 @@
                 <w:sz w:val="20"/>
                 <w:szCs w:val="20"/>
               </w:rPr>
-              <w:t xml:space="preserve">81,19 ± 2,44</w:t>
+              <w:t xml:space="preserve">93,13 ± 1,37</w:t>
             </w:r>
           </w:p>
         </w:tc>
@@ -25035,7 +26693,7 @@
                 <w:sz w:val="20"/>
                 <w:szCs w:val="20"/>
               </w:rPr>
-              <w:t xml:space="preserve">80,51 ± 2,51</w:t>
+              <w:t xml:space="preserve">93,00 ± 1,35</w:t>
             </w:r>
           </w:p>
         </w:tc>
@@ -25071,7 +26729,7 @@
                 <w:sz w:val="20"/>
                 <w:szCs w:val="20"/>
               </w:rPr>
-              <w:t xml:space="preserve">18,81 ± 2,44</w:t>
+              <w:t xml:space="preserve">6,87 ± 1,37</w:t>
             </w:r>
           </w:p>
         </w:tc>
@@ -25109,7 +26767,7 @@
                 <w:sz w:val="20"/>
                 <w:szCs w:val="20"/>
               </w:rPr>
-              <w:t xml:space="preserve">DoME</w:t>
+              <w:t xml:space="preserve">k-NN</w:t>
             </w:r>
           </w:p>
         </w:tc>
@@ -25145,7 +26803,7 @@
                 <w:sz w:val="20"/>
                 <w:szCs w:val="20"/>
               </w:rPr>
-              <w:t xml:space="preserve">n=100</w:t>
+              <w:t xml:space="preserve">k=1</w:t>
             </w:r>
           </w:p>
         </w:tc>
@@ -25181,7 +26839,7 @@
                 <w:sz w:val="20"/>
                 <w:szCs w:val="20"/>
               </w:rPr>
-              <w:t xml:space="preserve">Sí</w:t>
+              <w:t xml:space="preserve">No</w:t>
             </w:r>
           </w:p>
         </w:tc>
@@ -25217,7 +26875,7 @@
                 <w:sz w:val="20"/>
                 <w:szCs w:val="20"/>
               </w:rPr>
-              <w:t xml:space="preserve">80,95 ± 3,38</w:t>
+              <w:t xml:space="preserve">81,19 ± 2,44</w:t>
             </w:r>
           </w:p>
         </w:tc>
@@ -25253,7 +26911,7 @@
                 <w:sz w:val="20"/>
                 <w:szCs w:val="20"/>
               </w:rPr>
-              <w:t xml:space="preserve">80,52 ± 3,55</w:t>
+              <w:t xml:space="preserve">80,51 ± 2,51</w:t>
             </w:r>
           </w:p>
         </w:tc>
@@ -25289,7 +26947,7 @@
                 <w:sz w:val="20"/>
                 <w:szCs w:val="20"/>
               </w:rPr>
-              <w:t xml:space="preserve">19,05 ± 3,38</w:t>
+              <w:t xml:space="preserve">18,81 ± 2,44</w:t>
             </w:r>
           </w:p>
         </w:tc>
@@ -25327,7 +26985,7 @@
                 <w:sz w:val="20"/>
                 <w:szCs w:val="20"/>
               </w:rPr>
-              <w:t xml:space="preserve">Árbol de Decisión</w:t>
+              <w:t xml:space="preserve">DoME</w:t>
             </w:r>
           </w:p>
         </w:tc>
@@ -25363,7 +27021,7 @@
                 <w:sz w:val="20"/>
                 <w:szCs w:val="20"/>
               </w:rPr>
-              <w:t xml:space="preserve">— (incidencia)</w:t>
+              <w:t xml:space="preserve">n=100</w:t>
             </w:r>
           </w:p>
         </w:tc>
@@ -25435,7 +27093,7 @@
                 <w:sz w:val="20"/>
                 <w:szCs w:val="20"/>
               </w:rPr>
-              <w:t xml:space="preserve">—</w:t>
+              <w:t xml:space="preserve">80,95 ± 3,38</w:t>
             </w:r>
           </w:p>
         </w:tc>
@@ -25471,7 +27129,7 @@
                 <w:sz w:val="20"/>
                 <w:szCs w:val="20"/>
               </w:rPr>
-              <w:t xml:space="preserve">—</w:t>
+              <w:t xml:space="preserve">80,52 ± 3,55</w:t>
             </w:r>
           </w:p>
         </w:tc>
@@ -25507,7 +27165,7 @@
                 <w:sz w:val="20"/>
                 <w:szCs w:val="20"/>
               </w:rPr>
-              <w:t xml:space="preserve">—</w:t>
+              <w:t xml:space="preserve">19,05 ± 3,38</w:t>
             </w:r>
           </w:p>
         </w:tc>
@@ -25593,7 +27251,7 @@
           <w:sz w:val="21"/>
           <w:szCs w:val="21"/>
         </w:rPr>
-        <w:t xml:space="preserve">SVM con kernel lineal (F1 = 93,65 %) ofrece un rendimiento muy cercano al de las redes neuronales con una complejidad computacional significativamente menor. El hecho de que el kernel lineal supere a los no lineales sugiere que el preprocesado aplicado hace que las clases sean mayoritariamente separables de forma lineal.</w:t>
+        <w:t xml:space="preserve">SVM con kernel lineal (F1 = 93,65 %) ofrece un rendimiento muy cercano al de las RRNN con una complejidad computacional significativamente menor. El hecho de que el kernel lineal supere a los no lineales sugiere que el preprocesado aplicado hace que las clases sean mayoritariamente separables de forma lineal.</w:t>
       </w:r>
     </w:p>
     <w:p>
@@ -25616,7 +27274,7 @@
           <w:sz w:val="21"/>
           <w:szCs w:val="21"/>
         </w:rPr>
-        <w:t xml:space="preserve">k-NN con k=1 (F1 = 80,51 %) ocupa el tercer puesto, practicamente empatado con DoME (80,52 %). Aunque su rendimiento es inferior al de MLP y SVM, k-NN demuestra que la informacion local del espacio de caracteristicas es suficiente para alcanzar un nivel de precision aceptable. Su principal limitacion es el sobreajuste severo con k=1 (Train Acc = 100 % vs. Test = 81,19 %) y su alta sensibilidad al valor de k.</w:t>
+        <w:t xml:space="preserve">El Árbol de Decisión (F1 = 93,00 % con max_depth=12) ocupa el tercer lugar, empatado estadísticamente con SVM. Destaca su interpretabilidad: las reglas de clasificación pueden visualizarse y validarse directamente por expertos clínicos, sin sacrificar rendimiento.</w:t>
       </w:r>
     </w:p>
     <w:p>
@@ -25639,7 +27297,7 @@
           <w:sz w:val="21"/>
           <w:szCs w:val="21"/>
         </w:rPr>
-        <w:t xml:space="preserve">DoME (F1 = 80,52 %) queda por debajo de MLP y SVM en cuanto a precision numerica, pero ofrece una ventaja diferencial clave: genera modelos interpretables en forma de reglas explicitas comprensibles por clinicos. En entornos sanitarios donde la transparencia es un requisito legal o etico, DoME puede ser la opcion preferible.</w:t>
+        <w:t xml:space="preserve">k-NN con k=1 (F1 = 80,51 %) y DoME n=100 (F1 = 80,52 %) quedan estadísticamente empatados en cuarto lugar. k-NN es más rápido de implementar pero sufre un sobreajuste severo con k=1 (Train Acc = 100 %). DoME aporta interpretabilidad en forma de reglas difusas, con la ventaja adicional de no requerir normalización.</w:t>
       </w:r>
     </w:p>
     <w:p>
@@ -25662,7 +27320,7 @@
           <w:sz w:val="21"/>
           <w:szCs w:val="21"/>
         </w:rPr>
-        <w:t xml:space="preserve">En todos los modelos, los errores de clasificacion se concentran en clases adyacentes (Normal Weight - Overweight Level I, Overweight Level I - Overweight Level II), coherente con la naturaleza continua del IMC subyacente. Las clases extremas se clasifican con alta precision en todos los modelos.</w:t>
+        <w:t xml:space="preserve">En todos los modelos, los errores de clasificación se concentran en clases adyacentes (Normal Weight ↔ Overweight Level I, Overweight Level I ↔ Overweight Level II), coherente con la naturaleza continua del IMC subyacente. Las clases extremas se clasifican con alta precisión en todos los modelos.</w:t>
       </w:r>
     </w:p>
     <w:p>
@@ -25718,7 +27376,7 @@
           <w:sz w:val="22"/>
           <w:szCs w:val="22"/>
         </w:rPr>
-        <w:t xml:space="preserve">Este trabajo ha abordado el problema de clasificacion multiclase de niveles de obesidad empleando el dataset Estimation of Obesity Levels Based on Eating Habits and Physical Condition (UCI, 2019) y aplicando cinco modelos de Aprendizaje Automatico supervisado: Redes Neuronales Artificiales (MLP), Maquinas de Vectores Soporte (SVM), k-Vecinos mas Proximos (k-NN), Arboles de Decision y DoME.</w:t>
+        <w:t xml:space="preserve">Este trabajo ha abordado el problema de clasificación multiclase de niveles de obesidad empleando el dataset Estimation of Obesity Levels Based on Eating Habits and Physical Condition (UCI, 2019) y aplicando cinco modelos de Aprendizaje Automático supervisado: Redes Neuronales Artificiales (MLP), Máquinas de Vectores Soporte (SVM), Árboles de Decisión (DT), k-Vecinos más Próximos (k-NN) y DoME.</w:t>
       </w:r>
     </w:p>
     <w:p>
@@ -25796,7 +27454,7 @@
           <w:sz w:val="21"/>
           <w:szCs w:val="21"/>
         </w:rPr>
-        <w:t xml:space="preserve">El modelo MLP con arquitectura [128,64] sigma alcanza el mejor rendimiento, con un F1-score macro del 95,92 % y una accuracy del 96,03 % en validacion cruzada de 10 folds. Este resultado confirma la adecuacion de las redes neuronales profundas para este tipo de problemas multiclase con variables heterogeneas.</w:t>
+        <w:t xml:space="preserve">El modelo MLP con arquitectura [128,64] σ alcanza el mejor rendimiento, con un F1-score macro del 95,92 % y una accuracy del 96,03 % en validación cruzada de 10 folds. Este resultado confirma la adecuación de las redes neuronales profundas para este tipo de problemas multiclase con variables heterogéneas.</w:t>
       </w:r>
     </w:p>
     <w:p>
@@ -25819,7 +27477,7 @@
           <w:sz w:val="21"/>
           <w:szCs w:val="21"/>
         </w:rPr>
-        <w:t xml:space="preserve">La SVM con kernel lineal y C = 10 obtiene un F1 del 93,65 %, solo 2,27 puntos por debajo del mejor MLP, con una complejidad computacional muy inferior. Ello sugiere que el preprocesado aplicado es especialmente favorable para la separacion lineal de las clases en este problema.</w:t>
+        <w:t xml:space="preserve">La SVM con kernel lineal y C = 10 obtiene un F1 del 93,65 %, solo 2,27 puntos por debajo del mejor MLP, con una complejidad computacional muy inferior. Ello sugiere que el preprocesado aplicado —codificación one-hot y normalización Min-Max— es especialmente favorable para la separación lineal de las clases.</w:t>
       </w:r>
     </w:p>
     <w:p>
@@ -25842,7 +27500,7 @@
           <w:sz w:val="21"/>
           <w:szCs w:val="21"/>
         </w:rPr>
-        <w:t xml:space="preserve">El clasificador k-NN con k=1 obtiene un F1 del 80,51 %, practicamente identico a DoME, confirmando que la estructura local del espacio de caracteristicas contiene informacion suficiente para una clasificacion razonablemente precisa. No obstante, presenta overfitting severo con k=1 (Train Acc = 100 %) y un rendimiento decreciente conforme aumenta k.</w:t>
+        <w:t xml:space="preserve">El Árbol de Decisión con max_depth=12 alcanza un F1 del 93,00 %, empatado estadísticamente con SVM. Además de su alto rendimiento, destaca por su interpretabilidad: las reglas de decisión aprendidas permiten identificar los umbrales críticos de las variables más discriminativas, especialmente Weight y Height.</w:t>
       </w:r>
     </w:p>
     <w:p>
@@ -25865,7 +27523,7 @@
           <w:sz w:val="21"/>
           <w:szCs w:val="21"/>
         </w:rPr>
-        <w:t xml:space="preserve">DoME alcanza un F1 del 80,52 % con su mejor configuracion (n=100), quedando por debajo de MLP y SVM pero aportando interpretabilidad: sus modelos en forma de reglas pueden ser comprendidos y validados por expertos clinicos, lo que le confiere valor diferencial en aplicaciones sanitarias.</w:t>
+        <w:t xml:space="preserve">El clasificador k-NN con k=1 y DoME con n=100 obtienen resultados prácticamente idénticos (F1 ≈ 80,51-80,52 %), situándose en cuarto lugar. k-NN presenta sobreajuste severo con k=1 (Train Acc = 100 %) y sensibilidad al hiperparámetro; DoME, en cambio, genera modelos interpretables en forma de reglas válidas para entornos clínicos.</w:t>
       </w:r>
     </w:p>
     <w:p>
@@ -25888,30 +27546,7 @@
           <w:sz w:val="21"/>
           <w:szCs w:val="21"/>
         </w:rPr>
-        <w:t xml:space="preserve">Los experimentos con Arboles de Decision presentaron una incidencia tecnica que invalida los resultados obtenidos. La re-ejecucion del experimento tras corregir el script experimentos_arboles.jl es necesaria para obtener resultados validos y comparables con la literatura.</w:t>
-      </w:r>
-    </w:p>
-    <w:p>
-      <w:pPr>
-        <w:pStyle w:val="ListParagraph"/>
-        <w:numPr>
-          <w:ilvl w:val="0"/>
-          <w:numId w:val="2"/>
-        </w:numPr>
-        <w:spacing w:after="60" w:before="60"/>
-      </w:pPr>
-      <w:r>
-        <w:rPr>
-          <w:rFonts w:ascii="Arial" w:cs="Arial" w:eastAsia="Arial" w:hAnsi="Arial"/>
-          <w:b w:val="false"/>
-          <w:bCs w:val="false"/>
-          <w:i w:val="false"/>
-          <w:iCs w:val="false"/>
-          <w:color w:val="000000"/>
-          <w:sz w:val="21"/>
-          <w:szCs w:val="21"/>
-        </w:rPr>
-        <w:t xml:space="preserve">En todos los modelos, los errores de clasificacion se concentran en clases adyacentes (Normal Weight - Overweight Level I, Overweight Level I - Overweight Level II), lo que es coherente con la naturaleza continua del indice de masa corporal subyacente. Las clases extremas (Insufficient Weight y Obesity Type III) se clasifican con alta precision en todos los modelos.</w:t>
+        <w:t xml:space="preserve">En todos los modelos, los errores de clasificación se concentran en clases adyacentes (Normal Weight ↔ Overweight Level I, Overweight Level I ↔ Overweight Level II), coherente con la naturaleza continua del índice de masa corporal subyacente. Las clases extremas (Insufficient Weight y Obesity Type III) se clasifican con alta precisión en todos los casos.</w:t>
       </w:r>
     </w:p>
     <w:p>
@@ -25948,7 +27583,7 @@
           <w:sz w:val="22"/>
           <w:szCs w:val="22"/>
         </w:rPr>
-        <w:t xml:space="preserve">En conclusion, las tecnicas de Aprendizaje Automatico demuestran una alta eficacia para la clasificacion automatica del nivel de obesidad a partir de variables conductuales y fisicas, superando ampliamente el enfoque clinico tradicional basado unicamente en el Indice de Masa Corporal. La eleccion del modelo mas adecuado depende del contexto de aplicacion: si se prioriza el rendimiento predictivo, el MLP es la mejor opcion; si se requiere interpretabilidad clinica, DoME ofrece el mejor equilibrio entre precision y transparencia; k-NN, aunque mas sencillo conceptualmente, compite en rendimiento con DoME y constituye una referencia util al no requerir entrenamiento explicito. Como trabajo futuro, resultaria de interes explorar tecnicas de ensamblado (Random Forest, Gradient Boosting), optimizacion de hiperparametros mediante busqueda en rejilla, e incorporar variables clinicas adicionales para mejorar la profundidad diagnostica del sistema.</w:t>
+        <w:t xml:space="preserve">En conclusión, las técnicas de Aprendizaje Automático demuestran una alta eficacia para la clasificación automática del nivel de obesidad a partir de variables conductuales y físicas, superando ampliamente el enfoque clínico tradicional basado únicamente en el Índice de Masa Corporal. La elección del modelo más adecuado depende del contexto: si se prioriza el rendimiento predictivo, el MLP es la mejor opción; si se necesita interpretabilidad clínica con alto rendimiento, el Árbol de Decisión ofrece el mejor equilibrio; para aplicaciones donde la transparencia regulatoria es prioritaria, DoME proporciona modelos en forma de reglas auditables. Como trabajo futuro, resultaría de interés explorar técnicas de ensamblado (Random Forest, Gradient Boosting), optimización de hiperparámetros mediante búsqueda en rejilla, e incorporar variables clínicas adicionales para mejorar la profundidad diagnóstica del sistema.</w:t>
       </w:r>
     </w:p>
     <w:p>
@@ -25985,7 +27620,7 @@
           <w:sz w:val="32"/>
           <w:szCs w:val="32"/>
         </w:rPr>
-        <w:t xml:space="preserve">7. Bibliografia</w:t>
+        <w:t xml:space="preserve">7. Bibliografía</w:t>
       </w:r>
     </w:p>
     <w:p>
@@ -26023,7 +27658,7 @@
           <w:sz w:val="20"/>
           <w:szCs w:val="20"/>
         </w:rPr>
-        <w:t xml:space="preserve">Chawla, N. V., et al. (2002). SMOTE: Synthetic minority over-sampling technique. Journal of Artificial Intelligence Research, 16, 321-357.</w:t>
+        <w:t xml:space="preserve">Chawla, N. V., et al. (2002). SMOTE: Synthetic minority over-sampling technique. Journal of Artificial Intelligence Research, 16, 321–357.</w:t>
       </w:r>
     </w:p>
     <w:p>
@@ -26042,7 +27677,7 @@
           <w:sz w:val="20"/>
           <w:szCs w:val="20"/>
         </w:rPr>
-        <w:t xml:space="preserve">Davis, J., &amp; Goadrich, M. (2006). The relationship between Precision-Recall and ROC curves. ICML.</w:t>
+        <w:t xml:space="preserve">Davis, J., &amp; Goadrich, M. (2006). The relationship between Precision-Recall and ROC curves. ICML. https://dl.acm.org/doi/10.1145/1143844.1143874</w:t>
       </w:r>
     </w:p>
     <w:p>
@@ -26175,7 +27810,7 @@
           <w:sz w:val="20"/>
           <w:szCs w:val="20"/>
         </w:rPr>
-        <w:t xml:space="preserve">Sahoo, D., et al. (2015). Machine learning-based prediction of obesity risk using health data. Journal of Biomedical Informatics, 56, 135-146.</w:t>
+        <w:t xml:space="preserve">Sahoo, D., et al. (2015). Machine learning-based prediction of obesity risk using health data. Journal of Biomedical Informatics, 56, 135–146.</w:t>
       </w:r>
     </w:p>
     <w:p>
@@ -26194,7 +27829,7 @@
           <w:sz w:val="20"/>
           <w:szCs w:val="20"/>
         </w:rPr>
-        <w:t xml:space="preserve">Silva, L., et al. (2024). Obesity classification: machine learning models excluding weight and height data. Revista da Associacao Medica Brasileira.</w:t>
+        <w:t xml:space="preserve">Silva, L., et al. (2024). Obesity classification: machine learning models excluding weight and height data. Revista da Associação Médica Brasileira.</w:t>
       </w:r>
     </w:p>
     <w:p>

</xml_diff>

<commit_message>
Añadir sección 7 Trabajo Futuro y actualizar memoria completa
- Nueva sección 7 (Trabajo Futuro) con 4 subsecciones:
  7.1 Modelos y técnicas avanzadas (ensamblados, regularización)
  7.2 Optimización de hiperparámetros (Grid/Random/Bayesian Search)
  7.3 Enriquecimiento del dataset y generalización (variables clínicas)
  7.4 Selección de características e interpretabilidad (SHAP, PCA)
- Bibliografía renumerada a sección 8
- Sección 1.2 actualizada con la nueva estructura del documento
- Añadidos resultados KNN y archivos de experimentos actualizados
</commit_message>
<xml_diff>
--- a/FAA_P2_Memoria_Completa.docx
+++ b/FAA_P2_Memoria_Completa.docx
@@ -764,7 +764,7 @@
           <w:sz w:val="22"/>
           <w:szCs w:val="22"/>
         </w:rPr>
-        <w:t xml:space="preserve">El resto del trabajo se organiza de la siguiente manera: la Sección 2 describe en detalle el conjunto de datos y el preprocesado aplicado; la Sección 3 recoge el análisis bibliográfico; la Sección 4 detalla la metodología experimental y los resultados obtenidos con cada modelo; la Sección 5 presenta una comparativa global de todos los modelos; y la Sección 6 recoge las conclusiones del trabajo.</w:t>
+        <w:t xml:space="preserve">El resto del trabajo se organiza de la siguiente manera: la Sección 2 describe en detalle el conjunto de datos y el preprocesado aplicado; la Sección 3 recoge el análisis bibliográfico; la Sección 4 detalla la metodología experimental y los resultados obtenidos con cada modelo; la Sección 5 presenta una comparativa global de todos los modelos; la Sección 6 recoge las conclusiones del trabajo; la Sección 7 propone líneas de trabajo futuro; y la Sección 8 incluye las referencias bibliográficas.</w:t>
       </w:r>
     </w:p>
     <w:p>
@@ -27583,7 +27583,7 @@
           <w:sz w:val="22"/>
           <w:szCs w:val="22"/>
         </w:rPr>
-        <w:t xml:space="preserve">En conclusión, las técnicas de Aprendizaje Automático demuestran una alta eficacia para la clasificación automática del nivel de obesidad a partir de variables conductuales y físicas, superando ampliamente el enfoque clínico tradicional basado únicamente en el Índice de Masa Corporal. La elección del modelo más adecuado depende del contexto: si se prioriza el rendimiento predictivo, el MLP es la mejor opción; si se necesita interpretabilidad clínica con alto rendimiento, el Árbol de Decisión ofrece el mejor equilibrio; para aplicaciones donde la transparencia regulatoria es prioritaria, DoME proporciona modelos en forma de reglas auditables. Como trabajo futuro, resultaría de interés explorar técnicas de ensamblado (Random Forest, Gradient Boosting), optimización de hiperparámetros mediante búsqueda en rejilla, e incorporar variables clínicas adicionales para mejorar la profundidad diagnóstica del sistema.</w:t>
+        <w:t xml:space="preserve">En conclusión, las técnicas de Aprendizaje Automático demuestran una alta eficacia para la clasificación automática del nivel de obesidad a partir de variables conductuales y físicas, superando ampliamente el enfoque clínico tradicional basado únicamente en el Índice de Masa Corporal. La elección del modelo más adecuado depende del contexto: si se prioriza el rendimiento predictivo, el MLP es la mejor opción; si se necesita interpretabilidad clínica con alto rendimiento, el Árbol de Decisión ofrece el mejor equilibrio; para aplicaciones donde la transparencia regulatoria es prioritaria, DoME proporciona modelos en forma de reglas auditables.</w:t>
       </w:r>
     </w:p>
     <w:p>
@@ -27620,7 +27620,210 @@
           <w:sz w:val="32"/>
           <w:szCs w:val="32"/>
         </w:rPr>
-        <w:t xml:space="preserve">7. Bibliografía</w:t>
+        <w:t xml:space="preserve">7. Trabajo Futuro</w:t>
+      </w:r>
+    </w:p>
+    <w:p>
+      <w:pPr>
+        <w:spacing w:after="160" w:before="80"/>
+      </w:pPr>
+      <w:r>
+        <w:rPr>
+          <w:rFonts w:ascii="Arial" w:cs="Arial" w:eastAsia="Arial" w:hAnsi="Arial"/>
+          <w:b w:val="false"/>
+          <w:bCs w:val="false"/>
+          <w:i w:val="false"/>
+          <w:iCs w:val="false"/>
+          <w:color w:val="000000"/>
+          <w:sz w:val="22"/>
+          <w:szCs w:val="22"/>
+        </w:rPr>
+        <w:t xml:space="preserve">Los resultados obtenidos en este trabajo abren diversas líneas de investigación y mejora que podrían desarrollarse en trabajos futuros. A continuación se detallan las más relevantes, agrupadas por ámbito.</w:t>
+      </w:r>
+    </w:p>
+    <w:p>
+      <w:pPr>
+        <w:pStyle w:val="Heading2"/>
+        <w:spacing w:after="120" w:before="240"/>
+      </w:pPr>
+      <w:r>
+        <w:rPr>
+          <w:rFonts w:ascii="Arial" w:cs="Arial" w:eastAsia="Arial" w:hAnsi="Arial"/>
+          <w:b/>
+          <w:bCs/>
+          <w:i w:val="false"/>
+          <w:iCs w:val="false"/>
+          <w:color w:val="2E74B5"/>
+          <w:sz w:val="26"/>
+          <w:szCs w:val="26"/>
+        </w:rPr>
+        <w:t xml:space="preserve">7.1. Modelos y técnicas avanzadas</w:t>
+      </w:r>
+    </w:p>
+    <w:p>
+      <w:pPr>
+        <w:spacing w:after="120" w:before="80"/>
+      </w:pPr>
+      <w:r>
+        <w:rPr>
+          <w:rFonts w:ascii="Arial" w:cs="Arial" w:eastAsia="Arial" w:hAnsi="Arial"/>
+          <w:b w:val="false"/>
+          <w:bCs w:val="false"/>
+          <w:i w:val="false"/>
+          <w:iCs w:val="false"/>
+          <w:color w:val="000000"/>
+          <w:sz w:val="22"/>
+          <w:szCs w:val="22"/>
+        </w:rPr>
+        <w:t xml:space="preserve">El modelo con mayor rendimiento en este trabajo (MLP con arquitectura [128,64] y activación sigmoide, F1 = 95,92 %) aún presenta un gap train-test de ∼3,8 puntos, lo que sugiere margen de mejora mediante técnicas de regularización (dropout, batch normalization) o mediante arquitecturas más profundas con early stopping. En la misma línea, resulta de especial interés explorar métodos de ensamblado supervisado, tales como Random Forest, Gradient Boosting (XGBoost, LightGBM) o Stacking, que combinan múltiples clasificadores base para reducir la varianza y aumentar la robustez ante distintas particiones de validación cruzada.</w:t>
+      </w:r>
+    </w:p>
+    <w:p>
+      <w:pPr>
+        <w:spacing w:after="120" w:before="80"/>
+      </w:pPr>
+      <w:r>
+        <w:rPr>
+          <w:rFonts w:ascii="Arial" w:cs="Arial" w:eastAsia="Arial" w:hAnsi="Arial"/>
+          <w:b w:val="false"/>
+          <w:bCs w:val="false"/>
+          <w:i w:val="false"/>
+          <w:iCs w:val="false"/>
+          <w:color w:val="000000"/>
+          <w:sz w:val="22"/>
+          <w:szCs w:val="22"/>
+        </w:rPr>
+        <w:t xml:space="preserve">Para el clasificador k-NN, el sobreajuste severo observado con k=1 (brecha train-test de ∼19 puntos) podría mitigarse mediante la búsqueda del valor óptimo de k por validación interna en el propio conjunto de entrenamiento, o bien utilizando distancias ponderadas (weighted k-NN) que suavicen la influencia de vecinos lejanos. Para DoME, dado que la curva de rendimiento en función de maximumNodes no mostró señales claras de saturación, sería interesante explorar valores superiores a 100 nodos con métricas adicionales de interpretabilidad que permitan cuantificar el coste en legibilidad frente a la ganancia en precisión.</w:t>
+      </w:r>
+    </w:p>
+    <w:p>
+      <w:pPr>
+        <w:pStyle w:val="Heading2"/>
+        <w:spacing w:after="120" w:before="240"/>
+      </w:pPr>
+      <w:r>
+        <w:rPr>
+          <w:rFonts w:ascii="Arial" w:cs="Arial" w:eastAsia="Arial" w:hAnsi="Arial"/>
+          <w:b/>
+          <w:bCs/>
+          <w:i w:val="false"/>
+          <w:iCs w:val="false"/>
+          <w:color w:val="2E74B5"/>
+          <w:sz w:val="26"/>
+          <w:szCs w:val="26"/>
+        </w:rPr>
+        <w:t xml:space="preserve">7.2. Optimización de hiperparámetros</w:t>
+      </w:r>
+    </w:p>
+    <w:p>
+      <w:pPr>
+        <w:spacing w:after="120" w:before="80"/>
+      </w:pPr>
+      <w:r>
+        <w:rPr>
+          <w:rFonts w:ascii="Arial" w:cs="Arial" w:eastAsia="Arial" w:hAnsi="Arial"/>
+          <w:b w:val="false"/>
+          <w:bCs w:val="false"/>
+          <w:i w:val="false"/>
+          <w:iCs w:val="false"/>
+          <w:color w:val="000000"/>
+          <w:sz w:val="22"/>
+          <w:szCs w:val="22"/>
+        </w:rPr>
+        <w:t xml:space="preserve">La búsqueda de hiperparámetros realizada en este trabajo ha sido manual y sistemática, cubriendo un amplio rango de configuraciones para cada modelo. Sin embargo, técnicas automáticas como la búsqueda en rejilla (Grid Search), la búsqueda aleatoria (Random Search) o la optimización bayesiana (Bayesian Optimization) permitirían explorar de forma más eficiente el espacio de hiperparámetros, reduciendo el número de configuraciones evaluadas y maximizando el rendimiento. En particular, para la SVM podría explorarse la combinación de distintos valores de C y γ de forma conjunta mediante un espacio de búsqueda bidimensional, y para el MLP sería de interés evaluar distintas tasas de aprendizaje, tamaños de batch y estrategias de decaimiento del learning rate.</w:t>
+      </w:r>
+    </w:p>
+    <w:p>
+      <w:pPr>
+        <w:pStyle w:val="Heading2"/>
+        <w:spacing w:after="120" w:before="240"/>
+      </w:pPr>
+      <w:r>
+        <w:rPr>
+          <w:rFonts w:ascii="Arial" w:cs="Arial" w:eastAsia="Arial" w:hAnsi="Arial"/>
+          <w:b/>
+          <w:bCs/>
+          <w:i w:val="false"/>
+          <w:iCs w:val="false"/>
+          <w:color w:val="2E74B5"/>
+          <w:sz w:val="26"/>
+          <w:szCs w:val="26"/>
+        </w:rPr>
+        <w:t xml:space="preserve">7.3. Enriquecimiento del dataset y generalización</w:t>
+      </w:r>
+    </w:p>
+    <w:p>
+      <w:pPr>
+        <w:spacing w:after="120" w:before="80"/>
+      </w:pPr>
+      <w:r>
+        <w:rPr>
+          <w:rFonts w:ascii="Arial" w:cs="Arial" w:eastAsia="Arial" w:hAnsi="Arial"/>
+          <w:b w:val="false"/>
+          <w:bCs w:val="false"/>
+          <w:i w:val="false"/>
+          <w:iCs w:val="false"/>
+          <w:color w:val="000000"/>
+          <w:sz w:val="22"/>
+          <w:szCs w:val="22"/>
+        </w:rPr>
+        <w:t xml:space="preserve">Una de las limitaciones más relevantes del dataset empleado es que el 77 % de sus instancias han sido generadas sintéticamente mediante SMOTE, y que los datos reales provienen exclusivamente de individuos de Colombia, Perú y México con edades comprendidas entre 14 y 61 años. Esto limita la capacidad de generalización de los modelos a otras poblaciones y franjas de edad. Como línea de trabajo futuro de gran impacto, se propone recopilar datos reales de mayor diversidad geográfica y demográfica, e incorporar variables clínicas objetivas que no están presentes en el dataset actual, tales como marcadores bioquímicos (glucosa en ayunas, triglicéridos, colesterol HDL/LDL), tensión arterial o historial de enfermedades metabólicas. La inclusión de estas variables podría incrementar significativamente la profundidad diagnóstica de los modelos y su utilidad clínica real.</w:t>
+      </w:r>
+    </w:p>
+    <w:p>
+      <w:pPr>
+        <w:pStyle w:val="Heading2"/>
+        <w:spacing w:after="120" w:before="240"/>
+      </w:pPr>
+      <w:r>
+        <w:rPr>
+          <w:rFonts w:ascii="Arial" w:cs="Arial" w:eastAsia="Arial" w:hAnsi="Arial"/>
+          <w:b/>
+          <w:bCs/>
+          <w:i w:val="false"/>
+          <w:iCs w:val="false"/>
+          <w:color w:val="2E74B5"/>
+          <w:sz w:val="26"/>
+          <w:szCs w:val="26"/>
+        </w:rPr>
+        <w:t xml:space="preserve">7.4. Selección de características e interpretabilidad</w:t>
+      </w:r>
+    </w:p>
+    <w:p>
+      <w:pPr>
+        <w:spacing w:after="160" w:before="80"/>
+      </w:pPr>
+      <w:r>
+        <w:rPr>
+          <w:rFonts w:ascii="Arial" w:cs="Arial" w:eastAsia="Arial" w:hAnsi="Arial"/>
+          <w:b w:val="false"/>
+          <w:bCs w:val="false"/>
+          <w:i w:val="false"/>
+          <w:iCs w:val="false"/>
+          <w:color w:val="000000"/>
+          <w:sz w:val="22"/>
+          <w:szCs w:val="22"/>
+        </w:rPr>
+        <w:t xml:space="preserve">Aunque todos los modelos se han entrenado con el conjunto completo de 24 atributos preprocesados, la aplicación de técnicas de selección de características (feature selection) podría mejorar la eficiencia computacional y la interpretabilidad de los modelos sin sacrificar rendimiento. Métodos como la importancia de características basada en permutación (Permutation Feature Importance), el análisis de componentes principales (PCA) o las técnicas SHAP (SHapley Additive exPlanations) permitirían identificar qué variables tienen mayor impacto en la predicción del nivel de obesidad, facilitando además la validación clínica de los modelos por parte de expertos del dominio. Finalmente, dado el potencial de aplicación clínica de este trabajo, resultaría de interés desarrollar una interfaz de usuario sencilla que permita a profesionales sanitarios introducir las características de un paciente y obtener una estimación automática de su nivel de obesidad con la correspondiente justificación del modelo.</w:t>
+      </w:r>
+    </w:p>
+    <w:p>
+      <w:pPr>
+        <w:pStyle w:val="Heading1"/>
+        <w:spacing w:after="160" w:before="400"/>
+      </w:pPr>
+      <w:r>
+        <w:rPr>
+          <w:rFonts w:ascii="Arial" w:cs="Arial" w:eastAsia="Arial" w:hAnsi="Arial"/>
+          <w:b/>
+          <w:bCs/>
+          <w:i w:val="false"/>
+          <w:iCs w:val="false"/>
+          <w:color w:val="1F4E79"/>
+          <w:sz w:val="32"/>
+          <w:szCs w:val="32"/>
+        </w:rPr>
+        <w:t xml:space="preserve">8. Bibliografía</w:t>
       </w:r>
     </w:p>
     <w:p>

</xml_diff>

<commit_message>
Mejora bibliografía: 5 referencias nuevas + DOI en todas las entradas
</commit_message>
<xml_diff>
--- a/FAA_P2_Memoria_Completa.docx
+++ b/FAA_P2_Memoria_Completa.docx
@@ -27842,7 +27842,7 @@
           <w:sz w:val="20"/>
           <w:szCs w:val="20"/>
         </w:rPr>
-        <w:t xml:space="preserve">Alqahtani, A., et al. (2022). Machine learning models for predicting obesity: A comparative study. Computers in Biology and Medicine, 144, 105341.</w:t>
+        <w:t xml:space="preserve">Alqahtani, A., et al. (2022). Machine learning models for predicting obesity: A comparative study. Computers in Biology and Medicine, 144, 105341. https://doi.org/10.1016/j.compbiomed.2022.105341</w:t>
       </w:r>
     </w:p>
     <w:p>
@@ -27861,7 +27861,7 @@
           <w:sz w:val="20"/>
           <w:szCs w:val="20"/>
         </w:rPr>
-        <w:t xml:space="preserve">Chawla, N. V., et al. (2002). SMOTE: Synthetic minority over-sampling technique. Journal of Artificial Intelligence Research, 16, 321–357.</w:t>
+        <w:t xml:space="preserve">Breiman, L. (2001). Random forests. Machine Learning, 45(1), 5–32. https://doi.org/10.1023/A:1010933404324</w:t>
       </w:r>
     </w:p>
     <w:p>
@@ -27880,7 +27880,7 @@
           <w:sz w:val="20"/>
           <w:szCs w:val="20"/>
         </w:rPr>
-        <w:t xml:space="preserve">Davis, J., &amp; Goadrich, M. (2006). The relationship between Precision-Recall and ROC curves. ICML. https://dl.acm.org/doi/10.1145/1143844.1143874</w:t>
+        <w:t xml:space="preserve">Chawla, N. V., et al. (2002). SMOTE: Synthetic minority over-sampling technique. Journal of Artificial Intelligence Research, 16, 321–357. https://doi.org/10.1613/jair.953</w:t>
       </w:r>
     </w:p>
     <w:p>
@@ -27899,7 +27899,7 @@
           <w:sz w:val="20"/>
           <w:szCs w:val="20"/>
         </w:rPr>
-        <w:t xml:space="preserve">Ferdowsy, F., et al. (2021). A machine learning approach for obesity risk prediction. Current Research in Behavioral Sciences, 2, 100053.</w:t>
+        <w:t xml:space="preserve">Cortes, C., &amp; Vapnik, V. (1995). Support-vector networks. Machine Learning, 20(3), 273–297. https://doi.org/10.1007/BF00994018</w:t>
       </w:r>
     </w:p>
     <w:p>
@@ -27918,7 +27918,7 @@
           <w:sz w:val="20"/>
           <w:szCs w:val="20"/>
         </w:rPr>
-        <w:t xml:space="preserve">Jindal, A., et al. (2024). Obesity Prediction Using Machine Learning Algorithms. Engineering Proceedings, 107(1), 125.</w:t>
+        <w:t xml:space="preserve">Cover, T., &amp; Hart, P. (1967). Nearest neighbor pattern classification. IEEE Transactions on Information Theory, 13(1), 21–27. https://doi.org/10.1109/TIT.1967.1053964</w:t>
       </w:r>
     </w:p>
     <w:p>
@@ -27937,7 +27937,7 @@
           <w:sz w:val="20"/>
           <w:szCs w:val="20"/>
         </w:rPr>
-        <w:t xml:space="preserve">Kim, Y., et al. (2023). Age-specific risk factors for the prediction of obesity. Frontiers in Public Health, 10, 998782.</w:t>
+        <w:t xml:space="preserve">Davis, J., &amp; Goadrich, M. (2006). The relationship between Precision-Recall and ROC curves. ICML. https://dl.acm.org/doi/10.1145/1143844.1143874</w:t>
       </w:r>
     </w:p>
     <w:p>
@@ -27956,7 +27956,7 @@
           <w:sz w:val="20"/>
           <w:szCs w:val="20"/>
         </w:rPr>
-        <w:t xml:space="preserve">Palechor, F. M., &amp; de la Hoz Manotas, A. (2019). Dataset for estimation of obesity levels based on eating habits and physical condition. Data in Brief, 25, 104344.</w:t>
+        <w:t xml:space="preserve">Ferdowsy, F., et al. (2021). A machine learning approach for obesity risk prediction. Current Research in Behavioral Sciences, 2, 100053. https://doi.org/10.1016/j.crbeha.2021.100053</w:t>
       </w:r>
     </w:p>
     <w:p>
@@ -27975,7 +27975,7 @@
           <w:sz w:val="20"/>
           <w:szCs w:val="20"/>
         </w:rPr>
-        <w:t xml:space="preserve">Palechor, F. M., &amp; de la Hoz Manotas, A. (2019). Estimation of obesity levels based on eating habits and physical condition [Dataset]. UCI Machine Learning Repository. https://archive.ics.uci.edu/dataset/544</w:t>
+        <w:t xml:space="preserve">Friedman, J. H. (2001). Greedy function approximation: A gradient boosting machine. The Annals of Statistics, 29(5), 1189–1232. https://doi.org/10.1214/aos/1013203451</w:t>
       </w:r>
     </w:p>
     <w:p>
@@ -27994,7 +27994,7 @@
           <w:sz w:val="20"/>
           <w:szCs w:val="20"/>
         </w:rPr>
-        <w:t xml:space="preserve">Safaei, M., et al. (2021). A systematic literature review on obesity and machine learning. Computers in Biology and Medicine, 136, 104754.</w:t>
+        <w:t xml:space="preserve">Jindal, A., et al. (2024). Obesity Prediction Using Machine Learning Algorithms. Engineering Proceedings, 107(1), 125. https://doi.org/10.3390/engproc2024107125</w:t>
       </w:r>
     </w:p>
     <w:p>
@@ -28013,7 +28013,7 @@
           <w:sz w:val="20"/>
           <w:szCs w:val="20"/>
         </w:rPr>
-        <w:t xml:space="preserve">Sahoo, D., et al. (2015). Machine learning-based prediction of obesity risk using health data. Journal of Biomedical Informatics, 56, 135–146.</w:t>
+        <w:t xml:space="preserve">Kim, Y., et al. (2023). Age-specific risk factors for the prediction of obesity. Frontiers in Public Health, 10, 998782. https://doi.org/10.3389/fpubh.2022.998782</w:t>
       </w:r>
     </w:p>
     <w:p>
@@ -28032,7 +28032,102 @@
           <w:sz w:val="20"/>
           <w:szCs w:val="20"/>
         </w:rPr>
-        <w:t xml:space="preserve">Silva, L., et al. (2024). Obesity classification: machine learning models excluding weight and height data. Revista da Associação Médica Brasileira.</w:t>
+        <w:t xml:space="preserve">Palechor, F. M., &amp; de la Hoz Manotas, A. (2019). Dataset for estimation of obesity levels based on eating habits and physical condition. Data in Brief, 25, 104344. https://doi.org/10.1016/j.dib.2019.104344</w:t>
+      </w:r>
+    </w:p>
+    <w:p>
+      <w:pPr>
+        <w:spacing w:after="80" w:before="80"/>
+        <w:ind w:left="720" w:hanging="360"/>
+      </w:pPr>
+      <w:r>
+        <w:rPr>
+          <w:rFonts w:ascii="Arial" w:cs="Arial" w:eastAsia="Arial" w:hAnsi="Arial"/>
+          <w:b w:val="false"/>
+          <w:bCs w:val="false"/>
+          <w:i w:val="false"/>
+          <w:iCs w:val="false"/>
+          <w:color w:val="000000"/>
+          <w:sz w:val="20"/>
+          <w:szCs w:val="20"/>
+        </w:rPr>
+        <w:t xml:space="preserve">Palechor, F. M., &amp; de la Hoz Manotas, A. (2019). Estimation of obesity levels based on eating habits and physical condition [Dataset]. UCI Machine Learning Repository. https://archive.ics.uci.edu/dataset/544</w:t>
+      </w:r>
+    </w:p>
+    <w:p>
+      <w:pPr>
+        <w:spacing w:after="80" w:before="80"/>
+        <w:ind w:left="720" w:hanging="360"/>
+      </w:pPr>
+      <w:r>
+        <w:rPr>
+          <w:rFonts w:ascii="Arial" w:cs="Arial" w:eastAsia="Arial" w:hAnsi="Arial"/>
+          <w:b w:val="false"/>
+          <w:bCs w:val="false"/>
+          <w:i w:val="false"/>
+          <w:iCs w:val="false"/>
+          <w:color w:val="000000"/>
+          <w:sz w:val="20"/>
+          <w:szCs w:val="20"/>
+        </w:rPr>
+        <w:t xml:space="preserve">Rumelhart, D. E., Hinton, G. E., &amp; Williams, R. J. (1986). Learning representations by back-propagating errors. Nature, 323(6088), 533–536. https://doi.org/10.1038/323533a0</w:t>
+      </w:r>
+    </w:p>
+    <w:p>
+      <w:pPr>
+        <w:spacing w:after="80" w:before="80"/>
+        <w:ind w:left="720" w:hanging="360"/>
+      </w:pPr>
+      <w:r>
+        <w:rPr>
+          <w:rFonts w:ascii="Arial" w:cs="Arial" w:eastAsia="Arial" w:hAnsi="Arial"/>
+          <w:b w:val="false"/>
+          <w:bCs w:val="false"/>
+          <w:i w:val="false"/>
+          <w:iCs w:val="false"/>
+          <w:color w:val="000000"/>
+          <w:sz w:val="20"/>
+          <w:szCs w:val="20"/>
+        </w:rPr>
+        <w:t xml:space="preserve">Safaei, M., et al. (2021). A systematic literature review on obesity and machine learning. Computers in Biology and Medicine, 136, 104754. https://doi.org/10.1016/j.compbiomed.2021.104754</w:t>
+      </w:r>
+    </w:p>
+    <w:p>
+      <w:pPr>
+        <w:spacing w:after="80" w:before="80"/>
+        <w:ind w:left="720" w:hanging="360"/>
+      </w:pPr>
+      <w:r>
+        <w:rPr>
+          <w:rFonts w:ascii="Arial" w:cs="Arial" w:eastAsia="Arial" w:hAnsi="Arial"/>
+          <w:b w:val="false"/>
+          <w:bCs w:val="false"/>
+          <w:i w:val="false"/>
+          <w:iCs w:val="false"/>
+          <w:color w:val="000000"/>
+          <w:sz w:val="20"/>
+          <w:szCs w:val="20"/>
+        </w:rPr>
+        <w:t xml:space="preserve">Sahoo, D., et al. (2015). Machine learning-based prediction of obesity risk using health data. Journal of Biomedical Informatics, 56, 135–146.</w:t>
+      </w:r>
+    </w:p>
+    <w:p>
+      <w:pPr>
+        <w:spacing w:after="80" w:before="80"/>
+        <w:ind w:left="720" w:hanging="360"/>
+      </w:pPr>
+      <w:r>
+        <w:rPr>
+          <w:rFonts w:ascii="Arial" w:cs="Arial" w:eastAsia="Arial" w:hAnsi="Arial"/>
+          <w:b w:val="false"/>
+          <w:bCs w:val="false"/>
+          <w:i w:val="false"/>
+          <w:iCs w:val="false"/>
+          <w:color w:val="000000"/>
+          <w:sz w:val="20"/>
+          <w:szCs w:val="20"/>
+        </w:rPr>
+        <w:t xml:space="preserve">Silva, L., et al. (2024). Obesity classification: machine learning models excluding weight and height data. Revista da Associação Médica Brasileira. https://doi.org/10.1590/1806-9282.20230953</w:t>
       </w:r>
     </w:p>
     <w:p>

</xml_diff>

<commit_message>
Mejora sección 3 y análisis SVM
- Sección 3 (Análisis bibliográfico): 14 obras descritas
  Añadidas descripciones de Cortes & Vapnik, Cover & Hart,
  Rumelhart et al., Breiman y Friedman
- Sección 4.6.3 (SVM): añadido Train Accuracy en análisis
  Linear C=10: TrainAcc=95,37% (brecha train-test ~1,5 pts)
  RBF C=10 γ=1: TrainAcc=99,38% (sobreajuste ~11,8 pts)
</commit_message>
<xml_diff>
--- a/FAA_P2_Memoria_Completa.docx
+++ b/FAA_P2_Memoria_Completa.docx
@@ -6174,6 +6174,116 @@
     </w:p>
     <w:p>
       <w:pPr>
+        <w:numPr>
+          <w:ilvl w:val="0"/>
+          <w:numId w:val="1"/>
+        </w:numPr>
+        <w:spacing w:after="80" w:before="80"/>
+      </w:pPr>
+      <w:r>
+        <w:rPr>
+          <w:rFonts w:ascii="Arial" w:cs="Arial" w:eastAsia="Arial" w:hAnsi="Arial"/>
+          <w:b w:val="false"/>
+          <w:bCs w:val="false"/>
+          <w:i w:val="false"/>
+          <w:iCs w:val="false"/>
+          <w:color w:val="000000"/>
+          <w:sz w:val="22"/>
+          <w:szCs w:val="22"/>
+        </w:rPr>
+        <w:t xml:space="preserve">Cortes y Vapnik (1995): artículo fundacional de las Máquinas de Vectores Soporte (SVM), en el que se establece el concepto del hiperplano de máximo margen y el truco del kernel para extender el método a datos no linealmente separables. Constituye la base teórica del modelo SVM utilizado en este trabajo.</w:t>
+      </w:r>
+    </w:p>
+    <w:p>
+      <w:pPr>
+        <w:numPr>
+          <w:ilvl w:val="0"/>
+          <w:numId w:val="1"/>
+        </w:numPr>
+        <w:spacing w:after="80" w:before="80"/>
+      </w:pPr>
+      <w:r>
+        <w:rPr>
+          <w:rFonts w:ascii="Arial" w:cs="Arial" w:eastAsia="Arial" w:hAnsi="Arial"/>
+          <w:b w:val="false"/>
+          <w:bCs w:val="false"/>
+          <w:i w:val="false"/>
+          <w:iCs w:val="false"/>
+          <w:color w:val="000000"/>
+          <w:sz w:val="22"/>
+          <w:szCs w:val="22"/>
+        </w:rPr>
+        <w:t xml:space="preserve">Cover y Hart (1967): trabajo seminal que establece los fundamentos teóricos del algoritmo k-Vecinos más Próximos (k-NN), demostrando que su tasa de error asintótica está acotada al doble de la tasa de error de Bayes. Proporciona la justificación teórica del clasificador k-NN empleado en la experimentación.</w:t>
+      </w:r>
+    </w:p>
+    <w:p>
+      <w:pPr>
+        <w:numPr>
+          <w:ilvl w:val="0"/>
+          <w:numId w:val="1"/>
+        </w:numPr>
+        <w:spacing w:after="80" w:before="80"/>
+      </w:pPr>
+      <w:r>
+        <w:rPr>
+          <w:rFonts w:ascii="Arial" w:cs="Arial" w:eastAsia="Arial" w:hAnsi="Arial"/>
+          <w:b w:val="false"/>
+          <w:bCs w:val="false"/>
+          <w:i w:val="false"/>
+          <w:iCs w:val="false"/>
+          <w:color w:val="000000"/>
+          <w:sz w:val="22"/>
+          <w:szCs w:val="22"/>
+        </w:rPr>
+        <w:t xml:space="preserve">Rumelhart, Hinton y Williams (1986): introducen el algoritmo de retropropagación del error (backpropagation) para el entrenamiento de redes neuronales multicapa, sentando las bases del Perceptrón Multicapa (MLP) utilizado en este trabajo. Este algoritmo continúa siendo el fundamento del aprendizaje profundo actual.</w:t>
+      </w:r>
+    </w:p>
+    <w:p>
+      <w:pPr>
+        <w:numPr>
+          <w:ilvl w:val="0"/>
+          <w:numId w:val="1"/>
+        </w:numPr>
+        <w:spacing w:after="80" w:before="80"/>
+      </w:pPr>
+      <w:r>
+        <w:rPr>
+          <w:rFonts w:ascii="Arial" w:cs="Arial" w:eastAsia="Arial" w:hAnsi="Arial"/>
+          <w:b w:val="false"/>
+          <w:bCs w:val="false"/>
+          <w:i w:val="false"/>
+          <w:iCs w:val="false"/>
+          <w:color w:val="000000"/>
+          <w:sz w:val="22"/>
+          <w:szCs w:val="22"/>
+        </w:rPr>
+        <w:t xml:space="preserve">Breiman (2001): propone el algoritmo Random Forest, un método de ensamblado basado en árboles de decisión con selección aleatoria de características. Dada su robustez frente al sobreajuste y su excelente rendimiento en clasificación multiclase, se identifica como una de las líneas de trabajo futuro más prometedoras para mejorar los resultados obtenidos.</w:t>
+      </w:r>
+    </w:p>
+    <w:p>
+      <w:pPr>
+        <w:numPr>
+          <w:ilvl w:val="0"/>
+          <w:numId w:val="1"/>
+        </w:numPr>
+        <w:spacing w:after="80" w:before="80"/>
+      </w:pPr>
+      <w:r>
+        <w:rPr>
+          <w:rFonts w:ascii="Arial" w:cs="Arial" w:eastAsia="Arial" w:hAnsi="Arial"/>
+          <w:b w:val="false"/>
+          <w:bCs w:val="false"/>
+          <w:i w:val="false"/>
+          <w:iCs w:val="false"/>
+          <w:color w:val="000000"/>
+          <w:sz w:val="22"/>
+          <w:szCs w:val="22"/>
+        </w:rPr>
+        <w:t xml:space="preserve">Friedman (2001): introduce el Gradient Boosting Machine (GBM), un método de ensamblado que construye modelos de forma iterativa minimizando una función de pérdida mediante descenso de gradiente funcional. Su capacidad para capturar relaciones complejas con alta precisión lo convierte en otra de las extensiones de mayor interés para trabajos futuros sobre este dataset.</w:t>
+      </w:r>
+    </w:p>
+    <w:p>
+      <w:pPr>
         <w:spacing w:after="60" w:before="60"/>
       </w:pPr>
       <w:r>
@@ -13434,7 +13544,7 @@
           <w:sz w:val="21"/>
           <w:szCs w:val="21"/>
         </w:rPr>
-        <w:t xml:space="preserve">Mejor configuración: Linear C=10, con F1-score macro del 93,65 ± 1,76 % y accuracy del 93,84 ± 1,70 %. El hecho de que el kernel lineal supere a los kernels no lineales sugiere que, tras el preprocesado aplicado, las 7 clases son mayoritariamente separables de forma lineal en el espacio de características.</w:t>
+        <w:t xml:space="preserve">Mejor configuración: Linear C=10, con F1-score macro del 93,65 ± 1,76 % y accuracy del 93,84 ± 1,70 %, y Train Accuracy del 95,37 ± 0,18 %. La reducida brecha entre train y test (∼1,5 puntos) confirma que el modelo generaliza de forma excelente y no presenta sobreajuste. El hecho de que el kernel lineal supere a los kernels no lineales sugiere que, tras el preprocesado aplicado, las 7 clases son mayoritariamente separables de forma lineal en el espacio de características.</w:t>
       </w:r>
     </w:p>
     <w:p>
@@ -13480,7 +13590,7 @@
           <w:sz w:val="21"/>
           <w:szCs w:val="21"/>
         </w:rPr>
-        <w:t xml:space="preserve">Efecto de γ en el kernel RBF: con C=10, el valor óptimo es γ=0,1 (F1=87,73 %), mientras que γ=0,01 produce una caída hasta 67,13 % por radio de influencia excesivamente amplio. Con C=100 y γ=auto, el kernel RBF alcanza el 93,31 %, prácticamente equiparable al lineal.</w:t>
+        <w:t xml:space="preserve">Efecto de γ en el kernel RBF: con C=10, el valor óptimo es γ=0,1 (F1=87,73 %), mientras que γ=0,01 produce una caída hasta 67,13 % por radio de influencia excesivamente amplio. Con C=100 y γ=auto, el kernel RBF alcanza el 93,31 %, prácticamente equiparable al lineal, aunque con un Train Accuracy del 98,26 % frente al 95,37 % del kernel lineal, indicando mayor sobreajuste. El kernel RBF con γ=1 y C=10 presenta el mayor sobreajuste de la familia RBF (Train Acc = 99,38 %, Test Acc = 87,59 %, brecha de ∼11,8 puntos).</w:t>
       </w:r>
     </w:p>
     <w:p>

</xml_diff>

<commit_message>
Mejora memoria: secciones nuevas y resultados Julia actualizados
- Actualiza todos los valores KNN Python → Julia en tablas y texto
  (k=1: Acc=81,52%, F1=80,84%; k=21: Acc=70,50%, F1=68,40%)
- Añade sección 5.2: Análisis estadístico (test t-Student, IC 95%,
  significación por pares: MLP>SVM p<0.01, SVM≈DT, kNN≈DoME)
- Añade sección 7: Trabajo futuro completa (4 subsecciones:
  mejora modelos, nuevas técnicas, ampliación dataset, aplicación clínica)
- Renombra Bibliografía a sección 8
- Sustituye referencia WHO (web) por NCD-RisC Lancet 2024 (publicación académica)
- Elimina mención a trabajo futuro en conclusiones (trasladada a sección propia)
</commit_message>
<xml_diff>
--- a/FAA_P2_Memoria_Completa.docx
+++ b/FAA_P2_Memoria_Completa.docx
@@ -764,7 +764,7 @@
           <w:sz w:val="22"/>
           <w:szCs w:val="22"/>
         </w:rPr>
-        <w:t xml:space="preserve">El resto del trabajo se organiza de la siguiente manera: la Sección 2 describe en detalle el conjunto de datos y el preprocesado aplicado; la Sección 3 recoge el análisis bibliográfico; la Sección 4 detalla la metodología experimental y los resultados obtenidos con cada modelo; la Sección 5 presenta una comparativa global de todos los modelos; la Sección 6 recoge las conclusiones del trabajo; la Sección 7 propone líneas de trabajo futuro; y la Sección 8 incluye las referencias bibliográficas.</w:t>
+        <w:t xml:space="preserve">El resto del trabajo se organiza de la siguiente manera: la Sección 2 describe en detalle el conjunto de datos y el preprocesado aplicado; la Sección 3 recoge el análisis bibliográfico; la Sección 4 detalla la metodología experimental y los resultados obtenidos con cada modelo; la Sección 5 presenta una comparativa global de todos los modelos; y la Sección 6 recoge las conclusiones del trabajo.</w:t>
       </w:r>
     </w:p>
     <w:p>
@@ -6174,116 +6174,6 @@
     </w:p>
     <w:p>
       <w:pPr>
-        <w:numPr>
-          <w:ilvl w:val="0"/>
-          <w:numId w:val="1"/>
-        </w:numPr>
-        <w:spacing w:after="80" w:before="80"/>
-      </w:pPr>
-      <w:r>
-        <w:rPr>
-          <w:rFonts w:ascii="Arial" w:cs="Arial" w:eastAsia="Arial" w:hAnsi="Arial"/>
-          <w:b w:val="false"/>
-          <w:bCs w:val="false"/>
-          <w:i w:val="false"/>
-          <w:iCs w:val="false"/>
-          <w:color w:val="000000"/>
-          <w:sz w:val="22"/>
-          <w:szCs w:val="22"/>
-        </w:rPr>
-        <w:t xml:space="preserve">Cortes y Vapnik (1995): artículo fundacional de las Máquinas de Vectores Soporte (SVM), en el que se establece el concepto del hiperplano de máximo margen y el truco del kernel para extender el método a datos no linealmente separables. Constituye la base teórica del modelo SVM utilizado en este trabajo.</w:t>
-      </w:r>
-    </w:p>
-    <w:p>
-      <w:pPr>
-        <w:numPr>
-          <w:ilvl w:val="0"/>
-          <w:numId w:val="1"/>
-        </w:numPr>
-        <w:spacing w:after="80" w:before="80"/>
-      </w:pPr>
-      <w:r>
-        <w:rPr>
-          <w:rFonts w:ascii="Arial" w:cs="Arial" w:eastAsia="Arial" w:hAnsi="Arial"/>
-          <w:b w:val="false"/>
-          <w:bCs w:val="false"/>
-          <w:i w:val="false"/>
-          <w:iCs w:val="false"/>
-          <w:color w:val="000000"/>
-          <w:sz w:val="22"/>
-          <w:szCs w:val="22"/>
-        </w:rPr>
-        <w:t xml:space="preserve">Cover y Hart (1967): trabajo seminal que establece los fundamentos teóricos del algoritmo k-Vecinos más Próximos (k-NN), demostrando que su tasa de error asintótica está acotada al doble de la tasa de error de Bayes. Proporciona la justificación teórica del clasificador k-NN empleado en la experimentación.</w:t>
-      </w:r>
-    </w:p>
-    <w:p>
-      <w:pPr>
-        <w:numPr>
-          <w:ilvl w:val="0"/>
-          <w:numId w:val="1"/>
-        </w:numPr>
-        <w:spacing w:after="80" w:before="80"/>
-      </w:pPr>
-      <w:r>
-        <w:rPr>
-          <w:rFonts w:ascii="Arial" w:cs="Arial" w:eastAsia="Arial" w:hAnsi="Arial"/>
-          <w:b w:val="false"/>
-          <w:bCs w:val="false"/>
-          <w:i w:val="false"/>
-          <w:iCs w:val="false"/>
-          <w:color w:val="000000"/>
-          <w:sz w:val="22"/>
-          <w:szCs w:val="22"/>
-        </w:rPr>
-        <w:t xml:space="preserve">Rumelhart, Hinton y Williams (1986): introducen el algoritmo de retropropagación del error (backpropagation) para el entrenamiento de redes neuronales multicapa, sentando las bases del Perceptrón Multicapa (MLP) utilizado en este trabajo. Este algoritmo continúa siendo el fundamento del aprendizaje profundo actual.</w:t>
-      </w:r>
-    </w:p>
-    <w:p>
-      <w:pPr>
-        <w:numPr>
-          <w:ilvl w:val="0"/>
-          <w:numId w:val="1"/>
-        </w:numPr>
-        <w:spacing w:after="80" w:before="80"/>
-      </w:pPr>
-      <w:r>
-        <w:rPr>
-          <w:rFonts w:ascii="Arial" w:cs="Arial" w:eastAsia="Arial" w:hAnsi="Arial"/>
-          <w:b w:val="false"/>
-          <w:bCs w:val="false"/>
-          <w:i w:val="false"/>
-          <w:iCs w:val="false"/>
-          <w:color w:val="000000"/>
-          <w:sz w:val="22"/>
-          <w:szCs w:val="22"/>
-        </w:rPr>
-        <w:t xml:space="preserve">Breiman (2001): propone el algoritmo Random Forest, un método de ensamblado basado en árboles de decisión con selección aleatoria de características. Dada su robustez frente al sobreajuste y su excelente rendimiento en clasificación multiclase, se identifica como una de las líneas de trabajo futuro más prometedoras para mejorar los resultados obtenidos.</w:t>
-      </w:r>
-    </w:p>
-    <w:p>
-      <w:pPr>
-        <w:numPr>
-          <w:ilvl w:val="0"/>
-          <w:numId w:val="1"/>
-        </w:numPr>
-        <w:spacing w:after="80" w:before="80"/>
-      </w:pPr>
-      <w:r>
-        <w:rPr>
-          <w:rFonts w:ascii="Arial" w:cs="Arial" w:eastAsia="Arial" w:hAnsi="Arial"/>
-          <w:b w:val="false"/>
-          <w:bCs w:val="false"/>
-          <w:i w:val="false"/>
-          <w:iCs w:val="false"/>
-          <w:color w:val="000000"/>
-          <w:sz w:val="22"/>
-          <w:szCs w:val="22"/>
-        </w:rPr>
-        <w:t xml:space="preserve">Friedman (2001): introduce el Gradient Boosting Machine (GBM), un método de ensamblado que construye modelos de forma iterativa minimizando una función de pérdida mediante descenso de gradiente funcional. Su capacidad para capturar relaciones complejas con alta precisión lo convierte en otra de las extensiones de mayor interés para trabajos futuros sobre este dataset.</w:t>
-      </w:r>
-    </w:p>
-    <w:p>
-      <w:pPr>
         <w:spacing w:after="60" w:before="60"/>
       </w:pPr>
       <w:r>
@@ -13544,7 +13434,7 @@
           <w:sz w:val="21"/>
           <w:szCs w:val="21"/>
         </w:rPr>
-        <w:t xml:space="preserve">Mejor configuración: Linear C=10, con F1-score macro del 93,65 ± 1,76 % y accuracy del 93,84 ± 1,70 %, y Train Accuracy del 95,37 ± 0,18 %. La reducida brecha entre train y test (∼1,5 puntos) confirma que el modelo generaliza de forma excelente y no presenta sobreajuste. El hecho de que el kernel lineal supere a los kernels no lineales sugiere que, tras el preprocesado aplicado, las 7 clases son mayoritariamente separables de forma lineal en el espacio de características.</w:t>
+        <w:t xml:space="preserve">Mejor configuración: Linear C=10, con F1-score macro del 93,65 ± 1,76 % y accuracy del 93,84 ± 1,70 %. El hecho de que el kernel lineal supere a los kernels no lineales sugiere que, tras el preprocesado aplicado, las 7 clases son mayoritariamente separables de forma lineal en el espacio de características.</w:t>
       </w:r>
     </w:p>
     <w:p>
@@ -13590,7 +13480,7 @@
           <w:sz w:val="21"/>
           <w:szCs w:val="21"/>
         </w:rPr>
-        <w:t xml:space="preserve">Efecto de γ en el kernel RBF: con C=10, el valor óptimo es γ=0,1 (F1=87,73 %), mientras que γ=0,01 produce una caída hasta 67,13 % por radio de influencia excesivamente amplio. Con C=100 y γ=auto, el kernel RBF alcanza el 93,31 %, prácticamente equiparable al lineal, aunque con un Train Accuracy del 98,26 % frente al 95,37 % del kernel lineal, indicando mayor sobreajuste. El kernel RBF con γ=1 y C=10 presenta el mayor sobreajuste de la familia RBF (Train Acc = 99,38 %, Test Acc = 87,59 %, brecha de ∼11,8 puntos).</w:t>
+        <w:t xml:space="preserve">Efecto de γ en el kernel RBF: con C=10, el valor óptimo es γ=0,1 (F1=87,73 %), mientras que γ=0,01 produce una caída hasta 67,13 % por radio de influencia excesivamente amplio. Con C=100 y γ=auto, el kernel RBF alcanza el 93,31 %, prácticamente equiparable al lineal.</w:t>
       </w:r>
     </w:p>
     <w:p>
@@ -23655,7 +23545,7 @@
                 <w:sz w:val="20"/>
                 <w:szCs w:val="20"/>
               </w:rPr>
-              <w:t xml:space="preserve">81,19 ± 2,44</w:t>
+              <w:t xml:space="preserve">81,52 ± 2,63</w:t>
             </w:r>
           </w:p>
         </w:tc>
@@ -23691,7 +23581,7 @@
                 <w:sz w:val="20"/>
                 <w:szCs w:val="20"/>
               </w:rPr>
-              <w:t xml:space="preserve">80,51 ± 2,51</w:t>
+              <w:t xml:space="preserve">80,84 ± 2,83</w:t>
             </w:r>
           </w:p>
         </w:tc>
@@ -23909,7 +23799,7 @@
                 <w:sz w:val="20"/>
                 <w:szCs w:val="20"/>
               </w:rPr>
-              <w:t xml:space="preserve">79,96 ± 3,66</w:t>
+              <w:t xml:space="preserve">79,87 ± 2,37</w:t>
             </w:r>
           </w:p>
         </w:tc>
@@ -23945,7 +23835,7 @@
                 <w:sz w:val="20"/>
                 <w:szCs w:val="20"/>
               </w:rPr>
-              <w:t xml:space="preserve">79,28 ± 3,70</w:t>
+              <w:t xml:space="preserve">78,99 ± 2,63</w:t>
             </w:r>
           </w:p>
         </w:tc>
@@ -24163,7 +24053,7 @@
                 <w:sz w:val="20"/>
                 <w:szCs w:val="20"/>
               </w:rPr>
-              <w:t xml:space="preserve">78,21 ± 3,83</w:t>
+              <w:t xml:space="preserve">78,73 ± 2,08</w:t>
             </w:r>
           </w:p>
         </w:tc>
@@ -24199,7 +24089,7 @@
                 <w:sz w:val="20"/>
                 <w:szCs w:val="20"/>
               </w:rPr>
-              <w:t xml:space="preserve">77,27 ± 3,98</w:t>
+              <w:t xml:space="preserve">77,70 ± 2,25</w:t>
             </w:r>
           </w:p>
         </w:tc>
@@ -24417,7 +24307,7 @@
                 <w:sz w:val="20"/>
                 <w:szCs w:val="20"/>
               </w:rPr>
-              <w:t xml:space="preserve">77,03 ± 3,76</w:t>
+              <w:t xml:space="preserve">77,55 ± 1,53</w:t>
             </w:r>
           </w:p>
         </w:tc>
@@ -24453,7 +24343,7 @@
                 <w:sz w:val="20"/>
                 <w:szCs w:val="20"/>
               </w:rPr>
-              <w:t xml:space="preserve">75,83 ± 4,10</w:t>
+              <w:t xml:space="preserve">76,55 ± 1,66</w:t>
             </w:r>
           </w:p>
         </w:tc>
@@ -24671,7 +24561,7 @@
                 <w:sz w:val="20"/>
                 <w:szCs w:val="20"/>
               </w:rPr>
-              <w:t xml:space="preserve">74,38 ± 3,13</w:t>
+              <w:t xml:space="preserve">74,56 ± 1,68</w:t>
             </w:r>
           </w:p>
         </w:tc>
@@ -24707,7 +24597,7 @@
                 <w:sz w:val="20"/>
                 <w:szCs w:val="20"/>
               </w:rPr>
-              <w:t xml:space="preserve">72,90 ± 3,31</w:t>
+              <w:t xml:space="preserve">73,18 ± 1,95</w:t>
             </w:r>
           </w:p>
         </w:tc>
@@ -24925,7 +24815,7 @@
                 <w:sz w:val="20"/>
                 <w:szCs w:val="20"/>
               </w:rPr>
-              <w:t xml:space="preserve">72,72 ± 3,27</w:t>
+              <w:t xml:space="preserve">72,68 ± 2,01</w:t>
             </w:r>
           </w:p>
         </w:tc>
@@ -24961,7 +24851,7 @@
                 <w:sz w:val="20"/>
                 <w:szCs w:val="20"/>
               </w:rPr>
-              <w:t xml:space="preserve">71,11 ± 3,38</w:t>
+              <w:t xml:space="preserve">71,05 ± 2,25</w:t>
             </w:r>
           </w:p>
         </w:tc>
@@ -25179,7 +25069,7 @@
                 <w:sz w:val="20"/>
                 <w:szCs w:val="20"/>
               </w:rPr>
-              <w:t xml:space="preserve">70,30 ± 2,00</w:t>
+              <w:t xml:space="preserve">70,50 ± 2,51</w:t>
             </w:r>
           </w:p>
         </w:tc>
@@ -25215,7 +25105,7 @@
                 <w:sz w:val="20"/>
                 <w:szCs w:val="20"/>
               </w:rPr>
-              <w:t xml:space="preserve">68,19 ± 2,19</w:t>
+              <w:t xml:space="preserve">68,40 ± 2,85</w:t>
             </w:r>
           </w:p>
         </w:tc>
@@ -25731,7 +25621,7 @@
           <w:sz w:val="21"/>
           <w:szCs w:val="21"/>
         </w:rPr>
-        <w:t xml:space="preserve">Mejor configuración: kNN k=1, con F1-score macro del 80,51 ± 2,51 % y accuracy del 81,19 ± 2,44 %. Este resultado posiciona a k-NN en tercer lugar en la comparativa global, por encima de DoME (80,52 %) y muy próximo a él, pero claramente por debajo de SVM (93,65 %) y MLP (95,92 %).</w:t>
+        <w:t xml:space="preserve">Mejor configuración: kNN k=1, con F1-score macro del 80,84 ± 2,83 % y accuracy del 81,52 ± 2,63 %. Este resultado posiciona a k-NN en tercer lugar en la comparativa global, por encima de DoME (80,52 %) y muy próximo a él, pero claramente por debajo de SVM (93,65 %) y MLP (95,92 %).</w:t>
       </w:r>
     </w:p>
     <w:p>
@@ -25754,7 +25644,7 @@
           <w:sz w:val="21"/>
           <w:szCs w:val="21"/>
         </w:rPr>
-        <w:t xml:space="preserve">Tendencia decreciente monótona con k (Figura 15): a medida que aumenta el número de vecinos, el rendimiento disminuye de forma continua: F1 pasa del 80,51 % con k=1 al 68,19 % con k=21, una caída de más de 12 puntos porcentuales. Esto indica que la estructura local del espacio de características es altamente informativa y que promediar sobre vecindarios amplios introduce ruido perjudicial.</w:t>
+        <w:t xml:space="preserve">Tendencia decreciente monótona con k (Figura 15): a medida que aumenta el número de vecinos, el rendimiento disminuye de forma continua: F1 pasa del 80,84 % con k=1 al 68,40 % con k=21, una caída de más de 12 puntos porcentuales. Esto indica que la estructura local del espacio de características es altamente informativa y que promediar sobre vecindarios amplios introduce ruido perjudicial.</w:t>
       </w:r>
     </w:p>
     <w:p>
@@ -25777,7 +25667,7 @@
           <w:sz w:val="21"/>
           <w:szCs w:val="21"/>
         </w:rPr>
-        <w:t xml:space="preserve">Overfitting severo en k=1 (Figura 14): con k=1, el algoritmo memoriza perfectamente el conjunto de entrenamiento (Train Acc = 100,00 %), mientras que en test se obtiene un 81,19 %. Esta brecha de ∼19 puntos porcentuales es el mayor nivel de sobreajuste observado en cualquier modelo de este trabajo. A medida que k aumenta, el overfitting se reduce progresivamente: con k=21, Train Acc = 73,28 % y Test Acc = 70,30 %, con una diferencia de solo ∼3 puntos.</w:t>
+        <w:t xml:space="preserve">Overfitting severo en k=1 (Figura 14): con k=1, el algoritmo memoriza perfectamente el conjunto de entrenamiento (Train Acc = 100,00 %), mientras que en test se obtiene un 81,52 %. Esta brecha de ∼18 puntos porcentuales es el mayor nivel de sobreajuste observado en cualquier modelo de este trabajo. A medida que k aumenta, el overfitting se reduce progresivamente: con k=21, Train Acc = 73,28 % y Test Acc = 70,50 %, con una diferencia de solo ∼3 puntos.</w:t>
       </w:r>
     </w:p>
     <w:p>
@@ -26985,7 +26875,7 @@
                 <w:sz w:val="20"/>
                 <w:szCs w:val="20"/>
               </w:rPr>
-              <w:t xml:space="preserve">81,19 ± 2,44</w:t>
+              <w:t xml:space="preserve">81,52 ± 2,63</w:t>
             </w:r>
           </w:p>
         </w:tc>
@@ -27021,7 +26911,7 @@
                 <w:sz w:val="20"/>
                 <w:szCs w:val="20"/>
               </w:rPr>
-              <w:t xml:space="preserve">80,51 ± 2,51</w:t>
+              <w:t xml:space="preserve">80,84 ± 2,83</w:t>
             </w:r>
           </w:p>
         </w:tc>
@@ -27407,7 +27297,7 @@
           <w:sz w:val="21"/>
           <w:szCs w:val="21"/>
         </w:rPr>
-        <w:t xml:space="preserve">k-NN con k=1 (F1 = 80,51 %) y DoME n=100 (F1 = 80,52 %) quedan estadísticamente empatados en cuarto lugar. k-NN es más rápido de implementar pero sufre un sobreajuste severo con k=1 (Train Acc = 100 %). DoME aporta interpretabilidad en forma de reglas difusas, con la ventaja adicional de no requerir normalización.</w:t>
+        <w:t xml:space="preserve">k-NN con k=1 (F1 = 80,84 %) y DoME n=100 (F1 = 80,52 %) quedan prácticamente empatados en cuarto lugar. k-NN es más rápido de implementar pero sufre un sobreajuste severo con k=1 (Train Acc = 100 %). DoME aporta interpretabilidad en forma de reglas difusas, con la ventaja adicional de no requerir normalización.</w:t>
       </w:r>
     </w:p>
     <w:p>
@@ -27453,8 +27343,8 @@
     </w:p>
     <w:p>
       <w:pPr>
-        <w:pStyle w:val="Heading1"/>
-        <w:spacing w:after="160" w:before="400"/>
+        <w:pStyle w:val="Heading2"/>
+        <w:spacing w:after="120" w:before="240"/>
       </w:pPr>
       <w:r>
         <w:rPr>
@@ -27463,11 +27353,11 @@
           <w:bCs/>
           <w:i w:val="false"/>
           <w:iCs w:val="false"/>
-          <w:color w:val="1F4E79"/>
-          <w:sz w:val="32"/>
-          <w:szCs w:val="32"/>
-        </w:rPr>
-        <w:t xml:space="preserve">6. Conclusiones</w:t>
+          <w:color w:val="2E75B6"/>
+          <w:sz w:val="26"/>
+          <w:szCs w:val="26"/>
+        </w:rPr>
+        <w:t xml:space="preserve">5.2. Análisis estadístico de los resultados</w:t>
       </w:r>
     </w:p>
     <w:p>
@@ -27486,12 +27376,13 @@
           <w:sz w:val="22"/>
           <w:szCs w:val="22"/>
         </w:rPr>
-        <w:t xml:space="preserve">Este trabajo ha abordado el problema de clasificación multiclase de niveles de obesidad empleando el dataset Estimation of Obesity Levels Based on Eating Habits and Physical Condition (UCI, 2019) y aplicando cinco modelos de Aprendizaje Automático supervisado: Redes Neuronales Artificiales (MLP), Máquinas de Vectores Soporte (SVM), Árboles de Decisión (DT), k-Vecinos más Próximos (k-NN) y DoME.</w:t>
-      </w:r>
-    </w:p>
-    <w:p>
-      <w:pPr>
-        <w:spacing w:after="60" w:before="60"/>
+        <w:t xml:space="preserve">Con el fin de verificar si las diferencias de rendimiento entre modelos son estadísticamente significativas o se deben a variabilidad aleatoria de los folds, se ha aplicado un test t de Student bilateral sobre los 10 resultados de validación cruzada de cada modelo, usando el error estándar SE = σ/√10. Se interpreta a nivel de significación α = 0,05.</w:t>
+      </w:r>
+    </w:p>
+    <w:p>
+      <w:pPr>
+        <w:spacing w:after="80" w:before="80"/>
+        <w:jc w:val="both"/>
       </w:pPr>
       <w:r>
         <w:rPr>
@@ -27504,44 +27395,7 @@
           <w:sz w:val="22"/>
           <w:szCs w:val="22"/>
         </w:rPr>
-        <w:t xml:space="preserve"/>
-      </w:r>
-    </w:p>
-    <w:p>
-      <w:pPr>
-        <w:spacing w:after="80" w:before="80"/>
-        <w:jc w:val="both"/>
-      </w:pPr>
-      <w:r>
-        <w:rPr>
-          <w:rFonts w:ascii="Arial" w:cs="Arial" w:eastAsia="Arial" w:hAnsi="Arial"/>
-          <w:b w:val="false"/>
-          <w:bCs w:val="false"/>
-          <w:i w:val="false"/>
-          <w:iCs w:val="false"/>
-          <w:color w:val="000000"/>
-          <w:sz w:val="22"/>
-          <w:szCs w:val="22"/>
-        </w:rPr>
-        <w:t xml:space="preserve">Los principales hallazgos obtenidos son los siguientes:</w:t>
-      </w:r>
-    </w:p>
-    <w:p>
-      <w:pPr>
-        <w:spacing w:after="60" w:before="60"/>
-      </w:pPr>
-      <w:r>
-        <w:rPr>
-          <w:rFonts w:ascii="Arial" w:cs="Arial" w:eastAsia="Arial" w:hAnsi="Arial"/>
-          <w:b w:val="false"/>
-          <w:bCs w:val="false"/>
-          <w:i w:val="false"/>
-          <w:iCs w:val="false"/>
-          <w:color w:val="000000"/>
-          <w:sz w:val="22"/>
-          <w:szCs w:val="22"/>
-        </w:rPr>
-        <w:t xml:space="preserve"/>
+        <w:t xml:space="preserve">Los intervalos de confianza al 95 % para el F1-score macro (t₀₌₀₂₅ = 2,262, df = 9) son: MLP [128,64] σ: 95,92 ± 0,68 %; SVM Linear C=10: 93,65 ± 1,27 %; DT max_depth=12: 93,00 ± 0,97 %; k-NN k=1: 80,84 ± 2,03 %; DoME n=100: 80,52 ± 2,54 %.</w:t>
       </w:r>
     </w:p>
     <w:p>
@@ -27561,10 +27415,10 @@
           <w:i w:val="false"/>
           <w:iCs w:val="false"/>
           <w:color w:val="000000"/>
-          <w:sz w:val="21"/>
-          <w:szCs w:val="21"/>
-        </w:rPr>
-        <w:t xml:space="preserve">El modelo MLP con arquitectura [128,64] σ alcanza el mejor rendimiento, con un F1-score macro del 95,92 % y una accuracy del 96,03 % en validación cruzada de 10 folds. Este resultado confirma la adecuación de las redes neuronales profundas para este tipo de problemas multiclase con variables heterogéneas.</w:t>
+          <w:sz w:val="22"/>
+          <w:szCs w:val="22"/>
+        </w:rPr>
+        <w:t xml:space="preserve">MLP vs. SVM: t = 3,59 (p &lt; 0,01). Los IC no se solapan (límite inferior MLP 95,24 % &gt; límite superior SVM 94,92 %), confirmando que la ventaja del MLP es estadísticamente significativa.</w:t>
       </w:r>
     </w:p>
     <w:p>
@@ -27584,10 +27438,10 @@
           <w:i w:val="false"/>
           <w:iCs w:val="false"/>
           <w:color w:val="000000"/>
-          <w:sz w:val="21"/>
-          <w:szCs w:val="21"/>
-        </w:rPr>
-        <w:t xml:space="preserve">La SVM con kernel lineal y C = 10 obtiene un F1 del 93,65 %, solo 2,27 puntos por debajo del mejor MLP, con una complejidad computacional muy inferior. Ello sugiere que el preprocesado aplicado —codificación one-hot y normalización Min-Max— es especialmente favorable para la separación lineal de las clases.</w:t>
+          <w:sz w:val="22"/>
+          <w:szCs w:val="22"/>
+        </w:rPr>
+        <w:t xml:space="preserve">SVM vs. DT: t = 0,93 (p &gt; 0,05). Los IC se solapan ampliamente. La diferencia de 0,65 puntos en F1 no es significativa: ambos modelos son estadísticamente equivalentes.</w:t>
       </w:r>
     </w:p>
     <w:p>
@@ -27607,10 +27461,10 @@
           <w:i w:val="false"/>
           <w:iCs w:val="false"/>
           <w:color w:val="000000"/>
-          <w:sz w:val="21"/>
-          <w:szCs w:val="21"/>
-        </w:rPr>
-        <w:t xml:space="preserve">El Árbol de Decisión con max_depth=12 alcanza un F1 del 93,00 %, empatado estadísticamente con SVM. Además de su alto rendimiento, destaca por su interpretabilidad: las reglas de decisión aprendidas permiten identificar los umbrales críticos de las variables más discriminativas, especialmente Weight y Height.</w:t>
+          <w:sz w:val="22"/>
+          <w:szCs w:val="22"/>
+        </w:rPr>
+        <w:t xml:space="preserve">DT vs. k-NN: t = 12,26 (p &lt; 0,001). Diferencia altamente significativa de 12,16 puntos. Los modelos pertenecen a niveles de rendimiento claramente distintos.</w:t>
       </w:r>
     </w:p>
     <w:p>
@@ -27630,10 +27484,127 @@
           <w:i w:val="false"/>
           <w:iCs w:val="false"/>
           <w:color w:val="000000"/>
-          <w:sz w:val="21"/>
-          <w:szCs w:val="21"/>
-        </w:rPr>
-        <w:t xml:space="preserve">El clasificador k-NN con k=1 y DoME con n=100 obtienen resultados prácticamente idénticos (F1 ≈ 80,51-80,52 %), situándose en cuarto lugar. k-NN presenta sobreajuste severo con k=1 (Train Acc = 100 %) y sensibilidad al hiperparámetro; DoME, en cambio, genera modelos interpretables en forma de reglas válidas para entornos clínicos.</w:t>
+          <w:sz w:val="22"/>
+          <w:szCs w:val="22"/>
+        </w:rPr>
+        <w:t xml:space="preserve">k-NN vs. DoME: t = 0,22 (p &gt; 0,05). IC se solapan completamente. La diferencia de 0,32 puntos es no significativa: ambos son estadísticamente indistinguibles.</w:t>
+      </w:r>
+    </w:p>
+    <w:p>
+      <w:pPr>
+        <w:spacing w:after="80" w:before="80"/>
+        <w:jc w:val="both"/>
+      </w:pPr>
+      <w:r>
+        <w:rPr>
+          <w:rFonts w:ascii="Arial" w:cs="Arial" w:eastAsia="Arial" w:hAnsi="Arial"/>
+          <w:b w:val="false"/>
+          <w:bCs w:val="false"/>
+          <w:i w:val="false"/>
+          <w:iCs w:val="false"/>
+          <w:color w:val="000000"/>
+          <w:sz w:val="22"/>
+          <w:szCs w:val="22"/>
+        </w:rPr>
+        <w:t xml:space="preserve">En conclusión, el análisis identifica dos grupos significativamente distintos: alto rendimiento (MLP, SVM, DT) y rendimiento moderado (k-NN, DoME). Dentro del primer grupo, MLP supera significativamente a SVM; SVM y DT son equivalentes. La frontera entre ambos grupos es altamente significativa (p &lt; 0,001).</w:t>
+      </w:r>
+    </w:p>
+    <w:p>
+      <w:pPr>
+        <w:spacing w:after="60" w:before="60"/>
+      </w:pPr>
+    </w:p>
+    <w:p>
+      <w:pPr>
+        <w:pStyle w:val="Heading1"/>
+        <w:spacing w:after="160" w:before="400"/>
+      </w:pPr>
+      <w:r>
+        <w:rPr>
+          <w:rFonts w:ascii="Arial" w:cs="Arial" w:eastAsia="Arial" w:hAnsi="Arial"/>
+          <w:b/>
+          <w:bCs/>
+          <w:i w:val="false"/>
+          <w:iCs w:val="false"/>
+          <w:color w:val="1F4E79"/>
+          <w:sz w:val="32"/>
+          <w:szCs w:val="32"/>
+        </w:rPr>
+        <w:t xml:space="preserve">6. Conclusiones</w:t>
+      </w:r>
+    </w:p>
+    <w:p>
+      <w:pPr>
+        <w:spacing w:after="80" w:before="80"/>
+        <w:jc w:val="both"/>
+      </w:pPr>
+      <w:r>
+        <w:rPr>
+          <w:rFonts w:ascii="Arial" w:cs="Arial" w:eastAsia="Arial" w:hAnsi="Arial"/>
+          <w:b w:val="false"/>
+          <w:bCs w:val="false"/>
+          <w:i w:val="false"/>
+          <w:iCs w:val="false"/>
+          <w:color w:val="000000"/>
+          <w:sz w:val="22"/>
+          <w:szCs w:val="22"/>
+        </w:rPr>
+        <w:t xml:space="preserve">Este trabajo ha abordado el problema de clasificación multiclase de niveles de obesidad empleando el dataset Estimation of Obesity Levels Based on Eating Habits and Physical Condition (UCI, 2019) y aplicando cinco modelos de Aprendizaje Automático supervisado: Redes Neuronales Artificiales (MLP), Máquinas de Vectores Soporte (SVM), Árboles de Decisión (DT), k-Vecinos más Próximos (k-NN) y DoME.</w:t>
+      </w:r>
+    </w:p>
+    <w:p>
+      <w:pPr>
+        <w:spacing w:after="60" w:before="60"/>
+      </w:pPr>
+      <w:r>
+        <w:rPr>
+          <w:rFonts w:ascii="Arial" w:cs="Arial" w:eastAsia="Arial" w:hAnsi="Arial"/>
+          <w:b w:val="false"/>
+          <w:bCs w:val="false"/>
+          <w:i w:val="false"/>
+          <w:iCs w:val="false"/>
+          <w:color w:val="000000"/>
+          <w:sz w:val="22"/>
+          <w:szCs w:val="22"/>
+        </w:rPr>
+        <w:t xml:space="preserve"/>
+      </w:r>
+    </w:p>
+    <w:p>
+      <w:pPr>
+        <w:spacing w:after="80" w:before="80"/>
+        <w:jc w:val="both"/>
+      </w:pPr>
+      <w:r>
+        <w:rPr>
+          <w:rFonts w:ascii="Arial" w:cs="Arial" w:eastAsia="Arial" w:hAnsi="Arial"/>
+          <w:b w:val="false"/>
+          <w:bCs w:val="false"/>
+          <w:i w:val="false"/>
+          <w:iCs w:val="false"/>
+          <w:color w:val="000000"/>
+          <w:sz w:val="22"/>
+          <w:szCs w:val="22"/>
+        </w:rPr>
+        <w:t xml:space="preserve">Los principales hallazgos obtenidos son los siguientes:</w:t>
+      </w:r>
+    </w:p>
+    <w:p>
+      <w:pPr>
+        <w:spacing w:after="60" w:before="60"/>
+      </w:pPr>
+      <w:r>
+        <w:rPr>
+          <w:rFonts w:ascii="Arial" w:cs="Arial" w:eastAsia="Arial" w:hAnsi="Arial"/>
+          <w:b w:val="false"/>
+          <w:bCs w:val="false"/>
+          <w:i w:val="false"/>
+          <w:iCs w:val="false"/>
+          <w:color w:val="000000"/>
+          <w:sz w:val="22"/>
+          <w:szCs w:val="22"/>
+        </w:rPr>
+        <w:t xml:space="preserve"/>
       </w:r>
     </w:p>
     <w:p>
@@ -27656,6 +27627,98 @@
           <w:sz w:val="21"/>
           <w:szCs w:val="21"/>
         </w:rPr>
+        <w:t xml:space="preserve">El modelo MLP con arquitectura [128,64] σ alcanza el mejor rendimiento, con un F1-score macro del 95,92 % y una accuracy del 96,03 % en validación cruzada de 10 folds. Este resultado confirma la adecuación de las redes neuronales profundas para este tipo de problemas multiclase con variables heterogéneas.</w:t>
+      </w:r>
+    </w:p>
+    <w:p>
+      <w:pPr>
+        <w:pStyle w:val="ListParagraph"/>
+        <w:numPr>
+          <w:ilvl w:val="0"/>
+          <w:numId w:val="2"/>
+        </w:numPr>
+        <w:spacing w:after="60" w:before="60"/>
+      </w:pPr>
+      <w:r>
+        <w:rPr>
+          <w:rFonts w:ascii="Arial" w:cs="Arial" w:eastAsia="Arial" w:hAnsi="Arial"/>
+          <w:b w:val="false"/>
+          <w:bCs w:val="false"/>
+          <w:i w:val="false"/>
+          <w:iCs w:val="false"/>
+          <w:color w:val="000000"/>
+          <w:sz w:val="21"/>
+          <w:szCs w:val="21"/>
+        </w:rPr>
+        <w:t xml:space="preserve">La SVM con kernel lineal y C = 10 obtiene un F1 del 93,65 %, solo 2,27 puntos por debajo del mejor MLP, con una complejidad computacional muy inferior. Ello sugiere que el preprocesado aplicado —codificación one-hot y normalización Min-Max— es especialmente favorable para la separación lineal de las clases.</w:t>
+      </w:r>
+    </w:p>
+    <w:p>
+      <w:pPr>
+        <w:pStyle w:val="ListParagraph"/>
+        <w:numPr>
+          <w:ilvl w:val="0"/>
+          <w:numId w:val="2"/>
+        </w:numPr>
+        <w:spacing w:after="60" w:before="60"/>
+      </w:pPr>
+      <w:r>
+        <w:rPr>
+          <w:rFonts w:ascii="Arial" w:cs="Arial" w:eastAsia="Arial" w:hAnsi="Arial"/>
+          <w:b w:val="false"/>
+          <w:bCs w:val="false"/>
+          <w:i w:val="false"/>
+          <w:iCs w:val="false"/>
+          <w:color w:val="000000"/>
+          <w:sz w:val="21"/>
+          <w:szCs w:val="21"/>
+        </w:rPr>
+        <w:t xml:space="preserve">El Árbol de Decisión con max_depth=12 alcanza un F1 del 93,00 %, empatado estadísticamente con SVM. Además de su alto rendimiento, destaca por su interpretabilidad: las reglas de decisión aprendidas permiten identificar los umbrales críticos de las variables más discriminativas, especialmente Weight y Height.</w:t>
+      </w:r>
+    </w:p>
+    <w:p>
+      <w:pPr>
+        <w:pStyle w:val="ListParagraph"/>
+        <w:numPr>
+          <w:ilvl w:val="0"/>
+          <w:numId w:val="2"/>
+        </w:numPr>
+        <w:spacing w:after="60" w:before="60"/>
+      </w:pPr>
+      <w:r>
+        <w:rPr>
+          <w:rFonts w:ascii="Arial" w:cs="Arial" w:eastAsia="Arial" w:hAnsi="Arial"/>
+          <w:b w:val="false"/>
+          <w:bCs w:val="false"/>
+          <w:i w:val="false"/>
+          <w:iCs w:val="false"/>
+          <w:color w:val="000000"/>
+          <w:sz w:val="21"/>
+          <w:szCs w:val="21"/>
+        </w:rPr>
+        <w:t xml:space="preserve">El clasificador k-NN con k=1 y DoME con n=100 obtienen resultados prácticamente idénticos (F1 ≈ 80,84 % y 80,52 %, respectivamente), situándose en cuarto lugar. k-NN presenta sobreajuste severo con k=1 (Train Acc = 100 %) y sensibilidad al hiperparámetro; DoME, en cambio, genera modelos interpretables en forma de reglas válidas para entornos clínicos.</w:t>
+      </w:r>
+    </w:p>
+    <w:p>
+      <w:pPr>
+        <w:pStyle w:val="ListParagraph"/>
+        <w:numPr>
+          <w:ilvl w:val="0"/>
+          <w:numId w:val="2"/>
+        </w:numPr>
+        <w:spacing w:after="60" w:before="60"/>
+      </w:pPr>
+      <w:r>
+        <w:rPr>
+          <w:rFonts w:ascii="Arial" w:cs="Arial" w:eastAsia="Arial" w:hAnsi="Arial"/>
+          <w:b w:val="false"/>
+          <w:bCs w:val="false"/>
+          <w:i w:val="false"/>
+          <w:iCs w:val="false"/>
+          <w:color w:val="000000"/>
+          <w:sz w:val="21"/>
+          <w:szCs w:val="21"/>
+        </w:rPr>
         <w:t xml:space="preserve">En todos los modelos, los errores de clasificación se concentran en clases adyacentes (Normal Weight ↔ Overweight Level I, Overweight Level I ↔ Overweight Level II), coherente con la naturaleza continua del índice de masa corporal subyacente. Las clases extremas (Insufficient Weight y Obesity Type III) se clasifican con alta precisión en todos los casos.</w:t>
       </w:r>
     </w:p>
@@ -27730,12 +27793,13 @@
           <w:sz w:val="32"/>
           <w:szCs w:val="32"/>
         </w:rPr>
-        <w:t xml:space="preserve">7. Trabajo Futuro</w:t>
-      </w:r>
-    </w:p>
-    <w:p>
-      <w:pPr>
-        <w:spacing w:after="160" w:before="80"/>
+        <w:t xml:space="preserve">7. Trabajo futuro</w:t>
+      </w:r>
+    </w:p>
+    <w:p>
+      <w:pPr>
+        <w:spacing w:after="80" w:before="80"/>
+        <w:jc w:val="both"/>
       </w:pPr>
       <w:r>
         <w:rPr>
@@ -27748,7 +27812,7 @@
           <w:sz w:val="22"/>
           <w:szCs w:val="22"/>
         </w:rPr>
-        <w:t xml:space="preserve">Los resultados obtenidos en este trabajo abren diversas líneas de investigación y mejora que podrían desarrollarse en trabajos futuros. A continuación se detallan las más relevantes, agrupadas por ámbito.</w:t>
+        <w:t xml:space="preserve">Los resultados obtenidos en este trabajo abren diversas líneas de investigación y desarrollo que permitirían ampliar, mejorar y generalizar el sistema de clasificación de niveles de obesidad presentado.</w:t>
       </w:r>
     </w:p>
     <w:p>
@@ -27763,16 +27827,17 @@
           <w:bCs/>
           <w:i w:val="false"/>
           <w:iCs w:val="false"/>
-          <w:color w:val="2E74B5"/>
+          <w:color w:val="2E75B6"/>
           <w:sz w:val="26"/>
           <w:szCs w:val="26"/>
         </w:rPr>
-        <w:t xml:space="preserve">7.1. Modelos y técnicas avanzadas</w:t>
-      </w:r>
-    </w:p>
-    <w:p>
-      <w:pPr>
-        <w:spacing w:after="120" w:before="80"/>
+        <w:t xml:space="preserve">7.1. Mejora de los modelos actuales</w:t>
+      </w:r>
+    </w:p>
+    <w:p>
+      <w:pPr>
+        <w:spacing w:after="80" w:before="80"/>
+        <w:jc w:val="both"/>
       </w:pPr>
       <w:r>
         <w:rPr>
@@ -27785,12 +27850,13 @@
           <w:sz w:val="22"/>
           <w:szCs w:val="22"/>
         </w:rPr>
-        <w:t xml:space="preserve">El modelo con mayor rendimiento en este trabajo (MLP con arquitectura [128,64] y activación sigmoide, F1 = 95,92 %) aún presenta un gap train-test de ∼3,8 puntos, lo que sugiere margen de mejora mediante técnicas de regularización (dropout, batch normalization) o mediante arquitecturas más profundas con early stopping. En la misma línea, resulta de especial interés explorar métodos de ensamblado supervisado, tales como Random Forest, Gradient Boosting (XGBoost, LightGBM) o Stacking, que combinan múltiples clasificadores base para reducir la varianza y aumentar la robustez ante distintas particiones de validación cruzada.</w:t>
-      </w:r>
-    </w:p>
-    <w:p>
-      <w:pPr>
-        <w:spacing w:after="120" w:before="80"/>
+        <w:t xml:space="preserve">En primer lugar, los modelos actuales podrían mejorarse mediante una optimización sistemática de hiperparámetros. El uso de búsqueda en rejilla (grid search) o búsqueda aleatoria (random search) con validación cruzada anidada permitiría identificar configuraciones óptimas no exploradas. Para las RRNN, cabría considerar arquitecturas más profundas, tasas de aprendizaje adaptativas y técnicas de regularización como dropout o L2, que reducirían el sobreajuste observado en [128,64] σ.</w:t>
+      </w:r>
+    </w:p>
+    <w:p>
+      <w:pPr>
+        <w:spacing w:after="80" w:before="80"/>
+        <w:jc w:val="both"/>
       </w:pPr>
       <w:r>
         <w:rPr>
@@ -27803,7 +27869,7 @@
           <w:sz w:val="22"/>
           <w:szCs w:val="22"/>
         </w:rPr>
-        <w:t xml:space="preserve">Para el clasificador k-NN, el sobreajuste severo observado con k=1 (brecha train-test de ∼19 puntos) podría mitigarse mediante la búsqueda del valor óptimo de k por validación interna en el propio conjunto de entrenamiento, o bien utilizando distancias ponderadas (weighted k-NN) que suavicen la influencia de vecinos lejanos. Para DoME, dado que la curva de rendimiento en función de maximumNodes no mostró señales claras de saturación, sería interesante explorar valores superiores a 100 nodos con métricas adicionales de interpretabilidad que permitan cuantificar el coste en legibilidad frente a la ganancia en precisión.</w:t>
+        <w:t xml:space="preserve">Para k-NN, sería interesante explorar métricas de distancia alternativas a la euclídea, como la distancia de Mahalanobis, que considera la correlación entre variables. En DoME, combinar modelos mediante estrategias de ensamblado podría superar la limitación de interpretabilidad-rendimiento.</w:t>
       </w:r>
     </w:p>
     <w:p>
@@ -27818,16 +27884,17 @@
           <w:bCs/>
           <w:i w:val="false"/>
           <w:iCs w:val="false"/>
-          <w:color w:val="2E74B5"/>
+          <w:color w:val="2E75B6"/>
           <w:sz w:val="26"/>
           <w:szCs w:val="26"/>
         </w:rPr>
-        <w:t xml:space="preserve">7.2. Optimización de hiperparámetros</w:t>
-      </w:r>
-    </w:p>
-    <w:p>
-      <w:pPr>
-        <w:spacing w:after="120" w:before="80"/>
+        <w:t xml:space="preserve">7.2. Técnicas de aprendizaje no exploradas</w:t>
+      </w:r>
+    </w:p>
+    <w:p>
+      <w:pPr>
+        <w:spacing w:after="80" w:before="80"/>
+        <w:jc w:val="both"/>
       </w:pPr>
       <w:r>
         <w:rPr>
@@ -27840,7 +27907,7 @@
           <w:sz w:val="22"/>
           <w:szCs w:val="22"/>
         </w:rPr>
-        <w:t xml:space="preserve">La búsqueda de hiperparámetros realizada en este trabajo ha sido manual y sistemática, cubriendo un amplio rango de configuraciones para cada modelo. Sin embargo, técnicas automáticas como la búsqueda en rejilla (Grid Search), la búsqueda aleatoria (Random Search) o la optimización bayesiana (Bayesian Optimization) permitirían explorar de forma más eficiente el espacio de hiperparámetros, reduciendo el número de configuraciones evaluadas y maximizando el rendimiento. En particular, para la SVM podría explorarse la combinación de distintos valores de C y γ de forma conjunta mediante un espacio de búsqueda bidimensional, y para el MLP sería de interés evaluar distintas tasas de aprendizaje, tamaños de batch y estrategias de decaimiento del learning rate.</w:t>
+        <w:t xml:space="preserve">Una línea de trabajo con gran potencial es la aplicación de métodos de ensamblado, en particular Random Forest y Gradient Boosting (XGBoost, LightGBM). Estos enfoques han demostrado resultados competitivos en tareas de clasificación médica y podrían aprovechar la naturaleza mixta del dataset sin normalización explícita. La aplicación de selección automática de variables mediante información mutua o importancia de atributo también podría reducir la dimensionalidad e identificar los factores de riesgo más determinantes.</w:t>
       </w:r>
     </w:p>
     <w:p>
@@ -27855,16 +27922,17 @@
           <w:bCs/>
           <w:i w:val="false"/>
           <w:iCs w:val="false"/>
-          <w:color w:val="2E74B5"/>
+          <w:color w:val="2E75B6"/>
           <w:sz w:val="26"/>
           <w:szCs w:val="26"/>
         </w:rPr>
-        <w:t xml:space="preserve">7.3. Enriquecimiento del dataset y generalización</w:t>
-      </w:r>
-    </w:p>
-    <w:p>
-      <w:pPr>
-        <w:spacing w:after="120" w:before="80"/>
+        <w:t xml:space="preserve">7.3. Ampliación del dataset y generalización</w:t>
+      </w:r>
+    </w:p>
+    <w:p>
+      <w:pPr>
+        <w:spacing w:after="80" w:before="80"/>
+        <w:jc w:val="both"/>
       </w:pPr>
       <w:r>
         <w:rPr>
@@ -27877,7 +27945,7 @@
           <w:sz w:val="22"/>
           <w:szCs w:val="22"/>
         </w:rPr>
-        <w:t xml:space="preserve">Una de las limitaciones más relevantes del dataset empleado es que el 77 % de sus instancias han sido generadas sintéticamente mediante SMOTE, y que los datos reales provienen exclusivamente de individuos de Colombia, Perú y México con edades comprendidas entre 14 y 61 años. Esto limita la capacidad de generalización de los modelos a otras poblaciones y franjas de edad. Como línea de trabajo futuro de gran impacto, se propone recopilar datos reales de mayor diversidad geográfica y demográfica, e incorporar variables clínicas objetivas que no están presentes en el dataset actual, tales como marcadores bioquímicos (glucosa en ayunas, triglicéridos, colesterol HDL/LDL), tensión arterial o historial de enfermedades metabólicas. La inclusión de estas variables podría incrementar significativamente la profundidad diagnóstica de los modelos y su utilidad clínica real.</w:t>
+        <w:t xml:space="preserve">El 77 % del dataset es sintético y los datos reales provienen exclusivamente de Colombia, Perú y México. Validar los modelos sobre poblaciones de otras regiones y grupos demográficos subrepresentados (población pediátrica, personas mayores de 60 años) permitiría evaluar la capacidad de generalización. La incorporación de variables clínicas adicionales —marcadores bioquímicos como glucosa en ayunas, triglicéridos o presión arterial— aumentaría significativamente la profundidad diagnóstica del sistema.</w:t>
       </w:r>
     </w:p>
     <w:p>
@@ -27892,16 +27960,17 @@
           <w:bCs/>
           <w:i w:val="false"/>
           <w:iCs w:val="false"/>
-          <w:color w:val="2E74B5"/>
+          <w:color w:val="2E75B6"/>
           <w:sz w:val="26"/>
           <w:szCs w:val="26"/>
         </w:rPr>
-        <w:t xml:space="preserve">7.4. Selección de características e interpretabilidad</w:t>
-      </w:r>
-    </w:p>
-    <w:p>
-      <w:pPr>
-        <w:spacing w:after="160" w:before="80"/>
+        <w:t xml:space="preserve">7.4. Aplicación práctica en entornos clínicos</w:t>
+      </w:r>
+    </w:p>
+    <w:p>
+      <w:pPr>
+        <w:spacing w:after="80" w:before="80"/>
+        <w:jc w:val="both"/>
       </w:pPr>
       <w:r>
         <w:rPr>
@@ -27914,8 +27983,13 @@
           <w:sz w:val="22"/>
           <w:szCs w:val="22"/>
         </w:rPr>
-        <w:t xml:space="preserve">Aunque todos los modelos se han entrenado con el conjunto completo de 24 atributos preprocesados, la aplicación de técnicas de selección de características (feature selection) podría mejorar la eficiencia computacional y la interpretabilidad de los modelos sin sacrificar rendimiento. Métodos como la importancia de características basada en permutación (Permutation Feature Importance), el análisis de componentes principales (PCA) o las técnicas SHAP (SHapley Additive exPlanations) permitirían identificar qué variables tienen mayor impacto en la predicción del nivel de obesidad, facilitando además la validación clínica de los modelos por parte de expertos del dominio. Finalmente, dado el potencial de aplicación clínica de este trabajo, resultaría de interés desarrollar una interfaz de usuario sencilla que permita a profesionales sanitarios introducir las características de un paciente y obtener una estimación automática de su nivel de obesidad con la correspondiente justificación del modelo.</w:t>
-      </w:r>
+        <w:t xml:space="preserve">El diseño de una interfaz que permita a profesionales sanitarios introducir datos de un paciente y obtener una predicción explicada es una línea de alta relevancia. Técnicas de XAI como SHAP (SHapley Additive exPlanations) o LIME (Local Interpretable Model-Agnostic Explanations) permitirían visualizar la contribución de cada variable a la predicción individual, aumentando la confianza clínica en el sistema. La integración en aplicaciones móviles o plataformas de salud digital podría facilitar el autodiagnóstico y el seguimiento longitudinal, contribuyendo a estrategias preventivas de salud pública a gran escala.</w:t>
+      </w:r>
+    </w:p>
+    <w:p>
+      <w:pPr>
+        <w:spacing w:after="60" w:before="60"/>
+      </w:pPr>
     </w:p>
     <w:p>
       <w:pPr>
@@ -27952,7 +28026,7 @@
           <w:sz w:val="20"/>
           <w:szCs w:val="20"/>
         </w:rPr>
-        <w:t xml:space="preserve">Alqahtani, A., et al. (2022). Machine learning models for predicting obesity: A comparative study. Computers in Biology and Medicine, 144, 105341. https://doi.org/10.1016/j.compbiomed.2022.105341</w:t>
+        <w:t xml:space="preserve">Alqahtani, A., et al. (2022). Machine learning models for predicting obesity: A comparative study. Computers in Biology and Medicine, 144, 105341.</w:t>
       </w:r>
     </w:p>
     <w:p>
@@ -27971,7 +28045,7 @@
           <w:sz w:val="20"/>
           <w:szCs w:val="20"/>
         </w:rPr>
-        <w:t xml:space="preserve">Breiman, L. (2001). Random forests. Machine Learning, 45(1), 5–32. https://doi.org/10.1023/A:1010933404324</w:t>
+        <w:t xml:space="preserve">Chawla, N. V., et al. (2002). SMOTE: Synthetic minority over-sampling technique. Journal of Artificial Intelligence Research, 16, 321–357.</w:t>
       </w:r>
     </w:p>
     <w:p>
@@ -27990,7 +28064,7 @@
           <w:sz w:val="20"/>
           <w:szCs w:val="20"/>
         </w:rPr>
-        <w:t xml:space="preserve">Chawla, N. V., et al. (2002). SMOTE: Synthetic minority over-sampling technique. Journal of Artificial Intelligence Research, 16, 321–357. https://doi.org/10.1613/jair.953</w:t>
+        <w:t xml:space="preserve">Davis, J., &amp; Goadrich, M. (2006). The relationship between Precision-Recall and ROC curves. ICML. https://dl.acm.org/doi/10.1145/1143844.1143874</w:t>
       </w:r>
     </w:p>
     <w:p>
@@ -28009,7 +28083,7 @@
           <w:sz w:val="20"/>
           <w:szCs w:val="20"/>
         </w:rPr>
-        <w:t xml:space="preserve">Cortes, C., &amp; Vapnik, V. (1995). Support-vector networks. Machine Learning, 20(3), 273–297. https://doi.org/10.1007/BF00994018</w:t>
+        <w:t xml:space="preserve">Ferdowsy, F., et al. (2021). A machine learning approach for obesity risk prediction. Current Research in Behavioral Sciences, 2, 100053.</w:t>
       </w:r>
     </w:p>
     <w:p>
@@ -28028,7 +28102,7 @@
           <w:sz w:val="20"/>
           <w:szCs w:val="20"/>
         </w:rPr>
-        <w:t xml:space="preserve">Cover, T., &amp; Hart, P. (1967). Nearest neighbor pattern classification. IEEE Transactions on Information Theory, 13(1), 21–27. https://doi.org/10.1109/TIT.1967.1053964</w:t>
+        <w:t xml:space="preserve">Jindal, A., et al. (2024). Obesity Prediction Using Machine Learning Algorithms. Engineering Proceedings, 107(1), 125.</w:t>
       </w:r>
     </w:p>
     <w:p>
@@ -28047,7 +28121,7 @@
           <w:sz w:val="20"/>
           <w:szCs w:val="20"/>
         </w:rPr>
-        <w:t xml:space="preserve">Davis, J., &amp; Goadrich, M. (2006). The relationship between Precision-Recall and ROC curves. ICML. https://dl.acm.org/doi/10.1145/1143844.1143874</w:t>
+        <w:t xml:space="preserve">Kim, Y., et al. (2023). Age-specific risk factors for the prediction of obesity. Frontiers in Public Health, 10, 998782.</w:t>
       </w:r>
     </w:p>
     <w:p>
@@ -28066,7 +28140,7 @@
           <w:sz w:val="20"/>
           <w:szCs w:val="20"/>
         </w:rPr>
-        <w:t xml:space="preserve">Ferdowsy, F., et al. (2021). A machine learning approach for obesity risk prediction. Current Research in Behavioral Sciences, 2, 100053. https://doi.org/10.1016/j.crbeha.2021.100053</w:t>
+        <w:t xml:space="preserve">Palechor, F. M., &amp; de la Hoz Manotas, A. (2019). Dataset for estimation of obesity levels based on eating habits and physical condition. Data in Brief, 25, 104344.</w:t>
       </w:r>
     </w:p>
     <w:p>
@@ -28085,7 +28159,7 @@
           <w:sz w:val="20"/>
           <w:szCs w:val="20"/>
         </w:rPr>
-        <w:t xml:space="preserve">Friedman, J. H. (2001). Greedy function approximation: A gradient boosting machine. The Annals of Statistics, 29(5), 1189–1232. https://doi.org/10.1214/aos/1013203451</w:t>
+        <w:t xml:space="preserve">Palechor, F. M., &amp; de la Hoz Manotas, A. (2019). Estimation of obesity levels based on eating habits and physical condition [Dataset]. UCI Machine Learning Repository. https://archive.ics.uci.edu/dataset/544</w:t>
       </w:r>
     </w:p>
     <w:p>
@@ -28104,7 +28178,7 @@
           <w:sz w:val="20"/>
           <w:szCs w:val="20"/>
         </w:rPr>
-        <w:t xml:space="preserve">Jindal, A., et al. (2024). Obesity Prediction Using Machine Learning Algorithms. Engineering Proceedings, 107(1), 125. https://doi.org/10.3390/engproc2024107125</w:t>
+        <w:t xml:space="preserve">Safaei, M., et al. (2021). A systematic literature review on obesity and machine learning. Computers in Biology and Medicine, 136, 104754.</w:t>
       </w:r>
     </w:p>
     <w:p>
@@ -28123,7 +28197,7 @@
           <w:sz w:val="20"/>
           <w:szCs w:val="20"/>
         </w:rPr>
-        <w:t xml:space="preserve">Kim, Y., et al. (2023). Age-specific risk factors for the prediction of obesity. Frontiers in Public Health, 10, 998782. https://doi.org/10.3389/fpubh.2022.998782</w:t>
+        <w:t xml:space="preserve">Sahoo, D., et al. (2015). Machine learning-based prediction of obesity risk using health data. Journal of Biomedical Informatics, 56, 135–146.</w:t>
       </w:r>
     </w:p>
     <w:p>
@@ -28142,7 +28216,7 @@
           <w:sz w:val="20"/>
           <w:szCs w:val="20"/>
         </w:rPr>
-        <w:t xml:space="preserve">Palechor, F. M., &amp; de la Hoz Manotas, A. (2019). Dataset for estimation of obesity levels based on eating habits and physical condition. Data in Brief, 25, 104344. https://doi.org/10.1016/j.dib.2019.104344</w:t>
+        <w:t xml:space="preserve">Silva, L., et al. (2024). Obesity classification: machine learning models excluding weight and height data. Revista da Associação Médica Brasileira.</w:t>
       </w:r>
     </w:p>
     <w:p>
@@ -28161,102 +28235,7 @@
           <w:sz w:val="20"/>
           <w:szCs w:val="20"/>
         </w:rPr>
-        <w:t xml:space="preserve">Palechor, F. M., &amp; de la Hoz Manotas, A. (2019). Estimation of obesity levels based on eating habits and physical condition [Dataset]. UCI Machine Learning Repository. https://archive.ics.uci.edu/dataset/544</w:t>
-      </w:r>
-    </w:p>
-    <w:p>
-      <w:pPr>
-        <w:spacing w:after="80" w:before="80"/>
-        <w:ind w:left="720" w:hanging="360"/>
-      </w:pPr>
-      <w:r>
-        <w:rPr>
-          <w:rFonts w:ascii="Arial" w:cs="Arial" w:eastAsia="Arial" w:hAnsi="Arial"/>
-          <w:b w:val="false"/>
-          <w:bCs w:val="false"/>
-          <w:i w:val="false"/>
-          <w:iCs w:val="false"/>
-          <w:color w:val="000000"/>
-          <w:sz w:val="20"/>
-          <w:szCs w:val="20"/>
-        </w:rPr>
-        <w:t xml:space="preserve">Rumelhart, D. E., Hinton, G. E., &amp; Williams, R. J. (1986). Learning representations by back-propagating errors. Nature, 323(6088), 533–536. https://doi.org/10.1038/323533a0</w:t>
-      </w:r>
-    </w:p>
-    <w:p>
-      <w:pPr>
-        <w:spacing w:after="80" w:before="80"/>
-        <w:ind w:left="720" w:hanging="360"/>
-      </w:pPr>
-      <w:r>
-        <w:rPr>
-          <w:rFonts w:ascii="Arial" w:cs="Arial" w:eastAsia="Arial" w:hAnsi="Arial"/>
-          <w:b w:val="false"/>
-          <w:bCs w:val="false"/>
-          <w:i w:val="false"/>
-          <w:iCs w:val="false"/>
-          <w:color w:val="000000"/>
-          <w:sz w:val="20"/>
-          <w:szCs w:val="20"/>
-        </w:rPr>
-        <w:t xml:space="preserve">Safaei, M., et al. (2021). A systematic literature review on obesity and machine learning. Computers in Biology and Medicine, 136, 104754. https://doi.org/10.1016/j.compbiomed.2021.104754</w:t>
-      </w:r>
-    </w:p>
-    <w:p>
-      <w:pPr>
-        <w:spacing w:after="80" w:before="80"/>
-        <w:ind w:left="720" w:hanging="360"/>
-      </w:pPr>
-      <w:r>
-        <w:rPr>
-          <w:rFonts w:ascii="Arial" w:cs="Arial" w:eastAsia="Arial" w:hAnsi="Arial"/>
-          <w:b w:val="false"/>
-          <w:bCs w:val="false"/>
-          <w:i w:val="false"/>
-          <w:iCs w:val="false"/>
-          <w:color w:val="000000"/>
-          <w:sz w:val="20"/>
-          <w:szCs w:val="20"/>
-        </w:rPr>
-        <w:t xml:space="preserve">Sahoo, D., et al. (2015). Machine learning-based prediction of obesity risk using health data. Journal of Biomedical Informatics, 56, 135–146.</w:t>
-      </w:r>
-    </w:p>
-    <w:p>
-      <w:pPr>
-        <w:spacing w:after="80" w:before="80"/>
-        <w:ind w:left="720" w:hanging="360"/>
-      </w:pPr>
-      <w:r>
-        <w:rPr>
-          <w:rFonts w:ascii="Arial" w:cs="Arial" w:eastAsia="Arial" w:hAnsi="Arial"/>
-          <w:b w:val="false"/>
-          <w:bCs w:val="false"/>
-          <w:i w:val="false"/>
-          <w:iCs w:val="false"/>
-          <w:color w:val="000000"/>
-          <w:sz w:val="20"/>
-          <w:szCs w:val="20"/>
-        </w:rPr>
-        <w:t xml:space="preserve">Silva, L., et al. (2024). Obesity classification: machine learning models excluding weight and height data. Revista da Associação Médica Brasileira. https://doi.org/10.1590/1806-9282.20230953</w:t>
-      </w:r>
-    </w:p>
-    <w:p>
-      <w:pPr>
-        <w:spacing w:after="80" w:before="80"/>
-        <w:ind w:left="720" w:hanging="360"/>
-      </w:pPr>
-      <w:r>
-        <w:rPr>
-          <w:rFonts w:ascii="Arial" w:cs="Arial" w:eastAsia="Arial" w:hAnsi="Arial"/>
-          <w:b w:val="false"/>
-          <w:bCs w:val="false"/>
-          <w:i w:val="false"/>
-          <w:iCs w:val="false"/>
-          <w:color w:val="000000"/>
-          <w:sz w:val="20"/>
-          <w:szCs w:val="20"/>
-        </w:rPr>
-        <w:t xml:space="preserve">World Health Organization. (2024). Obesity and overweight fact sheet. https://www.who.int/news-room/fact-sheets/detail/obesity-and-overweight</w:t>
+        <w:t xml:space="preserve">NCD Risk Factor Collaboration (NCD-RisC). (2024). Worldwide trends in body-mass index, underweight, overweight, and obesity from 1990 to 2022: a pooled analysis of 3663 population-based studies with 222 million children, adolescents, and adults. The Lancet, 403(10431), 1027–1050.</w:t>
       </w:r>
     </w:p>
     <w:sectPr>

</xml_diff>